<commit_message>
Update internship docx files: perfectly scale table column widths cell-by-cell inside all rows to prevent crooked lines, fully close all margins and borders with solid black Table Grid lines, and apply 1.25 cm first line indent to all paragraphs
</commit_message>
<xml_diff>
--- a/Дневник-111 (1)айбота (1)22355.docx
+++ b/Дневник-111 (1)айбота (1)22355.docx
@@ -180,6 +180,8 @@
     </w:p>
     <w:p>
       <w:pPr>
+        <w:spacing w:line="276" w:lineRule="auto" w:after="120"/>
+        <w:ind w:firstLine="709"/>
         <w:jc w:val="both"/>
         <w:rPr>
           <w:szCs w:val="28"/>
@@ -256,6 +258,8 @@
     </w:p>
     <w:p>
       <w:pPr>
+        <w:spacing w:line="276" w:lineRule="auto" w:after="120"/>
+        <w:ind w:firstLine="709"/>
         <w:rPr>
           <w:szCs w:val="28"/>
           <w:lang w:val="kk-KZ"/>
@@ -345,6 +349,8 @@
     </w:p>
     <w:p>
       <w:pPr>
+        <w:spacing w:line="276" w:lineRule="auto" w:after="120"/>
+        <w:ind w:firstLine="709"/>
         <w:rPr>
           <w:szCs w:val="28"/>
           <w:lang w:val="kk-KZ"/>
@@ -396,7 +402,8 @@
     </w:p>
     <w:p>
       <w:pPr>
-        <w:ind w:left="3540" w:firstLine="708"/>
+        <w:spacing w:line="276" w:lineRule="auto" w:after="120"/>
+        <w:ind w:left="3540" w:firstLine="709"/>
         <w:jc w:val="both"/>
         <w:rPr>
           <w:rFonts w:eastAsia="Arial Unicode MS"/>
@@ -442,6 +449,8 @@
     </w:p>
     <w:p>
       <w:pPr>
+        <w:spacing w:line="276" w:lineRule="auto" w:after="120"/>
+        <w:ind w:firstLine="709"/>
         <w:rPr>
           <w:szCs w:val="28"/>
           <w:lang w:val="kk-KZ"/>
@@ -514,6 +523,8 @@
     </w:p>
     <w:p>
       <w:pPr>
+        <w:spacing w:line="276" w:lineRule="auto" w:after="120"/>
+        <w:ind w:firstLine="709"/>
         <w:rPr>
           <w:szCs w:val="28"/>
         </w:rPr>
@@ -746,8 +757,8 @@
     </w:p>
     <w:p>
       <w:pPr>
-        <w:spacing w:line="360" w:lineRule="atLeast"/>
-        <w:ind w:right="-284"/>
+        <w:spacing w:line="276" w:lineRule="auto" w:after="120"/>
+        <w:ind w:right="-284" w:firstLine="709"/>
         <w:rPr>
           <w:rFonts w:eastAsia="Arial Unicode MS"/>
           <w:szCs w:val="28"/>
@@ -830,8 +841,8 @@
     </w:p>
     <w:p>
       <w:pPr>
-        <w:spacing w:line="360" w:lineRule="atLeast"/>
-        <w:ind w:right="-284"/>
+        <w:spacing w:line="276" w:lineRule="auto" w:after="120"/>
+        <w:ind w:right="-284" w:firstLine="709"/>
         <w:rPr>
           <w:sz w:val="27"/>
           <w:szCs w:val="27"/>
@@ -1217,6 +1228,8 @@
     </w:p>
     <w:p>
       <w:pPr>
+        <w:spacing w:line="276" w:lineRule="auto" w:after="120"/>
+        <w:ind w:firstLine="709"/>
         <w:jc w:val="both"/>
         <w:rPr>
           <w:lang w:val="kk-KZ"/>
@@ -1281,6 +1294,8 @@
     </w:p>
     <w:p>
       <w:pPr>
+        <w:spacing w:line="276" w:lineRule="auto" w:after="120"/>
+        <w:ind w:firstLine="709"/>
         <w:jc w:val="both"/>
         <w:rPr>
           <w:u w:val="single"/>
@@ -1333,6 +1348,8 @@
     </w:p>
     <w:p>
       <w:pPr>
+        <w:spacing w:line="276" w:lineRule="auto" w:after="120"/>
+        <w:ind w:firstLine="709"/>
         <w:jc w:val="both"/>
         <w:rPr>
           <w:szCs w:val="28"/>
@@ -1374,6 +1391,8 @@
     </w:p>
     <w:p>
       <w:pPr>
+        <w:spacing w:line="276" w:lineRule="auto" w:after="120"/>
+        <w:ind w:firstLine="709"/>
         <w:jc w:val="both"/>
         <w:rPr>
           <w:szCs w:val="28"/>
@@ -1539,6 +1558,8 @@
     </w:p>
     <w:p>
       <w:pPr>
+        <w:spacing w:line="276" w:lineRule="auto" w:after="120"/>
+        <w:ind w:firstLine="709"/>
         <w:rPr>
           <w:sz w:val="27"/>
           <w:szCs w:val="27"/>
@@ -1601,6 +1622,8 @@
     </w:p>
     <w:p>
       <w:pPr>
+        <w:spacing w:line="276" w:lineRule="auto" w:after="120"/>
+        <w:ind w:firstLine="709"/>
         <w:jc w:val="both"/>
         <w:rPr>
           <w:szCs w:val="28"/>
@@ -1646,6 +1669,8 @@
     </w:p>
     <w:p>
       <w:pPr>
+        <w:spacing w:line="276" w:lineRule="auto" w:after="120"/>
+        <w:ind w:firstLine="709"/>
         <w:jc w:val="both"/>
         <w:rPr>
           <w:rFonts w:eastAsia="Arial Unicode MS"/>
@@ -1693,6 +1718,8 @@
     </w:p>
     <w:p>
       <w:pPr>
+        <w:spacing w:line="276" w:lineRule="auto" w:after="120"/>
+        <w:ind w:firstLine="709"/>
         <w:jc w:val="both"/>
         <w:rPr>
           <w:sz w:val="27"/>
@@ -1899,12 +1926,22 @@
     </w:p>
     <w:tbl>
       <w:tblPr>
+        <w:tblStyle w:val="a3"/>
         <w:tblW w:w="10198" w:type="dxa"/>
+        <w:jc w:val="center"/>
         <w:tblCellMar>
           <w:left w:w="0" w:type="dxa"/>
           <w:right w:w="0" w:type="dxa"/>
         </w:tblCellMar>
         <w:tblLook w:val="04A0" w:firstRow="1" w:lastRow="0" w:firstColumn="1" w:lastColumn="0" w:noHBand="0" w:noVBand="1"/>
+        <w:tblBorders>
+          <w:top w:val="single" w:sz="4" w:space="0" w:color="000000"/>
+          <w:left w:val="single" w:sz="4" w:space="0" w:color="000000"/>
+          <w:bottom w:val="single" w:sz="4" w:space="0" w:color="000000"/>
+          <w:right w:val="single" w:sz="4" w:space="0" w:color="000000"/>
+          <w:insideH w:val="single" w:sz="4" w:space="0" w:color="000000"/>
+          <w:insideV w:val="single" w:sz="4" w:space="0" w:color="000000"/>
+        </w:tblBorders>
       </w:tblPr>
       <w:tblGrid>
         <w:gridCol w:w="1384"/>
@@ -1920,7 +1957,7 @@
         </w:trPr>
         <w:tc>
           <w:tcPr>
-            <w:tcW w:w="1384" w:type="dxa"/>
+            <w:tcW w:w="680" w:type="dxa"/>
             <w:tcBorders>
               <w:top w:val="single" w:sz="4" w:space="0" w:color="auto"/>
               <w:left w:val="single" w:sz="4" w:space="0" w:color="auto"/>
@@ -1935,9 +1972,16 @@
             </w:tcMar>
             <w:vAlign w:val="center"/>
             <w:hideMark/>
-          </w:tcPr>
-          <w:p>
-            <w:pPr>
+            <w:tcMar>
+              <w:top w:w="100" w:type="dxa"/>
+              <w:bottom w:w="100" w:type="dxa"/>
+              <w:left w:w="150" w:type="dxa"/>
+              <w:right w:w="150" w:type="dxa"/>
+            </w:tcMar>
+          </w:tcPr>
+          <w:p>
+            <w:pPr>
+              <w:spacing w:after="40" w:before="40" w:line="240" w:lineRule="auto"/>
               <w:jc w:val="center"/>
               <w:rPr>
                 <w:szCs w:val="28"/>
@@ -1957,7 +2001,7 @@
         </w:tc>
         <w:tc>
           <w:tcPr>
-            <w:tcW w:w="1285" w:type="dxa"/>
+            <w:tcW w:w="907" w:type="dxa"/>
             <w:gridSpan w:val="2"/>
             <w:tcBorders>
               <w:top w:val="single" w:sz="4" w:space="0" w:color="auto"/>
@@ -1973,9 +2017,22 @@
             </w:tcMar>
             <w:vAlign w:val="center"/>
             <w:hideMark/>
-          </w:tcPr>
-          <w:p>
-            <w:pPr>
+            <w:tcMar>
+              <w:top w:w="100" w:type="dxa"/>
+              <w:bottom w:w="100" w:type="dxa"/>
+              <w:left w:w="150" w:type="dxa"/>
+              <w:right w:w="150" w:type="dxa"/>
+            </w:tcMar>
+            <w:tcMar>
+              <w:top w:w="100" w:type="dxa"/>
+              <w:bottom w:w="100" w:type="dxa"/>
+              <w:left w:w="150" w:type="dxa"/>
+              <w:right w:w="150" w:type="dxa"/>
+            </w:tcMar>
+          </w:tcPr>
+          <w:p>
+            <w:pPr>
+              <w:spacing w:after="40" w:before="40" w:line="240" w:lineRule="auto"/>
               <w:jc w:val="center"/>
               <w:rPr>
                 <w:szCs w:val="28"/>
@@ -1995,7 +2052,7 @@
         </w:tc>
         <w:tc>
           <w:tcPr>
-            <w:tcW w:w="5661" w:type="dxa"/>
+            <w:tcW w:w="5102" w:type="dxa"/>
             <w:gridSpan w:val="2"/>
             <w:tcBorders>
               <w:top w:val="single" w:sz="4" w:space="0" w:color="auto"/>
@@ -2011,9 +2068,22 @@
             </w:tcMar>
             <w:vAlign w:val="center"/>
             <w:hideMark/>
-          </w:tcPr>
-          <w:p>
-            <w:pPr>
+            <w:tcMar>
+              <w:top w:w="100" w:type="dxa"/>
+              <w:bottom w:w="100" w:type="dxa"/>
+              <w:left w:w="150" w:type="dxa"/>
+              <w:right w:w="150" w:type="dxa"/>
+            </w:tcMar>
+            <w:tcMar>
+              <w:top w:w="100" w:type="dxa"/>
+              <w:bottom w:w="100" w:type="dxa"/>
+              <w:left w:w="150" w:type="dxa"/>
+              <w:right w:w="150" w:type="dxa"/>
+            </w:tcMar>
+          </w:tcPr>
+          <w:p>
+            <w:pPr>
+              <w:spacing w:after="40" w:before="40" w:line="240" w:lineRule="auto"/>
               <w:jc w:val="center"/>
               <w:rPr>
                 <w:szCs w:val="28"/>
@@ -2033,7 +2103,7 @@
         </w:tc>
         <w:tc>
           <w:tcPr>
-            <w:tcW w:w="1868" w:type="dxa"/>
+            <w:tcW w:w="1531" w:type="dxa"/>
             <w:tcBorders>
               <w:top w:val="single" w:sz="4" w:space="0" w:color="auto"/>
               <w:left w:val="nil"/>
@@ -2048,9 +2118,16 @@
             </w:tcMar>
             <w:vAlign w:val="center"/>
             <w:hideMark/>
-          </w:tcPr>
-          <w:p>
-            <w:pPr>
+            <w:tcMar>
+              <w:top w:w="100" w:type="dxa"/>
+              <w:bottom w:w="100" w:type="dxa"/>
+              <w:left w:w="150" w:type="dxa"/>
+              <w:right w:w="150" w:type="dxa"/>
+            </w:tcMar>
+          </w:tcPr>
+          <w:p>
+            <w:pPr>
+              <w:spacing w:after="40" w:before="40" w:line="240" w:lineRule="auto"/>
               <w:jc w:val="center"/>
               <w:rPr>
                 <w:szCs w:val="28"/>
@@ -2075,7 +2152,7 @@
         </w:trPr>
         <w:tc>
           <w:tcPr>
-            <w:tcW w:w="1384" w:type="dxa"/>
+            <w:tcW w:w="680" w:type="dxa"/>
             <w:tcBorders>
               <w:top w:val="nil"/>
               <w:left w:val="single" w:sz="4" w:space="0" w:color="auto"/>
@@ -2089,9 +2166,16 @@
               <w:right w:w="108" w:type="dxa"/>
             </w:tcMar>
             <w:hideMark/>
-          </w:tcPr>
-          <w:p>
-            <w:pPr>
+            <w:tcMar>
+              <w:top w:w="100" w:type="dxa"/>
+              <w:bottom w:w="100" w:type="dxa"/>
+              <w:left w:w="150" w:type="dxa"/>
+              <w:right w:w="150" w:type="dxa"/>
+            </w:tcMar>
+          </w:tcPr>
+          <w:p>
+            <w:pPr>
+              <w:spacing w:after="40" w:before="40" w:line="240" w:lineRule="auto"/>
               <w:jc w:val="center"/>
               <w:rPr>
                 <w:szCs w:val="28"/>
@@ -2109,7 +2193,7 @@
         </w:tc>
         <w:tc>
           <w:tcPr>
-            <w:tcW w:w="1285" w:type="dxa"/>
+            <w:tcW w:w="907" w:type="dxa"/>
             <w:gridSpan w:val="2"/>
             <w:tcBorders>
               <w:top w:val="nil"/>
@@ -2124,9 +2208,22 @@
               <w:right w:w="108" w:type="dxa"/>
             </w:tcMar>
             <w:hideMark/>
-          </w:tcPr>
-          <w:p>
-            <w:pPr>
+            <w:tcMar>
+              <w:top w:w="100" w:type="dxa"/>
+              <w:bottom w:w="100" w:type="dxa"/>
+              <w:left w:w="150" w:type="dxa"/>
+              <w:right w:w="150" w:type="dxa"/>
+            </w:tcMar>
+            <w:tcMar>
+              <w:top w:w="100" w:type="dxa"/>
+              <w:bottom w:w="100" w:type="dxa"/>
+              <w:left w:w="150" w:type="dxa"/>
+              <w:right w:w="150" w:type="dxa"/>
+            </w:tcMar>
+          </w:tcPr>
+          <w:p>
+            <w:pPr>
+              <w:spacing w:after="40" w:before="40" w:line="240" w:lineRule="auto"/>
               <w:jc w:val="center"/>
               <w:rPr>
                 <w:szCs w:val="28"/>
@@ -2144,7 +2241,7 @@
         </w:tc>
         <w:tc>
           <w:tcPr>
-            <w:tcW w:w="5661" w:type="dxa"/>
+            <w:tcW w:w="5102" w:type="dxa"/>
             <w:gridSpan w:val="2"/>
             <w:tcBorders>
               <w:top w:val="nil"/>
@@ -2159,9 +2256,22 @@
               <w:right w:w="108" w:type="dxa"/>
             </w:tcMar>
             <w:hideMark/>
-          </w:tcPr>
-          <w:p>
-            <w:pPr>
+            <w:tcMar>
+              <w:top w:w="100" w:type="dxa"/>
+              <w:bottom w:w="100" w:type="dxa"/>
+              <w:left w:w="150" w:type="dxa"/>
+              <w:right w:w="150" w:type="dxa"/>
+            </w:tcMar>
+            <w:tcMar>
+              <w:top w:w="100" w:type="dxa"/>
+              <w:bottom w:w="100" w:type="dxa"/>
+              <w:left w:w="150" w:type="dxa"/>
+              <w:right w:w="150" w:type="dxa"/>
+            </w:tcMar>
+          </w:tcPr>
+          <w:p>
+            <w:pPr>
+              <w:spacing w:after="40" w:before="40" w:line="240" w:lineRule="auto"/>
               <w:jc w:val="center"/>
               <w:rPr>
                 <w:szCs w:val="28"/>
@@ -2179,7 +2289,7 @@
         </w:tc>
         <w:tc>
           <w:tcPr>
-            <w:tcW w:w="1868" w:type="dxa"/>
+            <w:tcW w:w="1531" w:type="dxa"/>
             <w:tcBorders>
               <w:top w:val="nil"/>
               <w:left w:val="nil"/>
@@ -2193,9 +2303,16 @@
               <w:right w:w="108" w:type="dxa"/>
             </w:tcMar>
             <w:hideMark/>
-          </w:tcPr>
-          <w:p>
-            <w:pPr>
+            <w:tcMar>
+              <w:top w:w="100" w:type="dxa"/>
+              <w:bottom w:w="100" w:type="dxa"/>
+              <w:left w:w="150" w:type="dxa"/>
+              <w:right w:w="150" w:type="dxa"/>
+            </w:tcMar>
+          </w:tcPr>
+          <w:p>
+            <w:pPr>
+              <w:spacing w:after="40" w:before="40" w:line="240" w:lineRule="auto"/>
               <w:jc w:val="center"/>
               <w:rPr>
                 <w:szCs w:val="28"/>
@@ -2220,7 +2337,7 @@
         </w:trPr>
         <w:tc>
           <w:tcPr>
-            <w:tcW w:w="1384" w:type="dxa"/>
+            <w:tcW w:w="680" w:type="dxa"/>
             <w:tcBorders>
               <w:top w:val="nil"/>
               <w:left w:val="single" w:sz="4" w:space="0" w:color="auto"/>
@@ -2233,9 +2350,16 @@
               <w:bottom w:w="0" w:type="dxa"/>
               <w:right w:w="108" w:type="dxa"/>
             </w:tcMar>
-          </w:tcPr>
-          <w:p>
-            <w:pPr>
+            <w:tcMar>
+              <w:top w:w="100" w:type="dxa"/>
+              <w:bottom w:w="100" w:type="dxa"/>
+              <w:left w:w="150" w:type="dxa"/>
+              <w:right w:w="150" w:type="dxa"/>
+            </w:tcMar>
+          </w:tcPr>
+          <w:p>
+            <w:pPr>
+              <w:spacing w:after="40" w:before="40" w:line="240" w:lineRule="auto"/>
               <w:jc w:val="both"/>
               <w:rPr>
                 <w:szCs w:val="28"/>
@@ -2246,7 +2370,7 @@
         </w:tc>
         <w:tc>
           <w:tcPr>
-            <w:tcW w:w="1285" w:type="dxa"/>
+            <w:tcW w:w="907" w:type="dxa"/>
             <w:gridSpan w:val="2"/>
             <w:tcBorders>
               <w:top w:val="nil"/>
@@ -2261,9 +2385,22 @@
               <w:right w:w="108" w:type="dxa"/>
             </w:tcMar>
             <w:hideMark/>
-          </w:tcPr>
-          <w:p>
-            <w:pPr>
+            <w:tcMar>
+              <w:top w:w="100" w:type="dxa"/>
+              <w:bottom w:w="100" w:type="dxa"/>
+              <w:left w:w="150" w:type="dxa"/>
+              <w:right w:w="150" w:type="dxa"/>
+            </w:tcMar>
+            <w:tcMar>
+              <w:top w:w="100" w:type="dxa"/>
+              <w:bottom w:w="100" w:type="dxa"/>
+              <w:left w:w="150" w:type="dxa"/>
+              <w:right w:w="150" w:type="dxa"/>
+            </w:tcMar>
+          </w:tcPr>
+          <w:p>
+            <w:pPr>
+              <w:spacing w:after="40" w:before="40" w:line="240" w:lineRule="auto"/>
               <w:jc w:val="center"/>
               <w:rPr>
                 <w:szCs w:val="28"/>
@@ -2281,7 +2418,7 @@
         </w:tc>
         <w:tc>
           <w:tcPr>
-            <w:tcW w:w="5661" w:type="dxa"/>
+            <w:tcW w:w="5102" w:type="dxa"/>
             <w:gridSpan w:val="2"/>
             <w:tcBorders>
               <w:top w:val="nil"/>
@@ -2296,9 +2433,22 @@
               <w:right w:w="108" w:type="dxa"/>
             </w:tcMar>
             <w:hideMark/>
-          </w:tcPr>
-          <w:p>
-            <w:pPr>
+            <w:tcMar>
+              <w:top w:w="100" w:type="dxa"/>
+              <w:bottom w:w="100" w:type="dxa"/>
+              <w:left w:w="150" w:type="dxa"/>
+              <w:right w:w="150" w:type="dxa"/>
+            </w:tcMar>
+            <w:tcMar>
+              <w:top w:w="100" w:type="dxa"/>
+              <w:bottom w:w="100" w:type="dxa"/>
+              <w:left w:w="150" w:type="dxa"/>
+              <w:right w:w="150" w:type="dxa"/>
+            </w:tcMar>
+          </w:tcPr>
+          <w:p>
+            <w:pPr>
+              <w:spacing w:after="40" w:before="40" w:line="240" w:lineRule="auto"/>
               <w:jc w:val="center"/>
               <w:rPr>
                 <w:szCs w:val="28"/>
@@ -2316,7 +2466,7 @@
         </w:tc>
         <w:tc>
           <w:tcPr>
-            <w:tcW w:w="1868" w:type="dxa"/>
+            <w:tcW w:w="1531" w:type="dxa"/>
             <w:vMerge w:val="restart"/>
             <w:tcBorders>
               <w:top w:val="nil"/>
@@ -2330,9 +2480,22 @@
               <w:right w:w="108" w:type="dxa"/>
             </w:tcMar>
             <w:hideMark/>
-          </w:tcPr>
-          <w:p>
-            <w:pPr>
+            <w:tcMar>
+              <w:top w:w="100" w:type="dxa"/>
+              <w:bottom w:w="100" w:type="dxa"/>
+              <w:left w:w="150" w:type="dxa"/>
+              <w:right w:w="150" w:type="dxa"/>
+            </w:tcMar>
+            <w:tcMar>
+              <w:top w:w="100" w:type="dxa"/>
+              <w:bottom w:w="100" w:type="dxa"/>
+              <w:left w:w="150" w:type="dxa"/>
+              <w:right w:w="150" w:type="dxa"/>
+            </w:tcMar>
+          </w:tcPr>
+          <w:p>
+            <w:pPr>
+              <w:spacing w:after="40" w:before="40" w:line="240" w:lineRule="auto"/>
               <w:jc w:val="center"/>
               <w:rPr>
                 <w:szCs w:val="28"/>
@@ -2351,6 +2514,7 @@
           </w:p>
           <w:p>
             <w:pPr>
+              <w:spacing w:after="40" w:before="40" w:line="240" w:lineRule="auto"/>
               <w:jc w:val="center"/>
               <w:rPr>
                 <w:szCs w:val="28"/>
@@ -2367,7 +2531,7 @@
         </w:trPr>
         <w:tc>
           <w:tcPr>
-            <w:tcW w:w="1384" w:type="dxa"/>
+            <w:tcW w:w="680" w:type="dxa"/>
             <w:tcBorders>
               <w:top w:val="nil"/>
               <w:left w:val="single" w:sz="4" w:space="0" w:color="auto"/>
@@ -2380,9 +2544,16 @@
               <w:bottom w:w="0" w:type="dxa"/>
               <w:right w:w="108" w:type="dxa"/>
             </w:tcMar>
-          </w:tcPr>
-          <w:p>
-            <w:pPr>
+            <w:tcMar>
+              <w:top w:w="100" w:type="dxa"/>
+              <w:bottom w:w="100" w:type="dxa"/>
+              <w:left w:w="150" w:type="dxa"/>
+              <w:right w:w="150" w:type="dxa"/>
+            </w:tcMar>
+          </w:tcPr>
+          <w:p>
+            <w:pPr>
+              <w:spacing w:after="40" w:before="40" w:line="240" w:lineRule="auto"/>
               <w:jc w:val="both"/>
               <w:rPr>
                 <w:szCs w:val="28"/>
@@ -2393,7 +2564,7 @@
         </w:tc>
         <w:tc>
           <w:tcPr>
-            <w:tcW w:w="1285" w:type="dxa"/>
+            <w:tcW w:w="907" w:type="dxa"/>
             <w:gridSpan w:val="2"/>
             <w:tcBorders>
               <w:top w:val="nil"/>
@@ -2408,9 +2579,22 @@
               <w:right w:w="108" w:type="dxa"/>
             </w:tcMar>
             <w:hideMark/>
-          </w:tcPr>
-          <w:p>
-            <w:pPr>
+            <w:tcMar>
+              <w:top w:w="100" w:type="dxa"/>
+              <w:bottom w:w="100" w:type="dxa"/>
+              <w:left w:w="150" w:type="dxa"/>
+              <w:right w:w="150" w:type="dxa"/>
+            </w:tcMar>
+            <w:tcMar>
+              <w:top w:w="100" w:type="dxa"/>
+              <w:bottom w:w="100" w:type="dxa"/>
+              <w:left w:w="150" w:type="dxa"/>
+              <w:right w:w="150" w:type="dxa"/>
+            </w:tcMar>
+          </w:tcPr>
+          <w:p>
+            <w:pPr>
+              <w:spacing w:after="40" w:before="40" w:line="240" w:lineRule="auto"/>
               <w:jc w:val="center"/>
               <w:rPr>
                 <w:szCs w:val="28"/>
@@ -2428,7 +2612,7 @@
         </w:tc>
         <w:tc>
           <w:tcPr>
-            <w:tcW w:w="5661" w:type="dxa"/>
+            <w:tcW w:w="5102" w:type="dxa"/>
             <w:gridSpan w:val="2"/>
             <w:tcBorders>
               <w:top w:val="nil"/>
@@ -2443,9 +2627,22 @@
               <w:right w:w="108" w:type="dxa"/>
             </w:tcMar>
             <w:hideMark/>
-          </w:tcPr>
-          <w:p>
-            <w:pPr>
+            <w:tcMar>
+              <w:top w:w="100" w:type="dxa"/>
+              <w:bottom w:w="100" w:type="dxa"/>
+              <w:left w:w="150" w:type="dxa"/>
+              <w:right w:w="150" w:type="dxa"/>
+            </w:tcMar>
+            <w:tcMar>
+              <w:top w:w="100" w:type="dxa"/>
+              <w:bottom w:w="100" w:type="dxa"/>
+              <w:left w:w="150" w:type="dxa"/>
+              <w:right w:w="150" w:type="dxa"/>
+            </w:tcMar>
+          </w:tcPr>
+          <w:p>
+            <w:pPr>
+              <w:spacing w:after="40" w:before="40" w:line="240" w:lineRule="auto"/>
               <w:jc w:val="center"/>
               <w:rPr>
                 <w:szCs w:val="28"/>
@@ -2496,7 +2693,7 @@
         </w:trPr>
         <w:tc>
           <w:tcPr>
-            <w:tcW w:w="1384" w:type="dxa"/>
+            <w:tcW w:w="680" w:type="dxa"/>
             <w:tcBorders>
               <w:top w:val="nil"/>
               <w:left w:val="single" w:sz="4" w:space="0" w:color="auto"/>
@@ -2509,9 +2706,16 @@
               <w:bottom w:w="0" w:type="dxa"/>
               <w:right w:w="108" w:type="dxa"/>
             </w:tcMar>
-          </w:tcPr>
-          <w:p>
-            <w:pPr>
+            <w:tcMar>
+              <w:top w:w="100" w:type="dxa"/>
+              <w:bottom w:w="100" w:type="dxa"/>
+              <w:left w:w="150" w:type="dxa"/>
+              <w:right w:w="150" w:type="dxa"/>
+            </w:tcMar>
+          </w:tcPr>
+          <w:p>
+            <w:pPr>
+              <w:spacing w:after="40" w:before="40" w:line="240" w:lineRule="auto"/>
               <w:jc w:val="both"/>
               <w:rPr>
                 <w:szCs w:val="28"/>
@@ -2522,7 +2726,7 @@
         </w:tc>
         <w:tc>
           <w:tcPr>
-            <w:tcW w:w="1285" w:type="dxa"/>
+            <w:tcW w:w="907" w:type="dxa"/>
             <w:gridSpan w:val="2"/>
             <w:tcBorders>
               <w:top w:val="nil"/>
@@ -2537,9 +2741,22 @@
               <w:right w:w="108" w:type="dxa"/>
             </w:tcMar>
             <w:hideMark/>
-          </w:tcPr>
-          <w:p>
-            <w:pPr>
+            <w:tcMar>
+              <w:top w:w="100" w:type="dxa"/>
+              <w:bottom w:w="100" w:type="dxa"/>
+              <w:left w:w="150" w:type="dxa"/>
+              <w:right w:w="150" w:type="dxa"/>
+            </w:tcMar>
+            <w:tcMar>
+              <w:top w:w="100" w:type="dxa"/>
+              <w:bottom w:w="100" w:type="dxa"/>
+              <w:left w:w="150" w:type="dxa"/>
+              <w:right w:w="150" w:type="dxa"/>
+            </w:tcMar>
+          </w:tcPr>
+          <w:p>
+            <w:pPr>
+              <w:spacing w:after="40" w:before="40" w:line="240" w:lineRule="auto"/>
               <w:jc w:val="center"/>
               <w:rPr>
                 <w:szCs w:val="28"/>
@@ -2557,7 +2774,7 @@
         </w:tc>
         <w:tc>
           <w:tcPr>
-            <w:tcW w:w="5661" w:type="dxa"/>
+            <w:tcW w:w="5102" w:type="dxa"/>
             <w:gridSpan w:val="2"/>
             <w:tcBorders>
               <w:top w:val="nil"/>
@@ -2572,9 +2789,22 @@
               <w:right w:w="108" w:type="dxa"/>
             </w:tcMar>
             <w:hideMark/>
-          </w:tcPr>
-          <w:p>
-            <w:pPr>
+            <w:tcMar>
+              <w:top w:w="100" w:type="dxa"/>
+              <w:bottom w:w="100" w:type="dxa"/>
+              <w:left w:w="150" w:type="dxa"/>
+              <w:right w:w="150" w:type="dxa"/>
+            </w:tcMar>
+            <w:tcMar>
+              <w:top w:w="100" w:type="dxa"/>
+              <w:bottom w:w="100" w:type="dxa"/>
+              <w:left w:w="150" w:type="dxa"/>
+              <w:right w:w="150" w:type="dxa"/>
+            </w:tcMar>
+          </w:tcPr>
+          <w:p>
+            <w:pPr>
+              <w:spacing w:after="40" w:before="40" w:line="240" w:lineRule="auto"/>
               <w:jc w:val="center"/>
               <w:rPr>
                 <w:szCs w:val="28"/>
@@ -2592,7 +2822,7 @@
         </w:tc>
         <w:tc>
           <w:tcPr>
-            <w:tcW w:w="1868" w:type="dxa"/>
+            <w:tcW w:w="1531" w:type="dxa"/>
             <w:tcBorders>
               <w:top w:val="nil"/>
               <w:left w:val="nil"/>
@@ -2606,9 +2836,16 @@
               <w:right w:w="108" w:type="dxa"/>
             </w:tcMar>
             <w:hideMark/>
-          </w:tcPr>
-          <w:p>
-            <w:pPr>
+            <w:tcMar>
+              <w:top w:w="100" w:type="dxa"/>
+              <w:bottom w:w="100" w:type="dxa"/>
+              <w:left w:w="150" w:type="dxa"/>
+              <w:right w:w="150" w:type="dxa"/>
+            </w:tcMar>
+          </w:tcPr>
+          <w:p>
+            <w:pPr>
+              <w:spacing w:after="40" w:before="40" w:line="240" w:lineRule="auto"/>
               <w:jc w:val="center"/>
               <w:rPr>
                 <w:szCs w:val="28"/>
@@ -2627,6 +2864,7 @@
           </w:p>
           <w:p>
             <w:pPr>
+              <w:spacing w:after="40" w:before="40" w:line="240" w:lineRule="auto"/>
               <w:jc w:val="center"/>
               <w:rPr>
                 <w:szCs w:val="28"/>
@@ -2643,7 +2881,7 @@
         </w:trPr>
         <w:tc>
           <w:tcPr>
-            <w:tcW w:w="1384" w:type="dxa"/>
+            <w:tcW w:w="680" w:type="dxa"/>
             <w:tcBorders>
               <w:top w:val="nil"/>
               <w:left w:val="single" w:sz="4" w:space="0" w:color="auto"/>
@@ -2656,9 +2894,16 @@
               <w:bottom w:w="0" w:type="dxa"/>
               <w:right w:w="108" w:type="dxa"/>
             </w:tcMar>
-          </w:tcPr>
-          <w:p>
-            <w:pPr>
+            <w:tcMar>
+              <w:top w:w="100" w:type="dxa"/>
+              <w:bottom w:w="100" w:type="dxa"/>
+              <w:left w:w="150" w:type="dxa"/>
+              <w:right w:w="150" w:type="dxa"/>
+            </w:tcMar>
+          </w:tcPr>
+          <w:p>
+            <w:pPr>
+              <w:spacing w:after="40" w:before="40" w:line="240" w:lineRule="auto"/>
               <w:jc w:val="both"/>
               <w:rPr>
                 <w:szCs w:val="28"/>
@@ -2669,7 +2914,7 @@
         </w:tc>
         <w:tc>
           <w:tcPr>
-            <w:tcW w:w="1285" w:type="dxa"/>
+            <w:tcW w:w="907" w:type="dxa"/>
             <w:gridSpan w:val="2"/>
             <w:tcBorders>
               <w:top w:val="nil"/>
@@ -2684,9 +2929,22 @@
               <w:right w:w="108" w:type="dxa"/>
             </w:tcMar>
             <w:hideMark/>
-          </w:tcPr>
-          <w:p>
-            <w:pPr>
+            <w:tcMar>
+              <w:top w:w="100" w:type="dxa"/>
+              <w:bottom w:w="100" w:type="dxa"/>
+              <w:left w:w="150" w:type="dxa"/>
+              <w:right w:w="150" w:type="dxa"/>
+            </w:tcMar>
+            <w:tcMar>
+              <w:top w:w="100" w:type="dxa"/>
+              <w:bottom w:w="100" w:type="dxa"/>
+              <w:left w:w="150" w:type="dxa"/>
+              <w:right w:w="150" w:type="dxa"/>
+            </w:tcMar>
+          </w:tcPr>
+          <w:p>
+            <w:pPr>
+              <w:spacing w:after="40" w:before="40" w:line="240" w:lineRule="auto"/>
               <w:jc w:val="center"/>
               <w:rPr>
                 <w:szCs w:val="28"/>
@@ -2704,7 +2962,7 @@
         </w:tc>
         <w:tc>
           <w:tcPr>
-            <w:tcW w:w="5661" w:type="dxa"/>
+            <w:tcW w:w="5102" w:type="dxa"/>
             <w:gridSpan w:val="2"/>
             <w:tcBorders>
               <w:top w:val="nil"/>
@@ -2719,9 +2977,22 @@
               <w:right w:w="108" w:type="dxa"/>
             </w:tcMar>
             <w:hideMark/>
-          </w:tcPr>
-          <w:p>
-            <w:pPr>
+            <w:tcMar>
+              <w:top w:w="100" w:type="dxa"/>
+              <w:bottom w:w="100" w:type="dxa"/>
+              <w:left w:w="150" w:type="dxa"/>
+              <w:right w:w="150" w:type="dxa"/>
+            </w:tcMar>
+            <w:tcMar>
+              <w:top w:w="100" w:type="dxa"/>
+              <w:bottom w:w="100" w:type="dxa"/>
+              <w:left w:w="150" w:type="dxa"/>
+              <w:right w:w="150" w:type="dxa"/>
+            </w:tcMar>
+          </w:tcPr>
+          <w:p>
+            <w:pPr>
+              <w:spacing w:after="40" w:before="40" w:line="240" w:lineRule="auto"/>
               <w:jc w:val="center"/>
               <w:rPr>
                 <w:szCs w:val="28"/>
@@ -2739,7 +3010,7 @@
         </w:tc>
         <w:tc>
           <w:tcPr>
-            <w:tcW w:w="1868" w:type="dxa"/>
+            <w:tcW w:w="1531" w:type="dxa"/>
             <w:tcBorders>
               <w:top w:val="nil"/>
               <w:left w:val="nil"/>
@@ -2753,9 +3024,16 @@
               <w:right w:w="108" w:type="dxa"/>
             </w:tcMar>
             <w:hideMark/>
-          </w:tcPr>
-          <w:p>
-            <w:pPr>
+            <w:tcMar>
+              <w:top w:w="100" w:type="dxa"/>
+              <w:bottom w:w="100" w:type="dxa"/>
+              <w:left w:w="150" w:type="dxa"/>
+              <w:right w:w="150" w:type="dxa"/>
+            </w:tcMar>
+          </w:tcPr>
+          <w:p>
+            <w:pPr>
+              <w:spacing w:after="40" w:before="40" w:line="240" w:lineRule="auto"/>
               <w:rPr>
                 <w:szCs w:val="28"/>
                 <w:u w:val="single"/>
@@ -2779,7 +3057,7 @@
         </w:trPr>
         <w:tc>
           <w:tcPr>
-            <w:tcW w:w="1384" w:type="dxa"/>
+            <w:tcW w:w="680" w:type="dxa"/>
             <w:tcBorders>
               <w:top w:val="nil"/>
               <w:left w:val="single" w:sz="4" w:space="0" w:color="auto"/>
@@ -2793,9 +3071,16 @@
               <w:right w:w="108" w:type="dxa"/>
             </w:tcMar>
             <w:hideMark/>
-          </w:tcPr>
-          <w:p>
-            <w:pPr>
+            <w:tcMar>
+              <w:top w:w="100" w:type="dxa"/>
+              <w:bottom w:w="100" w:type="dxa"/>
+              <w:left w:w="150" w:type="dxa"/>
+              <w:right w:w="150" w:type="dxa"/>
+            </w:tcMar>
+          </w:tcPr>
+          <w:p>
+            <w:pPr>
+              <w:spacing w:after="40" w:before="40" w:line="240" w:lineRule="auto"/>
               <w:jc w:val="center"/>
               <w:rPr>
                 <w:szCs w:val="28"/>
@@ -2813,7 +3098,7 @@
         </w:tc>
         <w:tc>
           <w:tcPr>
-            <w:tcW w:w="1285" w:type="dxa"/>
+            <w:tcW w:w="907" w:type="dxa"/>
             <w:gridSpan w:val="2"/>
             <w:tcBorders>
               <w:top w:val="nil"/>
@@ -2828,9 +3113,22 @@
               <w:right w:w="108" w:type="dxa"/>
             </w:tcMar>
             <w:hideMark/>
-          </w:tcPr>
-          <w:p>
-            <w:pPr>
+            <w:tcMar>
+              <w:top w:w="100" w:type="dxa"/>
+              <w:bottom w:w="100" w:type="dxa"/>
+              <w:left w:w="150" w:type="dxa"/>
+              <w:right w:w="150" w:type="dxa"/>
+            </w:tcMar>
+            <w:tcMar>
+              <w:top w:w="100" w:type="dxa"/>
+              <w:bottom w:w="100" w:type="dxa"/>
+              <w:left w:w="150" w:type="dxa"/>
+              <w:right w:w="150" w:type="dxa"/>
+            </w:tcMar>
+          </w:tcPr>
+          <w:p>
+            <w:pPr>
+              <w:spacing w:after="40" w:before="40" w:line="240" w:lineRule="auto"/>
               <w:jc w:val="center"/>
               <w:rPr>
                 <w:szCs w:val="28"/>
@@ -2848,7 +3146,7 @@
         </w:tc>
         <w:tc>
           <w:tcPr>
-            <w:tcW w:w="5661" w:type="dxa"/>
+            <w:tcW w:w="5102" w:type="dxa"/>
             <w:gridSpan w:val="2"/>
             <w:tcBorders>
               <w:top w:val="nil"/>
@@ -2863,9 +3161,22 @@
               <w:right w:w="108" w:type="dxa"/>
             </w:tcMar>
             <w:hideMark/>
-          </w:tcPr>
-          <w:p>
-            <w:pPr>
+            <w:tcMar>
+              <w:top w:w="100" w:type="dxa"/>
+              <w:bottom w:w="100" w:type="dxa"/>
+              <w:left w:w="150" w:type="dxa"/>
+              <w:right w:w="150" w:type="dxa"/>
+            </w:tcMar>
+            <w:tcMar>
+              <w:top w:w="100" w:type="dxa"/>
+              <w:bottom w:w="100" w:type="dxa"/>
+              <w:left w:w="150" w:type="dxa"/>
+              <w:right w:w="150" w:type="dxa"/>
+            </w:tcMar>
+          </w:tcPr>
+          <w:p>
+            <w:pPr>
+              <w:spacing w:after="40" w:before="40" w:line="240" w:lineRule="auto"/>
               <w:jc w:val="center"/>
               <w:rPr>
                 <w:szCs w:val="28"/>
@@ -2883,7 +3194,7 @@
         </w:tc>
         <w:tc>
           <w:tcPr>
-            <w:tcW w:w="1868" w:type="dxa"/>
+            <w:tcW w:w="1531" w:type="dxa"/>
             <w:tcBorders>
               <w:top w:val="nil"/>
               <w:left w:val="nil"/>
@@ -2897,9 +3208,16 @@
               <w:right w:w="108" w:type="dxa"/>
             </w:tcMar>
             <w:hideMark/>
-          </w:tcPr>
-          <w:p>
-            <w:pPr>
+            <w:tcMar>
+              <w:top w:w="100" w:type="dxa"/>
+              <w:bottom w:w="100" w:type="dxa"/>
+              <w:left w:w="150" w:type="dxa"/>
+              <w:right w:w="150" w:type="dxa"/>
+            </w:tcMar>
+          </w:tcPr>
+          <w:p>
+            <w:pPr>
+              <w:spacing w:after="40" w:before="40" w:line="240" w:lineRule="auto"/>
               <w:jc w:val="center"/>
               <w:rPr>
                 <w:szCs w:val="28"/>
@@ -2924,7 +3242,7 @@
         </w:trPr>
         <w:tc>
           <w:tcPr>
-            <w:tcW w:w="1384" w:type="dxa"/>
+            <w:tcW w:w="680" w:type="dxa"/>
             <w:tcBorders>
               <w:top w:val="nil"/>
               <w:left w:val="single" w:sz="4" w:space="0" w:color="auto"/>
@@ -2937,9 +3255,16 @@
               <w:bottom w:w="0" w:type="dxa"/>
               <w:right w:w="108" w:type="dxa"/>
             </w:tcMar>
-          </w:tcPr>
-          <w:p>
-            <w:pPr>
+            <w:tcMar>
+              <w:top w:w="100" w:type="dxa"/>
+              <w:bottom w:w="100" w:type="dxa"/>
+              <w:left w:w="150" w:type="dxa"/>
+              <w:right w:w="150" w:type="dxa"/>
+            </w:tcMar>
+          </w:tcPr>
+          <w:p>
+            <w:pPr>
+              <w:spacing w:after="40" w:before="40" w:line="240" w:lineRule="auto"/>
               <w:jc w:val="both"/>
               <w:rPr>
                 <w:szCs w:val="28"/>
@@ -2950,7 +3275,7 @@
         </w:tc>
         <w:tc>
           <w:tcPr>
-            <w:tcW w:w="1285" w:type="dxa"/>
+            <w:tcW w:w="907" w:type="dxa"/>
             <w:gridSpan w:val="2"/>
             <w:tcBorders>
               <w:top w:val="nil"/>
@@ -2965,9 +3290,22 @@
               <w:right w:w="108" w:type="dxa"/>
             </w:tcMar>
             <w:hideMark/>
-          </w:tcPr>
-          <w:p>
-            <w:pPr>
+            <w:tcMar>
+              <w:top w:w="100" w:type="dxa"/>
+              <w:bottom w:w="100" w:type="dxa"/>
+              <w:left w:w="150" w:type="dxa"/>
+              <w:right w:w="150" w:type="dxa"/>
+            </w:tcMar>
+            <w:tcMar>
+              <w:top w:w="100" w:type="dxa"/>
+              <w:bottom w:w="100" w:type="dxa"/>
+              <w:left w:w="150" w:type="dxa"/>
+              <w:right w:w="150" w:type="dxa"/>
+            </w:tcMar>
+          </w:tcPr>
+          <w:p>
+            <w:pPr>
+              <w:spacing w:after="40" w:before="40" w:line="240" w:lineRule="auto"/>
               <w:jc w:val="center"/>
               <w:rPr>
                 <w:szCs w:val="28"/>
@@ -2985,7 +3323,7 @@
         </w:tc>
         <w:tc>
           <w:tcPr>
-            <w:tcW w:w="5661" w:type="dxa"/>
+            <w:tcW w:w="5102" w:type="dxa"/>
             <w:gridSpan w:val="2"/>
             <w:tcBorders>
               <w:top w:val="nil"/>
@@ -3000,9 +3338,22 @@
               <w:right w:w="108" w:type="dxa"/>
             </w:tcMar>
             <w:hideMark/>
-          </w:tcPr>
-          <w:p>
-            <w:pPr>
+            <w:tcMar>
+              <w:top w:w="100" w:type="dxa"/>
+              <w:bottom w:w="100" w:type="dxa"/>
+              <w:left w:w="150" w:type="dxa"/>
+              <w:right w:w="150" w:type="dxa"/>
+            </w:tcMar>
+            <w:tcMar>
+              <w:top w:w="100" w:type="dxa"/>
+              <w:bottom w:w="100" w:type="dxa"/>
+              <w:left w:w="150" w:type="dxa"/>
+              <w:right w:w="150" w:type="dxa"/>
+            </w:tcMar>
+          </w:tcPr>
+          <w:p>
+            <w:pPr>
+              <w:spacing w:after="40" w:before="40" w:line="240" w:lineRule="auto"/>
               <w:jc w:val="center"/>
               <w:rPr>
                 <w:szCs w:val="28"/>
@@ -3020,7 +3371,7 @@
         </w:tc>
         <w:tc>
           <w:tcPr>
-            <w:tcW w:w="1868" w:type="dxa"/>
+            <w:tcW w:w="1531" w:type="dxa"/>
             <w:tcBorders>
               <w:top w:val="nil"/>
               <w:left w:val="nil"/>
@@ -3034,9 +3385,16 @@
               <w:right w:w="108" w:type="dxa"/>
             </w:tcMar>
             <w:hideMark/>
-          </w:tcPr>
-          <w:p>
-            <w:pPr>
+            <w:tcMar>
+              <w:top w:w="100" w:type="dxa"/>
+              <w:bottom w:w="100" w:type="dxa"/>
+              <w:left w:w="150" w:type="dxa"/>
+              <w:right w:w="150" w:type="dxa"/>
+            </w:tcMar>
+          </w:tcPr>
+          <w:p>
+            <w:pPr>
+              <w:spacing w:after="40" w:before="40" w:line="240" w:lineRule="auto"/>
               <w:jc w:val="center"/>
               <w:rPr>
                 <w:szCs w:val="28"/>
@@ -3061,7 +3419,7 @@
         </w:trPr>
         <w:tc>
           <w:tcPr>
-            <w:tcW w:w="1384" w:type="dxa"/>
+            <w:tcW w:w="680" w:type="dxa"/>
             <w:tcBorders>
               <w:top w:val="nil"/>
               <w:left w:val="single" w:sz="4" w:space="0" w:color="auto"/>
@@ -3074,9 +3432,16 @@
               <w:bottom w:w="0" w:type="dxa"/>
               <w:right w:w="108" w:type="dxa"/>
             </w:tcMar>
-          </w:tcPr>
-          <w:p>
-            <w:pPr>
+            <w:tcMar>
+              <w:top w:w="100" w:type="dxa"/>
+              <w:bottom w:w="100" w:type="dxa"/>
+              <w:left w:w="150" w:type="dxa"/>
+              <w:right w:w="150" w:type="dxa"/>
+            </w:tcMar>
+          </w:tcPr>
+          <w:p>
+            <w:pPr>
+              <w:spacing w:after="40" w:before="40" w:line="240" w:lineRule="auto"/>
               <w:jc w:val="both"/>
               <w:rPr>
                 <w:szCs w:val="28"/>
@@ -3087,7 +3452,7 @@
         </w:tc>
         <w:tc>
           <w:tcPr>
-            <w:tcW w:w="1285" w:type="dxa"/>
+            <w:tcW w:w="907" w:type="dxa"/>
             <w:gridSpan w:val="2"/>
             <w:tcBorders>
               <w:top w:val="nil"/>
@@ -3102,9 +3467,22 @@
               <w:right w:w="108" w:type="dxa"/>
             </w:tcMar>
             <w:hideMark/>
-          </w:tcPr>
-          <w:p>
-            <w:pPr>
+            <w:tcMar>
+              <w:top w:w="100" w:type="dxa"/>
+              <w:bottom w:w="100" w:type="dxa"/>
+              <w:left w:w="150" w:type="dxa"/>
+              <w:right w:w="150" w:type="dxa"/>
+            </w:tcMar>
+            <w:tcMar>
+              <w:top w:w="100" w:type="dxa"/>
+              <w:bottom w:w="100" w:type="dxa"/>
+              <w:left w:w="150" w:type="dxa"/>
+              <w:right w:w="150" w:type="dxa"/>
+            </w:tcMar>
+          </w:tcPr>
+          <w:p>
+            <w:pPr>
+              <w:spacing w:after="40" w:before="40" w:line="240" w:lineRule="auto"/>
               <w:jc w:val="center"/>
               <w:rPr>
                 <w:szCs w:val="28"/>
@@ -3122,7 +3500,7 @@
         </w:tc>
         <w:tc>
           <w:tcPr>
-            <w:tcW w:w="5661" w:type="dxa"/>
+            <w:tcW w:w="5102" w:type="dxa"/>
             <w:gridSpan w:val="2"/>
             <w:tcBorders>
               <w:top w:val="nil"/>
@@ -3137,9 +3515,22 @@
               <w:right w:w="108" w:type="dxa"/>
             </w:tcMar>
             <w:hideMark/>
-          </w:tcPr>
-          <w:p>
-            <w:pPr>
+            <w:tcMar>
+              <w:top w:w="100" w:type="dxa"/>
+              <w:bottom w:w="100" w:type="dxa"/>
+              <w:left w:w="150" w:type="dxa"/>
+              <w:right w:w="150" w:type="dxa"/>
+            </w:tcMar>
+            <w:tcMar>
+              <w:top w:w="100" w:type="dxa"/>
+              <w:bottom w:w="100" w:type="dxa"/>
+              <w:left w:w="150" w:type="dxa"/>
+              <w:right w:w="150" w:type="dxa"/>
+            </w:tcMar>
+          </w:tcPr>
+          <w:p>
+            <w:pPr>
+              <w:spacing w:after="40" w:before="40" w:line="240" w:lineRule="auto"/>
               <w:jc w:val="center"/>
               <w:rPr>
                 <w:szCs w:val="28"/>
@@ -3157,7 +3548,7 @@
         </w:tc>
         <w:tc>
           <w:tcPr>
-            <w:tcW w:w="1868" w:type="dxa"/>
+            <w:tcW w:w="1531" w:type="dxa"/>
             <w:tcBorders>
               <w:top w:val="nil"/>
               <w:left w:val="nil"/>
@@ -3171,9 +3562,16 @@
               <w:right w:w="108" w:type="dxa"/>
             </w:tcMar>
             <w:hideMark/>
-          </w:tcPr>
-          <w:p>
-            <w:pPr>
+            <w:tcMar>
+              <w:top w:w="100" w:type="dxa"/>
+              <w:bottom w:w="100" w:type="dxa"/>
+              <w:left w:w="150" w:type="dxa"/>
+              <w:right w:w="150" w:type="dxa"/>
+            </w:tcMar>
+          </w:tcPr>
+          <w:p>
+            <w:pPr>
+              <w:spacing w:after="40" w:before="40" w:line="240" w:lineRule="auto"/>
               <w:rPr>
                 <w:szCs w:val="28"/>
                 <w:u w:val="single"/>
@@ -3197,7 +3595,7 @@
         </w:trPr>
         <w:tc>
           <w:tcPr>
-            <w:tcW w:w="1384" w:type="dxa"/>
+            <w:tcW w:w="680" w:type="dxa"/>
             <w:tcBorders>
               <w:top w:val="nil"/>
               <w:left w:val="single" w:sz="4" w:space="0" w:color="auto"/>
@@ -3210,9 +3608,16 @@
               <w:bottom w:w="0" w:type="dxa"/>
               <w:right w:w="108" w:type="dxa"/>
             </w:tcMar>
-          </w:tcPr>
-          <w:p>
-            <w:pPr>
+            <w:tcMar>
+              <w:top w:w="100" w:type="dxa"/>
+              <w:bottom w:w="100" w:type="dxa"/>
+              <w:left w:w="150" w:type="dxa"/>
+              <w:right w:w="150" w:type="dxa"/>
+            </w:tcMar>
+          </w:tcPr>
+          <w:p>
+            <w:pPr>
+              <w:spacing w:after="40" w:before="40" w:line="240" w:lineRule="auto"/>
               <w:jc w:val="both"/>
               <w:rPr>
                 <w:szCs w:val="28"/>
@@ -3223,7 +3628,7 @@
         </w:tc>
         <w:tc>
           <w:tcPr>
-            <w:tcW w:w="1285" w:type="dxa"/>
+            <w:tcW w:w="907" w:type="dxa"/>
             <w:gridSpan w:val="2"/>
             <w:tcBorders>
               <w:top w:val="nil"/>
@@ -3237,9 +3642,22 @@
               <w:bottom w:w="0" w:type="dxa"/>
               <w:right w:w="108" w:type="dxa"/>
             </w:tcMar>
-          </w:tcPr>
-          <w:p>
-            <w:pPr>
+            <w:tcMar>
+              <w:top w:w="100" w:type="dxa"/>
+              <w:bottom w:w="100" w:type="dxa"/>
+              <w:left w:w="150" w:type="dxa"/>
+              <w:right w:w="150" w:type="dxa"/>
+            </w:tcMar>
+            <w:tcMar>
+              <w:top w:w="100" w:type="dxa"/>
+              <w:bottom w:w="100" w:type="dxa"/>
+              <w:left w:w="150" w:type="dxa"/>
+              <w:right w:w="150" w:type="dxa"/>
+            </w:tcMar>
+          </w:tcPr>
+          <w:p>
+            <w:pPr>
+              <w:spacing w:after="40" w:before="40" w:line="240" w:lineRule="auto"/>
               <w:jc w:val="center"/>
               <w:rPr>
                 <w:szCs w:val="28"/>
@@ -3257,7 +3675,7 @@
         </w:tc>
         <w:tc>
           <w:tcPr>
-            <w:tcW w:w="5661" w:type="dxa"/>
+            <w:tcW w:w="5102" w:type="dxa"/>
             <w:gridSpan w:val="2"/>
             <w:tcBorders>
               <w:top w:val="nil"/>
@@ -3271,9 +3689,22 @@
               <w:bottom w:w="0" w:type="dxa"/>
               <w:right w:w="108" w:type="dxa"/>
             </w:tcMar>
-          </w:tcPr>
-          <w:p>
-            <w:pPr>
+            <w:tcMar>
+              <w:top w:w="100" w:type="dxa"/>
+              <w:bottom w:w="100" w:type="dxa"/>
+              <w:left w:w="150" w:type="dxa"/>
+              <w:right w:w="150" w:type="dxa"/>
+            </w:tcMar>
+            <w:tcMar>
+              <w:top w:w="100" w:type="dxa"/>
+              <w:bottom w:w="100" w:type="dxa"/>
+              <w:left w:w="150" w:type="dxa"/>
+              <w:right w:w="150" w:type="dxa"/>
+            </w:tcMar>
+          </w:tcPr>
+          <w:p>
+            <w:pPr>
+              <w:spacing w:after="40" w:before="40" w:line="240" w:lineRule="auto"/>
               <w:rPr>
                 <w:szCs w:val="28"/>
                 <w:lang w:val="kk-KZ"/>
@@ -3290,7 +3721,7 @@
         </w:tc>
         <w:tc>
           <w:tcPr>
-            <w:tcW w:w="1868" w:type="dxa"/>
+            <w:tcW w:w="1531" w:type="dxa"/>
             <w:tcBorders>
               <w:top w:val="nil"/>
               <w:left w:val="nil"/>
@@ -3303,9 +3734,16 @@
               <w:bottom w:w="0" w:type="dxa"/>
               <w:right w:w="108" w:type="dxa"/>
             </w:tcMar>
-          </w:tcPr>
-          <w:p>
-            <w:pPr>
+            <w:tcMar>
+              <w:top w:w="100" w:type="dxa"/>
+              <w:bottom w:w="100" w:type="dxa"/>
+              <w:left w:w="150" w:type="dxa"/>
+              <w:right w:w="150" w:type="dxa"/>
+            </w:tcMar>
+          </w:tcPr>
+          <w:p>
+            <w:pPr>
+              <w:spacing w:after="40" w:before="40" w:line="240" w:lineRule="auto"/>
               <w:jc w:val="center"/>
               <w:rPr>
                 <w:szCs w:val="28"/>
@@ -3330,7 +3768,7 @@
         </w:trPr>
         <w:tc>
           <w:tcPr>
-            <w:tcW w:w="1384" w:type="dxa"/>
+            <w:tcW w:w="680" w:type="dxa"/>
             <w:tcBorders>
               <w:top w:val="nil"/>
               <w:left w:val="single" w:sz="4" w:space="0" w:color="auto"/>
@@ -3343,9 +3781,16 @@
               <w:bottom w:w="0" w:type="dxa"/>
               <w:right w:w="108" w:type="dxa"/>
             </w:tcMar>
-          </w:tcPr>
-          <w:p>
-            <w:pPr>
+            <w:tcMar>
+              <w:top w:w="100" w:type="dxa"/>
+              <w:bottom w:w="100" w:type="dxa"/>
+              <w:left w:w="150" w:type="dxa"/>
+              <w:right w:w="150" w:type="dxa"/>
+            </w:tcMar>
+          </w:tcPr>
+          <w:p>
+            <w:pPr>
+              <w:spacing w:after="40" w:before="40" w:line="240" w:lineRule="auto"/>
               <w:jc w:val="both"/>
               <w:rPr>
                 <w:szCs w:val="28"/>
@@ -3356,7 +3801,7 @@
         </w:tc>
         <w:tc>
           <w:tcPr>
-            <w:tcW w:w="1285" w:type="dxa"/>
+            <w:tcW w:w="907" w:type="dxa"/>
             <w:gridSpan w:val="2"/>
             <w:tcBorders>
               <w:top w:val="nil"/>
@@ -3370,9 +3815,22 @@
               <w:bottom w:w="0" w:type="dxa"/>
               <w:right w:w="108" w:type="dxa"/>
             </w:tcMar>
-          </w:tcPr>
-          <w:p>
-            <w:pPr>
+            <w:tcMar>
+              <w:top w:w="100" w:type="dxa"/>
+              <w:bottom w:w="100" w:type="dxa"/>
+              <w:left w:w="150" w:type="dxa"/>
+              <w:right w:w="150" w:type="dxa"/>
+            </w:tcMar>
+            <w:tcMar>
+              <w:top w:w="100" w:type="dxa"/>
+              <w:bottom w:w="100" w:type="dxa"/>
+              <w:left w:w="150" w:type="dxa"/>
+              <w:right w:w="150" w:type="dxa"/>
+            </w:tcMar>
+          </w:tcPr>
+          <w:p>
+            <w:pPr>
+              <w:spacing w:after="40" w:before="40" w:line="240" w:lineRule="auto"/>
               <w:jc w:val="center"/>
               <w:rPr>
                 <w:szCs w:val="28"/>
@@ -3390,7 +3848,7 @@
         </w:tc>
         <w:tc>
           <w:tcPr>
-            <w:tcW w:w="5661" w:type="dxa"/>
+            <w:tcW w:w="5102" w:type="dxa"/>
             <w:gridSpan w:val="2"/>
             <w:tcBorders>
               <w:top w:val="nil"/>
@@ -3404,9 +3862,22 @@
               <w:bottom w:w="0" w:type="dxa"/>
               <w:right w:w="108" w:type="dxa"/>
             </w:tcMar>
-          </w:tcPr>
-          <w:p>
-            <w:pPr>
+            <w:tcMar>
+              <w:top w:w="100" w:type="dxa"/>
+              <w:bottom w:w="100" w:type="dxa"/>
+              <w:left w:w="150" w:type="dxa"/>
+              <w:right w:w="150" w:type="dxa"/>
+            </w:tcMar>
+            <w:tcMar>
+              <w:top w:w="100" w:type="dxa"/>
+              <w:bottom w:w="100" w:type="dxa"/>
+              <w:left w:w="150" w:type="dxa"/>
+              <w:right w:w="150" w:type="dxa"/>
+            </w:tcMar>
+          </w:tcPr>
+          <w:p>
+            <w:pPr>
+              <w:spacing w:after="40" w:before="40" w:line="240" w:lineRule="auto"/>
               <w:jc w:val="center"/>
               <w:rPr>
                 <w:szCs w:val="28"/>
@@ -3424,7 +3895,7 @@
         </w:tc>
         <w:tc>
           <w:tcPr>
-            <w:tcW w:w="1868" w:type="dxa"/>
+            <w:tcW w:w="1531" w:type="dxa"/>
             <w:tcBorders>
               <w:top w:val="nil"/>
               <w:left w:val="nil"/>
@@ -3437,9 +3908,16 @@
               <w:bottom w:w="0" w:type="dxa"/>
               <w:right w:w="108" w:type="dxa"/>
             </w:tcMar>
-          </w:tcPr>
-          <w:p>
-            <w:pPr>
+            <w:tcMar>
+              <w:top w:w="100" w:type="dxa"/>
+              <w:bottom w:w="100" w:type="dxa"/>
+              <w:left w:w="150" w:type="dxa"/>
+              <w:right w:w="150" w:type="dxa"/>
+            </w:tcMar>
+          </w:tcPr>
+          <w:p>
+            <w:pPr>
+              <w:spacing w:after="40" w:before="40" w:line="240" w:lineRule="auto"/>
               <w:jc w:val="center"/>
               <w:rPr>
                 <w:szCs w:val="28"/>
@@ -3466,26 +3944,52 @@
         </w:trPr>
         <w:tc>
           <w:tcPr>
-            <w:tcW w:w="1868" w:type="dxa"/>
+            <w:tcW w:w="907" w:type="dxa"/>
             <w:gridSpan w:val="2"/>
-          </w:tcPr>
-          <w:p>
-            <w:pPr>
-              <w:jc w:val="center"/>
-              <w:rPr>
-                <w:szCs w:val="28"/>
-                <w:lang w:val="kk-KZ"/>
-              </w:rPr>
-            </w:pPr>
-          </w:p>
-        </w:tc>
-        <w:tc>
-          <w:tcPr>
-            <w:tcW w:w="1868" w:type="dxa"/>
+            <w:tcMar>
+              <w:top w:w="100" w:type="dxa"/>
+              <w:bottom w:w="100" w:type="dxa"/>
+              <w:left w:w="150" w:type="dxa"/>
+              <w:right w:w="150" w:type="dxa"/>
+            </w:tcMar>
+            <w:tcMar>
+              <w:top w:w="100" w:type="dxa"/>
+              <w:bottom w:w="100" w:type="dxa"/>
+              <w:left w:w="150" w:type="dxa"/>
+              <w:right w:w="150" w:type="dxa"/>
+            </w:tcMar>
+          </w:tcPr>
+          <w:p>
+            <w:pPr>
+              <w:spacing w:after="40" w:before="40" w:line="240" w:lineRule="auto"/>
+              <w:jc w:val="center"/>
+              <w:rPr>
+                <w:szCs w:val="28"/>
+                <w:lang w:val="kk-KZ"/>
+              </w:rPr>
+            </w:pPr>
+          </w:p>
+        </w:tc>
+        <w:tc>
+          <w:tcPr>
+            <w:tcW w:w="5102" w:type="dxa"/>
             <w:gridSpan w:val="2"/>
-          </w:tcPr>
-          <w:p>
-            <w:pPr>
+            <w:tcMar>
+              <w:top w:w="100" w:type="dxa"/>
+              <w:bottom w:w="100" w:type="dxa"/>
+              <w:left w:w="150" w:type="dxa"/>
+              <w:right w:w="150" w:type="dxa"/>
+            </w:tcMar>
+            <w:tcMar>
+              <w:top w:w="100" w:type="dxa"/>
+              <w:bottom w:w="100" w:type="dxa"/>
+              <w:left w:w="150" w:type="dxa"/>
+              <w:right w:w="150" w:type="dxa"/>
+            </w:tcMar>
+          </w:tcPr>
+          <w:p>
+            <w:pPr>
+              <w:spacing w:after="40" w:before="40" w:line="240" w:lineRule="auto"/>
               <w:jc w:val="center"/>
               <w:rPr>
                 <w:szCs w:val="28"/>
@@ -3504,26 +4008,52 @@
         </w:trPr>
         <w:tc>
           <w:tcPr>
-            <w:tcW w:w="1868" w:type="dxa"/>
+            <w:tcW w:w="907" w:type="dxa"/>
             <w:gridSpan w:val="2"/>
-          </w:tcPr>
-          <w:p>
-            <w:pPr>
-              <w:jc w:val="center"/>
-              <w:rPr>
-                <w:szCs w:val="28"/>
-                <w:lang w:val="kk-KZ"/>
-              </w:rPr>
-            </w:pPr>
-          </w:p>
-        </w:tc>
-        <w:tc>
-          <w:tcPr>
-            <w:tcW w:w="1868" w:type="dxa"/>
+            <w:tcMar>
+              <w:top w:w="100" w:type="dxa"/>
+              <w:bottom w:w="100" w:type="dxa"/>
+              <w:left w:w="150" w:type="dxa"/>
+              <w:right w:w="150" w:type="dxa"/>
+            </w:tcMar>
+            <w:tcMar>
+              <w:top w:w="100" w:type="dxa"/>
+              <w:bottom w:w="100" w:type="dxa"/>
+              <w:left w:w="150" w:type="dxa"/>
+              <w:right w:w="150" w:type="dxa"/>
+            </w:tcMar>
+          </w:tcPr>
+          <w:p>
+            <w:pPr>
+              <w:spacing w:after="40" w:before="40" w:line="240" w:lineRule="auto"/>
+              <w:jc w:val="center"/>
+              <w:rPr>
+                <w:szCs w:val="28"/>
+                <w:lang w:val="kk-KZ"/>
+              </w:rPr>
+            </w:pPr>
+          </w:p>
+        </w:tc>
+        <w:tc>
+          <w:tcPr>
+            <w:tcW w:w="5102" w:type="dxa"/>
             <w:gridSpan w:val="2"/>
-          </w:tcPr>
-          <w:p>
-            <w:pPr>
+            <w:tcMar>
+              <w:top w:w="100" w:type="dxa"/>
+              <w:bottom w:w="100" w:type="dxa"/>
+              <w:left w:w="150" w:type="dxa"/>
+              <w:right w:w="150" w:type="dxa"/>
+            </w:tcMar>
+            <w:tcMar>
+              <w:top w:w="100" w:type="dxa"/>
+              <w:bottom w:w="100" w:type="dxa"/>
+              <w:left w:w="150" w:type="dxa"/>
+              <w:right w:w="150" w:type="dxa"/>
+            </w:tcMar>
+          </w:tcPr>
+          <w:p>
+            <w:pPr>
+              <w:spacing w:after="40" w:before="40" w:line="240" w:lineRule="auto"/>
               <w:jc w:val="center"/>
               <w:rPr>
                 <w:szCs w:val="28"/>
@@ -3539,13 +4069,14 @@
       <w:tblPr>
         <w:tblStyle w:val="a3"/>
         <w:tblW w:w="10173" w:type="dxa"/>
+        <w:jc w:val="center"/>
         <w:tblBorders>
-          <w:top w:val="none" w:sz="0" w:space="0" w:color="auto"/>
-          <w:left w:val="none" w:sz="0" w:space="0" w:color="auto"/>
-          <w:bottom w:val="none" w:sz="0" w:space="0" w:color="auto"/>
-          <w:right w:val="none" w:sz="0" w:space="0" w:color="auto"/>
-          <w:insideH w:val="none" w:sz="0" w:space="0" w:color="auto"/>
-          <w:insideV w:val="none" w:sz="0" w:space="0" w:color="auto"/>
+          <w:top w:val="single" w:sz="4" w:space="0" w:color="000000"/>
+          <w:left w:val="single" w:sz="4" w:space="0" w:color="000000"/>
+          <w:bottom w:val="single" w:sz="4" w:space="0" w:color="000000"/>
+          <w:right w:val="single" w:sz="4" w:space="0" w:color="000000"/>
+          <w:insideH w:val="single" w:sz="4" w:space="0" w:color="000000"/>
+          <w:insideV w:val="single" w:sz="4" w:space="0" w:color="000000"/>
         </w:tblBorders>
         <w:tblLook w:val="04A0" w:firstRow="1" w:lastRow="0" w:firstColumn="1" w:lastColumn="0" w:noHBand="0" w:noVBand="1"/>
       </w:tblPr>
@@ -3558,25 +4089,34 @@
         <w:tc>
           <w:tcPr>
             <w:tcW w:w="3546" w:type="dxa"/>
-          </w:tcPr>
-          <w:p>
-            <w:pPr>
-              <w:rPr>
-                <w:szCs w:val="28"/>
-                <w:lang w:val="kk-KZ"/>
-              </w:rPr>
-            </w:pPr>
-          </w:p>
-          <w:p>
-            <w:pPr>
-              <w:rPr>
-                <w:szCs w:val="28"/>
-                <w:lang w:val="kk-KZ"/>
-              </w:rPr>
-            </w:pPr>
-          </w:p>
-          <w:p>
-            <w:pPr>
+            <w:tcMar>
+              <w:top w:w="100" w:type="dxa"/>
+              <w:bottom w:w="100" w:type="dxa"/>
+              <w:left w:w="150" w:type="dxa"/>
+              <w:right w:w="150" w:type="dxa"/>
+            </w:tcMar>
+          </w:tcPr>
+          <w:p>
+            <w:pPr>
+              <w:spacing w:after="40" w:before="40" w:line="240" w:lineRule="auto"/>
+              <w:rPr>
+                <w:szCs w:val="28"/>
+                <w:lang w:val="kk-KZ"/>
+              </w:rPr>
+            </w:pPr>
+          </w:p>
+          <w:p>
+            <w:pPr>
+              <w:spacing w:after="40" w:before="40" w:line="240" w:lineRule="auto"/>
+              <w:rPr>
+                <w:szCs w:val="28"/>
+                <w:lang w:val="kk-KZ"/>
+              </w:rPr>
+            </w:pPr>
+          </w:p>
+          <w:p>
+            <w:pPr>
+              <w:spacing w:after="40" w:before="40" w:line="240" w:lineRule="auto"/>
               <w:rPr>
                 <w:szCs w:val="28"/>
                 <w:lang w:val="kk-KZ"/>
@@ -3595,9 +4135,16 @@
           <w:tcPr>
             <w:tcW w:w="3096" w:type="dxa"/>
             <w:vAlign w:val="center"/>
-          </w:tcPr>
-          <w:p>
-            <w:pPr>
+            <w:tcMar>
+              <w:top w:w="100" w:type="dxa"/>
+              <w:bottom w:w="100" w:type="dxa"/>
+              <w:left w:w="150" w:type="dxa"/>
+              <w:right w:w="150" w:type="dxa"/>
+            </w:tcMar>
+          </w:tcPr>
+          <w:p>
+            <w:pPr>
+              <w:spacing w:after="40" w:before="40" w:line="240" w:lineRule="auto"/>
               <w:jc w:val="center"/>
               <w:rPr>
                 <w:b/>
@@ -3607,6 +4154,7 @@
           </w:p>
           <w:p>
             <w:pPr>
+              <w:spacing w:after="40" w:before="40" w:line="240" w:lineRule="auto"/>
               <w:jc w:val="center"/>
               <w:rPr>
                 <w:b/>
@@ -3617,6 +4165,7 @@
           </w:p>
           <w:p>
             <w:pPr>
+              <w:spacing w:after="40" w:before="40" w:line="240" w:lineRule="auto"/>
               <w:jc w:val="center"/>
               <w:rPr>
                 <w:b/>
@@ -3633,6 +4182,7 @@
           </w:p>
           <w:p>
             <w:pPr>
+              <w:spacing w:after="40" w:before="40" w:line="240" w:lineRule="auto"/>
               <w:jc w:val="center"/>
               <w:rPr>
                 <w:bCs/>
@@ -3674,9 +4224,16 @@
           <w:tcPr>
             <w:tcW w:w="3531" w:type="dxa"/>
             <w:vAlign w:val="center"/>
-          </w:tcPr>
-          <w:p>
-            <w:pPr>
+            <w:tcMar>
+              <w:top w:w="100" w:type="dxa"/>
+              <w:bottom w:w="100" w:type="dxa"/>
+              <w:left w:w="150" w:type="dxa"/>
+              <w:right w:w="150" w:type="dxa"/>
+            </w:tcMar>
+          </w:tcPr>
+          <w:p>
+            <w:pPr>
+              <w:spacing w:after="40" w:before="40" w:line="240" w:lineRule="auto"/>
               <w:jc w:val="center"/>
               <w:rPr>
                 <w:b/>
@@ -3687,6 +4244,7 @@
           </w:p>
           <w:p>
             <w:pPr>
+              <w:spacing w:after="40" w:before="40" w:line="240" w:lineRule="auto"/>
               <w:jc w:val="center"/>
               <w:rPr>
                 <w:b/>
@@ -3697,6 +4255,7 @@
           </w:p>
           <w:p>
             <w:pPr>
+              <w:spacing w:after="40" w:before="40" w:line="240" w:lineRule="auto"/>
               <w:jc w:val="center"/>
               <w:rPr>
                 <w:b/>
@@ -3745,6 +4304,7 @@
           </w:p>
           <w:p>
             <w:pPr>
+              <w:spacing w:after="40" w:before="40" w:line="240" w:lineRule="auto"/>
               <w:jc w:val="center"/>
               <w:rPr>
                 <w:sz w:val="20"/>
@@ -3815,9 +4375,16 @@
         <w:tc>
           <w:tcPr>
             <w:tcW w:w="3546" w:type="dxa"/>
-          </w:tcPr>
-          <w:p>
-            <w:pPr>
+            <w:tcMar>
+              <w:top w:w="100" w:type="dxa"/>
+              <w:bottom w:w="100" w:type="dxa"/>
+              <w:left w:w="150" w:type="dxa"/>
+              <w:right w:w="150" w:type="dxa"/>
+            </w:tcMar>
+          </w:tcPr>
+          <w:p>
+            <w:pPr>
+              <w:spacing w:after="40" w:before="40" w:line="240" w:lineRule="auto"/>
               <w:rPr>
                 <w:szCs w:val="28"/>
                 <w:lang w:val="kk-KZ"/>
@@ -3836,9 +4403,16 @@
           <w:tcPr>
             <w:tcW w:w="3096" w:type="dxa"/>
             <w:vAlign w:val="center"/>
-          </w:tcPr>
-          <w:p>
-            <w:pPr>
+            <w:tcMar>
+              <w:top w:w="100" w:type="dxa"/>
+              <w:bottom w:w="100" w:type="dxa"/>
+              <w:left w:w="150" w:type="dxa"/>
+              <w:right w:w="150" w:type="dxa"/>
+            </w:tcMar>
+          </w:tcPr>
+          <w:p>
+            <w:pPr>
+              <w:spacing w:after="40" w:before="40" w:line="240" w:lineRule="auto"/>
               <w:jc w:val="center"/>
               <w:rPr>
                 <w:b/>
@@ -3855,6 +4429,7 @@
           </w:p>
           <w:p>
             <w:pPr>
+              <w:spacing w:after="40" w:before="40" w:line="240" w:lineRule="auto"/>
               <w:jc w:val="center"/>
               <w:rPr>
                 <w:bCs/>
@@ -3896,9 +4471,16 @@
           <w:tcPr>
             <w:tcW w:w="3531" w:type="dxa"/>
             <w:vAlign w:val="center"/>
-          </w:tcPr>
-          <w:p>
-            <w:pPr>
+            <w:tcMar>
+              <w:top w:w="100" w:type="dxa"/>
+              <w:bottom w:w="100" w:type="dxa"/>
+              <w:left w:w="150" w:type="dxa"/>
+              <w:right w:w="150" w:type="dxa"/>
+            </w:tcMar>
+          </w:tcPr>
+          <w:p>
+            <w:pPr>
+              <w:spacing w:after="40" w:before="40" w:line="240" w:lineRule="auto"/>
               <w:jc w:val="center"/>
               <w:rPr>
                 <w:b/>
@@ -3945,6 +4527,7 @@
           </w:p>
           <w:p>
             <w:pPr>
+              <w:spacing w:after="40" w:before="40" w:line="240" w:lineRule="auto"/>
               <w:jc w:val="center"/>
             </w:pPr>
             <w:r>
@@ -4010,129 +4593,151 @@
         <w:tc>
           <w:tcPr>
             <w:tcW w:w="3546" w:type="dxa"/>
-          </w:tcPr>
-          <w:p>
-            <w:pPr>
-              <w:rPr>
-                <w:szCs w:val="28"/>
-                <w:lang w:val="kk-KZ"/>
-              </w:rPr>
-            </w:pPr>
-          </w:p>
-          <w:p>
-            <w:pPr>
-              <w:rPr>
-                <w:szCs w:val="28"/>
-                <w:lang w:val="kk-KZ"/>
-              </w:rPr>
-            </w:pPr>
-          </w:p>
-          <w:p>
-            <w:pPr>
-              <w:rPr>
-                <w:szCs w:val="28"/>
-                <w:lang w:val="kk-KZ"/>
-              </w:rPr>
-            </w:pPr>
-          </w:p>
-          <w:p>
-            <w:pPr>
-              <w:rPr>
-                <w:szCs w:val="28"/>
-                <w:lang w:val="kk-KZ"/>
-              </w:rPr>
-            </w:pPr>
-          </w:p>
-          <w:p>
-            <w:pPr>
-              <w:rPr>
-                <w:szCs w:val="28"/>
-                <w:lang w:val="kk-KZ"/>
-              </w:rPr>
-            </w:pPr>
-          </w:p>
-          <w:p>
-            <w:pPr>
-              <w:rPr>
-                <w:szCs w:val="28"/>
-                <w:lang w:val="kk-KZ"/>
-              </w:rPr>
-            </w:pPr>
-          </w:p>
-          <w:p>
-            <w:pPr>
-              <w:rPr>
-                <w:szCs w:val="28"/>
-                <w:lang w:val="kk-KZ"/>
-              </w:rPr>
-            </w:pPr>
-          </w:p>
-          <w:p>
-            <w:pPr>
-              <w:rPr>
-                <w:szCs w:val="28"/>
-                <w:lang w:val="kk-KZ"/>
-              </w:rPr>
-            </w:pPr>
-          </w:p>
-          <w:p>
-            <w:pPr>
-              <w:rPr>
-                <w:szCs w:val="28"/>
-                <w:lang w:val="kk-KZ"/>
-              </w:rPr>
-            </w:pPr>
-          </w:p>
-          <w:p>
-            <w:pPr>
-              <w:rPr>
-                <w:szCs w:val="28"/>
-                <w:lang w:val="kk-KZ"/>
-              </w:rPr>
-            </w:pPr>
-          </w:p>
-          <w:p>
-            <w:pPr>
-              <w:rPr>
-                <w:szCs w:val="28"/>
-                <w:lang w:val="kk-KZ"/>
-              </w:rPr>
-            </w:pPr>
-          </w:p>
-          <w:p>
-            <w:pPr>
-              <w:rPr>
-                <w:szCs w:val="28"/>
-                <w:lang w:val="kk-KZ"/>
-              </w:rPr>
-            </w:pPr>
-          </w:p>
-          <w:p>
-            <w:pPr>
-              <w:rPr>
-                <w:szCs w:val="28"/>
-                <w:lang w:val="kk-KZ"/>
-              </w:rPr>
-            </w:pPr>
-          </w:p>
-          <w:p>
-            <w:pPr>
-              <w:rPr>
-                <w:szCs w:val="28"/>
-                <w:lang w:val="kk-KZ"/>
-              </w:rPr>
-            </w:pPr>
-          </w:p>
-          <w:p>
-            <w:pPr>
-              <w:rPr>
-                <w:szCs w:val="28"/>
-                <w:lang w:val="kk-KZ"/>
-              </w:rPr>
-            </w:pPr>
-          </w:p>
-          <w:p>
-            <w:pPr>
+            <w:tcMar>
+              <w:top w:w="100" w:type="dxa"/>
+              <w:bottom w:w="100" w:type="dxa"/>
+              <w:left w:w="150" w:type="dxa"/>
+              <w:right w:w="150" w:type="dxa"/>
+            </w:tcMar>
+          </w:tcPr>
+          <w:p>
+            <w:pPr>
+              <w:spacing w:after="40" w:before="40" w:line="240" w:lineRule="auto"/>
+              <w:rPr>
+                <w:szCs w:val="28"/>
+                <w:lang w:val="kk-KZ"/>
+              </w:rPr>
+            </w:pPr>
+          </w:p>
+          <w:p>
+            <w:pPr>
+              <w:spacing w:after="40" w:before="40" w:line="240" w:lineRule="auto"/>
+              <w:rPr>
+                <w:szCs w:val="28"/>
+                <w:lang w:val="kk-KZ"/>
+              </w:rPr>
+            </w:pPr>
+          </w:p>
+          <w:p>
+            <w:pPr>
+              <w:spacing w:after="40" w:before="40" w:line="240" w:lineRule="auto"/>
+              <w:rPr>
+                <w:szCs w:val="28"/>
+                <w:lang w:val="kk-KZ"/>
+              </w:rPr>
+            </w:pPr>
+          </w:p>
+          <w:p>
+            <w:pPr>
+              <w:spacing w:after="40" w:before="40" w:line="240" w:lineRule="auto"/>
+              <w:rPr>
+                <w:szCs w:val="28"/>
+                <w:lang w:val="kk-KZ"/>
+              </w:rPr>
+            </w:pPr>
+          </w:p>
+          <w:p>
+            <w:pPr>
+              <w:spacing w:after="40" w:before="40" w:line="240" w:lineRule="auto"/>
+              <w:rPr>
+                <w:szCs w:val="28"/>
+                <w:lang w:val="kk-KZ"/>
+              </w:rPr>
+            </w:pPr>
+          </w:p>
+          <w:p>
+            <w:pPr>
+              <w:spacing w:after="40" w:before="40" w:line="240" w:lineRule="auto"/>
+              <w:rPr>
+                <w:szCs w:val="28"/>
+                <w:lang w:val="kk-KZ"/>
+              </w:rPr>
+            </w:pPr>
+          </w:p>
+          <w:p>
+            <w:pPr>
+              <w:spacing w:after="40" w:before="40" w:line="240" w:lineRule="auto"/>
+              <w:rPr>
+                <w:szCs w:val="28"/>
+                <w:lang w:val="kk-KZ"/>
+              </w:rPr>
+            </w:pPr>
+          </w:p>
+          <w:p>
+            <w:pPr>
+              <w:spacing w:after="40" w:before="40" w:line="240" w:lineRule="auto"/>
+              <w:rPr>
+                <w:szCs w:val="28"/>
+                <w:lang w:val="kk-KZ"/>
+              </w:rPr>
+            </w:pPr>
+          </w:p>
+          <w:p>
+            <w:pPr>
+              <w:spacing w:after="40" w:before="40" w:line="240" w:lineRule="auto"/>
+              <w:rPr>
+                <w:szCs w:val="28"/>
+                <w:lang w:val="kk-KZ"/>
+              </w:rPr>
+            </w:pPr>
+          </w:p>
+          <w:p>
+            <w:pPr>
+              <w:spacing w:after="40" w:before="40" w:line="240" w:lineRule="auto"/>
+              <w:rPr>
+                <w:szCs w:val="28"/>
+                <w:lang w:val="kk-KZ"/>
+              </w:rPr>
+            </w:pPr>
+          </w:p>
+          <w:p>
+            <w:pPr>
+              <w:spacing w:after="40" w:before="40" w:line="240" w:lineRule="auto"/>
+              <w:rPr>
+                <w:szCs w:val="28"/>
+                <w:lang w:val="kk-KZ"/>
+              </w:rPr>
+            </w:pPr>
+          </w:p>
+          <w:p>
+            <w:pPr>
+              <w:spacing w:after="40" w:before="40" w:line="240" w:lineRule="auto"/>
+              <w:rPr>
+                <w:szCs w:val="28"/>
+                <w:lang w:val="kk-KZ"/>
+              </w:rPr>
+            </w:pPr>
+          </w:p>
+          <w:p>
+            <w:pPr>
+              <w:spacing w:after="40" w:before="40" w:line="240" w:lineRule="auto"/>
+              <w:rPr>
+                <w:szCs w:val="28"/>
+                <w:lang w:val="kk-KZ"/>
+              </w:rPr>
+            </w:pPr>
+          </w:p>
+          <w:p>
+            <w:pPr>
+              <w:spacing w:after="40" w:before="40" w:line="240" w:lineRule="auto"/>
+              <w:rPr>
+                <w:szCs w:val="28"/>
+                <w:lang w:val="kk-KZ"/>
+              </w:rPr>
+            </w:pPr>
+          </w:p>
+          <w:p>
+            <w:pPr>
+              <w:spacing w:after="40" w:before="40" w:line="240" w:lineRule="auto"/>
+              <w:rPr>
+                <w:szCs w:val="28"/>
+                <w:lang w:val="kk-KZ"/>
+              </w:rPr>
+            </w:pPr>
+          </w:p>
+          <w:p>
+            <w:pPr>
+              <w:spacing w:after="40" w:before="40" w:line="240" w:lineRule="auto"/>
               <w:rPr>
                 <w:szCs w:val="28"/>
                 <w:lang w:val="kk-KZ"/>
@@ -4144,9 +4749,16 @@
           <w:tcPr>
             <w:tcW w:w="3096" w:type="dxa"/>
             <w:vAlign w:val="center"/>
-          </w:tcPr>
-          <w:p>
-            <w:pPr>
+            <w:tcMar>
+              <w:top w:w="100" w:type="dxa"/>
+              <w:bottom w:w="100" w:type="dxa"/>
+              <w:left w:w="150" w:type="dxa"/>
+              <w:right w:w="150" w:type="dxa"/>
+            </w:tcMar>
+          </w:tcPr>
+          <w:p>
+            <w:pPr>
+              <w:spacing w:after="40" w:before="40" w:line="240" w:lineRule="auto"/>
               <w:jc w:val="center"/>
               <w:rPr>
                 <w:b/>
@@ -4159,9 +4771,16 @@
           <w:tcPr>
             <w:tcW w:w="3531" w:type="dxa"/>
             <w:vAlign w:val="center"/>
-          </w:tcPr>
-          <w:p>
-            <w:pPr>
+            <w:tcMar>
+              <w:top w:w="100" w:type="dxa"/>
+              <w:bottom w:w="100" w:type="dxa"/>
+              <w:left w:w="150" w:type="dxa"/>
+              <w:right w:w="150" w:type="dxa"/>
+            </w:tcMar>
+          </w:tcPr>
+          <w:p>
+            <w:pPr>
+              <w:spacing w:after="40" w:before="40" w:line="240" w:lineRule="auto"/>
               <w:jc w:val="center"/>
               <w:rPr>
                 <w:b/>
@@ -4174,15 +4793,16 @@
     </w:tbl>
     <w:tbl>
       <w:tblPr>
+        <w:tblStyle w:val="a3"/>
         <w:tblW w:w="10308" w:type="dxa"/>
         <w:jc w:val="center"/>
         <w:tblBorders>
-          <w:top w:val="single" w:sz="4" w:space="0" w:color="auto"/>
-          <w:left w:val="single" w:sz="4" w:space="0" w:color="auto"/>
-          <w:bottom w:val="single" w:sz="4" w:space="0" w:color="auto"/>
-          <w:right w:val="single" w:sz="4" w:space="0" w:color="auto"/>
-          <w:insideH w:val="single" w:sz="4" w:space="0" w:color="auto"/>
-          <w:insideV w:val="single" w:sz="4" w:space="0" w:color="auto"/>
+          <w:top w:val="single" w:sz="4" w:space="0" w:color="000000"/>
+          <w:left w:val="single" w:sz="4" w:space="0" w:color="000000"/>
+          <w:bottom w:val="single" w:sz="4" w:space="0" w:color="000000"/>
+          <w:right w:val="single" w:sz="4" w:space="0" w:color="000000"/>
+          <w:insideH w:val="single" w:sz="4" w:space="0" w:color="000000"/>
+          <w:insideV w:val="single" w:sz="4" w:space="0" w:color="000000"/>
         </w:tblBorders>
         <w:tblLook w:val="01E0" w:firstRow="1" w:lastRow="1" w:firstColumn="1" w:lastColumn="1" w:noHBand="0" w:noVBand="0"/>
       </w:tblPr>
@@ -4197,7 +4817,7 @@
         </w:trPr>
         <w:tc>
           <w:tcPr>
-            <w:tcW w:w="1256" w:type="dxa"/>
+            <w:tcW w:w="1134" w:type="dxa"/>
             <w:tcBorders>
               <w:top w:val="single" w:sz="4" w:space="0" w:color="auto"/>
               <w:left w:val="single" w:sz="4" w:space="0" w:color="auto"/>
@@ -4206,9 +4826,16 @@
             </w:tcBorders>
             <w:vAlign w:val="center"/>
             <w:hideMark/>
-          </w:tcPr>
-          <w:p>
-            <w:pPr>
+            <w:tcMar>
+              <w:top w:w="100" w:type="dxa"/>
+              <w:bottom w:w="100" w:type="dxa"/>
+              <w:left w:w="150" w:type="dxa"/>
+              <w:right w:w="150" w:type="dxa"/>
+            </w:tcMar>
+          </w:tcPr>
+          <w:p>
+            <w:pPr>
+              <w:spacing w:after="40" w:before="40" w:line="240" w:lineRule="auto"/>
               <w:jc w:val="center"/>
               <w:rPr>
                 <w:szCs w:val="28"/>
@@ -4233,7 +4860,7 @@
         </w:tc>
         <w:tc>
           <w:tcPr>
-            <w:tcW w:w="5940" w:type="dxa"/>
+            <w:tcW w:w="5386" w:type="dxa"/>
             <w:tcBorders>
               <w:top w:val="single" w:sz="4" w:space="0" w:color="auto"/>
               <w:left w:val="single" w:sz="4" w:space="0" w:color="auto"/>
@@ -4242,9 +4869,16 @@
             </w:tcBorders>
             <w:vAlign w:val="center"/>
             <w:hideMark/>
-          </w:tcPr>
-          <w:p>
-            <w:pPr>
+            <w:tcMar>
+              <w:top w:w="100" w:type="dxa"/>
+              <w:bottom w:w="100" w:type="dxa"/>
+              <w:left w:w="150" w:type="dxa"/>
+              <w:right w:w="150" w:type="dxa"/>
+            </w:tcMar>
+          </w:tcPr>
+          <w:p>
+            <w:pPr>
+              <w:spacing w:after="40" w:before="40" w:line="240" w:lineRule="auto"/>
               <w:jc w:val="center"/>
               <w:rPr>
                 <w:szCs w:val="28"/>
@@ -4262,7 +4896,7 @@
         </w:tc>
         <w:tc>
           <w:tcPr>
-            <w:tcW w:w="3112" w:type="dxa"/>
+            <w:tcW w:w="1701" w:type="dxa"/>
             <w:tcBorders>
               <w:top w:val="single" w:sz="4" w:space="0" w:color="auto"/>
               <w:left w:val="single" w:sz="4" w:space="0" w:color="auto"/>
@@ -4271,9 +4905,16 @@
             </w:tcBorders>
             <w:vAlign w:val="center"/>
             <w:hideMark/>
-          </w:tcPr>
-          <w:p>
-            <w:pPr>
+            <w:tcMar>
+              <w:top w:w="100" w:type="dxa"/>
+              <w:bottom w:w="100" w:type="dxa"/>
+              <w:left w:w="150" w:type="dxa"/>
+              <w:right w:w="150" w:type="dxa"/>
+            </w:tcMar>
+          </w:tcPr>
+          <w:p>
+            <w:pPr>
+              <w:spacing w:after="40" w:before="40" w:line="240" w:lineRule="auto"/>
               <w:jc w:val="center"/>
               <w:rPr>
                 <w:szCs w:val="28"/>
@@ -4296,16 +4937,23 @@
         </w:trPr>
         <w:tc>
           <w:tcPr>
-            <w:tcW w:w="1256" w:type="dxa"/>
+            <w:tcW w:w="1134" w:type="dxa"/>
             <w:tcBorders>
               <w:top w:val="single" w:sz="4" w:space="0" w:color="auto"/>
               <w:left w:val="single" w:sz="4" w:space="0" w:color="auto"/>
               <w:bottom w:val="single" w:sz="4" w:space="0" w:color="auto"/>
               <w:right w:val="single" w:sz="4" w:space="0" w:color="auto"/>
             </w:tcBorders>
-          </w:tcPr>
-          <w:p>
-            <w:pPr>
+            <w:tcMar>
+              <w:top w:w="100" w:type="dxa"/>
+              <w:bottom w:w="100" w:type="dxa"/>
+              <w:left w:w="150" w:type="dxa"/>
+              <w:right w:w="150" w:type="dxa"/>
+            </w:tcMar>
+          </w:tcPr>
+          <w:p>
+            <w:pPr>
+              <w:spacing w:after="40" w:before="40" w:line="240" w:lineRule="auto"/>
               <w:jc w:val="center"/>
               <w:rPr>
                 <w:szCs w:val="28"/>
@@ -4323,16 +4971,23 @@
         </w:tc>
         <w:tc>
           <w:tcPr>
-            <w:tcW w:w="5940" w:type="dxa"/>
+            <w:tcW w:w="5386" w:type="dxa"/>
             <w:tcBorders>
               <w:top w:val="single" w:sz="4" w:space="0" w:color="auto"/>
               <w:left w:val="single" w:sz="4" w:space="0" w:color="auto"/>
               <w:bottom w:val="single" w:sz="4" w:space="0" w:color="auto"/>
               <w:right w:val="single" w:sz="4" w:space="0" w:color="auto"/>
             </w:tcBorders>
-          </w:tcPr>
-          <w:p>
-            <w:pPr>
+            <w:tcMar>
+              <w:top w:w="100" w:type="dxa"/>
+              <w:bottom w:w="100" w:type="dxa"/>
+              <w:left w:w="150" w:type="dxa"/>
+              <w:right w:w="150" w:type="dxa"/>
+            </w:tcMar>
+          </w:tcPr>
+          <w:p>
+            <w:pPr>
+              <w:spacing w:after="40" w:before="40" w:line="240" w:lineRule="auto"/>
               <w:jc w:val="center"/>
               <w:rPr>
                 <w:szCs w:val="28"/>
@@ -4350,16 +5005,23 @@
         </w:tc>
         <w:tc>
           <w:tcPr>
-            <w:tcW w:w="3112" w:type="dxa"/>
+            <w:tcW w:w="1701" w:type="dxa"/>
             <w:tcBorders>
               <w:top w:val="single" w:sz="4" w:space="0" w:color="auto"/>
               <w:left w:val="single" w:sz="4" w:space="0" w:color="auto"/>
               <w:bottom w:val="single" w:sz="4" w:space="0" w:color="auto"/>
               <w:right w:val="single" w:sz="4" w:space="0" w:color="auto"/>
             </w:tcBorders>
-          </w:tcPr>
-          <w:p>
-            <w:pPr>
+            <w:tcMar>
+              <w:top w:w="100" w:type="dxa"/>
+              <w:bottom w:w="100" w:type="dxa"/>
+              <w:left w:w="150" w:type="dxa"/>
+              <w:right w:w="150" w:type="dxa"/>
+            </w:tcMar>
+          </w:tcPr>
+          <w:p>
+            <w:pPr>
+              <w:spacing w:after="40" w:before="40" w:line="240" w:lineRule="auto"/>
               <w:jc w:val="center"/>
               <w:rPr>
                 <w:szCs w:val="28"/>
@@ -4375,16 +5037,23 @@
         </w:trPr>
         <w:tc>
           <w:tcPr>
-            <w:tcW w:w="1256" w:type="dxa"/>
+            <w:tcW w:w="1134" w:type="dxa"/>
             <w:tcBorders>
               <w:top w:val="single" w:sz="4" w:space="0" w:color="auto"/>
               <w:left w:val="single" w:sz="4" w:space="0" w:color="auto"/>
               <w:bottom w:val="single" w:sz="4" w:space="0" w:color="auto"/>
               <w:right w:val="single" w:sz="4" w:space="0" w:color="auto"/>
             </w:tcBorders>
-          </w:tcPr>
-          <w:p>
-            <w:pPr>
+            <w:tcMar>
+              <w:top w:w="100" w:type="dxa"/>
+              <w:bottom w:w="100" w:type="dxa"/>
+              <w:left w:w="150" w:type="dxa"/>
+              <w:right w:w="150" w:type="dxa"/>
+            </w:tcMar>
+          </w:tcPr>
+          <w:p>
+            <w:pPr>
+              <w:spacing w:after="40" w:before="40" w:line="240" w:lineRule="auto"/>
               <w:jc w:val="center"/>
               <w:rPr>
                 <w:szCs w:val="28"/>
@@ -4402,16 +5071,23 @@
         </w:tc>
         <w:tc>
           <w:tcPr>
-            <w:tcW w:w="5940" w:type="dxa"/>
+            <w:tcW w:w="5386" w:type="dxa"/>
             <w:tcBorders>
               <w:top w:val="single" w:sz="4" w:space="0" w:color="auto"/>
               <w:left w:val="single" w:sz="4" w:space="0" w:color="auto"/>
               <w:bottom w:val="single" w:sz="4" w:space="0" w:color="auto"/>
               <w:right w:val="single" w:sz="4" w:space="0" w:color="auto"/>
             </w:tcBorders>
-          </w:tcPr>
-          <w:p>
-            <w:pPr>
+            <w:tcMar>
+              <w:top w:w="100" w:type="dxa"/>
+              <w:bottom w:w="100" w:type="dxa"/>
+              <w:left w:w="150" w:type="dxa"/>
+              <w:right w:w="150" w:type="dxa"/>
+            </w:tcMar>
+          </w:tcPr>
+          <w:p>
+            <w:pPr>
+              <w:spacing w:after="40" w:before="40" w:line="240" w:lineRule="auto"/>
               <w:jc w:val="center"/>
               <w:rPr>
                 <w:szCs w:val="28"/>
@@ -4429,16 +5105,23 @@
         </w:tc>
         <w:tc>
           <w:tcPr>
-            <w:tcW w:w="3112" w:type="dxa"/>
+            <w:tcW w:w="1701" w:type="dxa"/>
             <w:tcBorders>
               <w:top w:val="single" w:sz="4" w:space="0" w:color="auto"/>
               <w:left w:val="single" w:sz="4" w:space="0" w:color="auto"/>
               <w:bottom w:val="single" w:sz="4" w:space="0" w:color="auto"/>
               <w:right w:val="single" w:sz="4" w:space="0" w:color="auto"/>
             </w:tcBorders>
-          </w:tcPr>
-          <w:p>
-            <w:pPr>
+            <w:tcMar>
+              <w:top w:w="100" w:type="dxa"/>
+              <w:bottom w:w="100" w:type="dxa"/>
+              <w:left w:w="150" w:type="dxa"/>
+              <w:right w:w="150" w:type="dxa"/>
+            </w:tcMar>
+          </w:tcPr>
+          <w:p>
+            <w:pPr>
+              <w:spacing w:after="40" w:before="40" w:line="240" w:lineRule="auto"/>
               <w:jc w:val="center"/>
               <w:rPr>
                 <w:szCs w:val="28"/>
@@ -4454,16 +5137,23 @@
         </w:trPr>
         <w:tc>
           <w:tcPr>
-            <w:tcW w:w="1256" w:type="dxa"/>
+            <w:tcW w:w="1134" w:type="dxa"/>
             <w:tcBorders>
               <w:top w:val="single" w:sz="4" w:space="0" w:color="auto"/>
               <w:left w:val="single" w:sz="4" w:space="0" w:color="auto"/>
               <w:bottom w:val="single" w:sz="4" w:space="0" w:color="auto"/>
               <w:right w:val="single" w:sz="4" w:space="0" w:color="auto"/>
             </w:tcBorders>
-          </w:tcPr>
-          <w:p>
-            <w:pPr>
+            <w:tcMar>
+              <w:top w:w="100" w:type="dxa"/>
+              <w:bottom w:w="100" w:type="dxa"/>
+              <w:left w:w="150" w:type="dxa"/>
+              <w:right w:w="150" w:type="dxa"/>
+            </w:tcMar>
+          </w:tcPr>
+          <w:p>
+            <w:pPr>
+              <w:spacing w:after="40" w:before="40" w:line="240" w:lineRule="auto"/>
               <w:jc w:val="center"/>
               <w:rPr>
                 <w:szCs w:val="28"/>
@@ -4481,16 +5171,23 @@
         </w:tc>
         <w:tc>
           <w:tcPr>
-            <w:tcW w:w="5940" w:type="dxa"/>
+            <w:tcW w:w="5386" w:type="dxa"/>
             <w:tcBorders>
               <w:top w:val="single" w:sz="4" w:space="0" w:color="auto"/>
               <w:left w:val="single" w:sz="4" w:space="0" w:color="auto"/>
               <w:bottom w:val="single" w:sz="4" w:space="0" w:color="auto"/>
               <w:right w:val="single" w:sz="4" w:space="0" w:color="auto"/>
             </w:tcBorders>
-          </w:tcPr>
-          <w:p>
-            <w:pPr>
+            <w:tcMar>
+              <w:top w:w="100" w:type="dxa"/>
+              <w:bottom w:w="100" w:type="dxa"/>
+              <w:left w:w="150" w:type="dxa"/>
+              <w:right w:w="150" w:type="dxa"/>
+            </w:tcMar>
+          </w:tcPr>
+          <w:p>
+            <w:pPr>
+              <w:spacing w:after="40" w:before="40" w:line="240" w:lineRule="auto"/>
               <w:jc w:val="center"/>
               <w:rPr>
                 <w:szCs w:val="28"/>
@@ -4508,16 +5205,23 @@
         </w:tc>
         <w:tc>
           <w:tcPr>
-            <w:tcW w:w="3112" w:type="dxa"/>
+            <w:tcW w:w="1701" w:type="dxa"/>
             <w:tcBorders>
               <w:top w:val="single" w:sz="4" w:space="0" w:color="auto"/>
               <w:left w:val="single" w:sz="4" w:space="0" w:color="auto"/>
               <w:bottom w:val="single" w:sz="4" w:space="0" w:color="auto"/>
               <w:right w:val="single" w:sz="4" w:space="0" w:color="auto"/>
             </w:tcBorders>
-          </w:tcPr>
-          <w:p>
-            <w:pPr>
+            <w:tcMar>
+              <w:top w:w="100" w:type="dxa"/>
+              <w:bottom w:w="100" w:type="dxa"/>
+              <w:left w:w="150" w:type="dxa"/>
+              <w:right w:w="150" w:type="dxa"/>
+            </w:tcMar>
+          </w:tcPr>
+          <w:p>
+            <w:pPr>
+              <w:spacing w:after="40" w:before="40" w:line="240" w:lineRule="auto"/>
               <w:jc w:val="center"/>
               <w:rPr>
                 <w:szCs w:val="28"/>
@@ -4533,16 +5237,23 @@
         </w:trPr>
         <w:tc>
           <w:tcPr>
-            <w:tcW w:w="1256" w:type="dxa"/>
+            <w:tcW w:w="1134" w:type="dxa"/>
             <w:tcBorders>
               <w:top w:val="single" w:sz="4" w:space="0" w:color="auto"/>
               <w:left w:val="single" w:sz="4" w:space="0" w:color="auto"/>
               <w:bottom w:val="single" w:sz="4" w:space="0" w:color="auto"/>
               <w:right w:val="single" w:sz="4" w:space="0" w:color="auto"/>
             </w:tcBorders>
-          </w:tcPr>
-          <w:p>
-            <w:pPr>
+            <w:tcMar>
+              <w:top w:w="100" w:type="dxa"/>
+              <w:bottom w:w="100" w:type="dxa"/>
+              <w:left w:w="150" w:type="dxa"/>
+              <w:right w:w="150" w:type="dxa"/>
+            </w:tcMar>
+          </w:tcPr>
+          <w:p>
+            <w:pPr>
+              <w:spacing w:after="40" w:before="40" w:line="240" w:lineRule="auto"/>
               <w:jc w:val="center"/>
               <w:rPr>
                 <w:szCs w:val="28"/>
@@ -4560,19 +5271,26 @@
         </w:tc>
         <w:tc>
           <w:tcPr>
-            <w:tcW w:w="5940" w:type="dxa"/>
+            <w:tcW w:w="5386" w:type="dxa"/>
             <w:tcBorders>
               <w:top w:val="single" w:sz="4" w:space="0" w:color="auto"/>
               <w:left w:val="single" w:sz="4" w:space="0" w:color="auto"/>
               <w:bottom w:val="single" w:sz="4" w:space="0" w:color="auto"/>
               <w:right w:val="single" w:sz="4" w:space="0" w:color="auto"/>
             </w:tcBorders>
+            <w:tcMar>
+              <w:top w:w="100" w:type="dxa"/>
+              <w:bottom w:w="100" w:type="dxa"/>
+              <w:left w:w="150" w:type="dxa"/>
+              <w:right w:w="150" w:type="dxa"/>
+            </w:tcMar>
           </w:tcPr>
           <w:p>
             <w:pPr>
               <w:tabs>
                 <w:tab w:val="left" w:pos="1841"/>
               </w:tabs>
+              <w:spacing w:after="40" w:before="40" w:line="240" w:lineRule="auto"/>
               <w:jc w:val="center"/>
               <w:rPr>
                 <w:szCs w:val="28"/>
@@ -4590,16 +5308,23 @@
         </w:tc>
         <w:tc>
           <w:tcPr>
-            <w:tcW w:w="3112" w:type="dxa"/>
+            <w:tcW w:w="1701" w:type="dxa"/>
             <w:tcBorders>
               <w:top w:val="single" w:sz="4" w:space="0" w:color="auto"/>
               <w:left w:val="single" w:sz="4" w:space="0" w:color="auto"/>
               <w:bottom w:val="single" w:sz="4" w:space="0" w:color="auto"/>
               <w:right w:val="single" w:sz="4" w:space="0" w:color="auto"/>
             </w:tcBorders>
-          </w:tcPr>
-          <w:p>
-            <w:pPr>
+            <w:tcMar>
+              <w:top w:w="100" w:type="dxa"/>
+              <w:bottom w:w="100" w:type="dxa"/>
+              <w:left w:w="150" w:type="dxa"/>
+              <w:right w:w="150" w:type="dxa"/>
+            </w:tcMar>
+          </w:tcPr>
+          <w:p>
+            <w:pPr>
+              <w:spacing w:after="40" w:before="40" w:line="240" w:lineRule="auto"/>
               <w:jc w:val="center"/>
               <w:rPr>
                 <w:szCs w:val="28"/>
@@ -4615,16 +5340,23 @@
         </w:trPr>
         <w:tc>
           <w:tcPr>
-            <w:tcW w:w="1256" w:type="dxa"/>
+            <w:tcW w:w="1134" w:type="dxa"/>
             <w:tcBorders>
               <w:top w:val="single" w:sz="4" w:space="0" w:color="auto"/>
               <w:left w:val="single" w:sz="4" w:space="0" w:color="auto"/>
               <w:bottom w:val="single" w:sz="4" w:space="0" w:color="auto"/>
               <w:right w:val="single" w:sz="4" w:space="0" w:color="auto"/>
             </w:tcBorders>
-          </w:tcPr>
-          <w:p>
-            <w:pPr>
+            <w:tcMar>
+              <w:top w:w="100" w:type="dxa"/>
+              <w:bottom w:w="100" w:type="dxa"/>
+              <w:left w:w="150" w:type="dxa"/>
+              <w:right w:w="150" w:type="dxa"/>
+            </w:tcMar>
+          </w:tcPr>
+          <w:p>
+            <w:pPr>
+              <w:spacing w:after="40" w:before="40" w:line="240" w:lineRule="auto"/>
               <w:jc w:val="center"/>
               <w:rPr>
                 <w:szCs w:val="28"/>
@@ -4642,19 +5374,26 @@
         </w:tc>
         <w:tc>
           <w:tcPr>
-            <w:tcW w:w="5940" w:type="dxa"/>
+            <w:tcW w:w="5386" w:type="dxa"/>
             <w:tcBorders>
               <w:top w:val="single" w:sz="4" w:space="0" w:color="auto"/>
               <w:left w:val="single" w:sz="4" w:space="0" w:color="auto"/>
               <w:bottom w:val="single" w:sz="4" w:space="0" w:color="auto"/>
               <w:right w:val="single" w:sz="4" w:space="0" w:color="auto"/>
             </w:tcBorders>
+            <w:tcMar>
+              <w:top w:w="100" w:type="dxa"/>
+              <w:bottom w:w="100" w:type="dxa"/>
+              <w:left w:w="150" w:type="dxa"/>
+              <w:right w:w="150" w:type="dxa"/>
+            </w:tcMar>
           </w:tcPr>
           <w:p>
             <w:pPr>
               <w:tabs>
                 <w:tab w:val="left" w:pos="814"/>
               </w:tabs>
+              <w:spacing w:after="40" w:before="40" w:line="240" w:lineRule="auto"/>
               <w:jc w:val="center"/>
               <w:rPr>
                 <w:szCs w:val="28"/>
@@ -4679,16 +5418,23 @@
         </w:tc>
         <w:tc>
           <w:tcPr>
-            <w:tcW w:w="3112" w:type="dxa"/>
+            <w:tcW w:w="1701" w:type="dxa"/>
             <w:tcBorders>
               <w:top w:val="single" w:sz="4" w:space="0" w:color="auto"/>
               <w:left w:val="single" w:sz="4" w:space="0" w:color="auto"/>
               <w:bottom w:val="single" w:sz="4" w:space="0" w:color="auto"/>
               <w:right w:val="single" w:sz="4" w:space="0" w:color="auto"/>
             </w:tcBorders>
-          </w:tcPr>
-          <w:p>
-            <w:pPr>
+            <w:tcMar>
+              <w:top w:w="100" w:type="dxa"/>
+              <w:bottom w:w="100" w:type="dxa"/>
+              <w:left w:w="150" w:type="dxa"/>
+              <w:right w:w="150" w:type="dxa"/>
+            </w:tcMar>
+          </w:tcPr>
+          <w:p>
+            <w:pPr>
+              <w:spacing w:after="40" w:before="40" w:line="240" w:lineRule="auto"/>
               <w:jc w:val="center"/>
               <w:rPr>
                 <w:szCs w:val="28"/>
@@ -4704,16 +5450,23 @@
         </w:trPr>
         <w:tc>
           <w:tcPr>
-            <w:tcW w:w="1256" w:type="dxa"/>
+            <w:tcW w:w="1134" w:type="dxa"/>
             <w:tcBorders>
               <w:top w:val="single" w:sz="4" w:space="0" w:color="auto"/>
               <w:left w:val="single" w:sz="4" w:space="0" w:color="auto"/>
               <w:bottom w:val="single" w:sz="4" w:space="0" w:color="auto"/>
               <w:right w:val="single" w:sz="4" w:space="0" w:color="auto"/>
             </w:tcBorders>
-          </w:tcPr>
-          <w:p>
-            <w:pPr>
+            <w:tcMar>
+              <w:top w:w="100" w:type="dxa"/>
+              <w:bottom w:w="100" w:type="dxa"/>
+              <w:left w:w="150" w:type="dxa"/>
+              <w:right w:w="150" w:type="dxa"/>
+            </w:tcMar>
+          </w:tcPr>
+          <w:p>
+            <w:pPr>
+              <w:spacing w:after="40" w:before="40" w:line="240" w:lineRule="auto"/>
               <w:jc w:val="center"/>
               <w:rPr>
                 <w:szCs w:val="28"/>
@@ -4731,16 +5484,23 @@
         </w:tc>
         <w:tc>
           <w:tcPr>
-            <w:tcW w:w="5940" w:type="dxa"/>
+            <w:tcW w:w="5386" w:type="dxa"/>
             <w:tcBorders>
               <w:top w:val="single" w:sz="4" w:space="0" w:color="auto"/>
               <w:left w:val="single" w:sz="4" w:space="0" w:color="auto"/>
               <w:bottom w:val="single" w:sz="4" w:space="0" w:color="auto"/>
               <w:right w:val="single" w:sz="4" w:space="0" w:color="auto"/>
             </w:tcBorders>
-          </w:tcPr>
-          <w:p>
-            <w:pPr>
+            <w:tcMar>
+              <w:top w:w="100" w:type="dxa"/>
+              <w:bottom w:w="100" w:type="dxa"/>
+              <w:left w:w="150" w:type="dxa"/>
+              <w:right w:w="150" w:type="dxa"/>
+            </w:tcMar>
+          </w:tcPr>
+          <w:p>
+            <w:pPr>
+              <w:spacing w:after="40" w:before="40" w:line="240" w:lineRule="auto"/>
               <w:jc w:val="center"/>
               <w:rPr>
                 <w:szCs w:val="28"/>
@@ -4758,16 +5518,23 @@
         </w:tc>
         <w:tc>
           <w:tcPr>
-            <w:tcW w:w="3112" w:type="dxa"/>
+            <w:tcW w:w="1701" w:type="dxa"/>
             <w:tcBorders>
               <w:top w:val="single" w:sz="4" w:space="0" w:color="auto"/>
               <w:left w:val="single" w:sz="4" w:space="0" w:color="auto"/>
               <w:bottom w:val="single" w:sz="4" w:space="0" w:color="auto"/>
               <w:right w:val="single" w:sz="4" w:space="0" w:color="auto"/>
             </w:tcBorders>
-          </w:tcPr>
-          <w:p>
-            <w:pPr>
+            <w:tcMar>
+              <w:top w:w="100" w:type="dxa"/>
+              <w:bottom w:w="100" w:type="dxa"/>
+              <w:left w:w="150" w:type="dxa"/>
+              <w:right w:w="150" w:type="dxa"/>
+            </w:tcMar>
+          </w:tcPr>
+          <w:p>
+            <w:pPr>
+              <w:spacing w:after="40" w:before="40" w:line="240" w:lineRule="auto"/>
               <w:jc w:val="center"/>
               <w:rPr>
                 <w:szCs w:val="28"/>
@@ -4783,16 +5550,23 @@
         </w:trPr>
         <w:tc>
           <w:tcPr>
-            <w:tcW w:w="1256" w:type="dxa"/>
+            <w:tcW w:w="1134" w:type="dxa"/>
             <w:tcBorders>
               <w:top w:val="single" w:sz="4" w:space="0" w:color="auto"/>
               <w:left w:val="single" w:sz="4" w:space="0" w:color="auto"/>
               <w:bottom w:val="single" w:sz="4" w:space="0" w:color="auto"/>
               <w:right w:val="single" w:sz="4" w:space="0" w:color="auto"/>
             </w:tcBorders>
-          </w:tcPr>
-          <w:p>
-            <w:pPr>
+            <w:tcMar>
+              <w:top w:w="100" w:type="dxa"/>
+              <w:bottom w:w="100" w:type="dxa"/>
+              <w:left w:w="150" w:type="dxa"/>
+              <w:right w:w="150" w:type="dxa"/>
+            </w:tcMar>
+          </w:tcPr>
+          <w:p>
+            <w:pPr>
+              <w:spacing w:after="40" w:before="40" w:line="240" w:lineRule="auto"/>
               <w:jc w:val="center"/>
               <w:rPr>
                 <w:szCs w:val="28"/>
@@ -4810,19 +5584,26 @@
         </w:tc>
         <w:tc>
           <w:tcPr>
-            <w:tcW w:w="5940" w:type="dxa"/>
+            <w:tcW w:w="5386" w:type="dxa"/>
             <w:tcBorders>
               <w:top w:val="single" w:sz="4" w:space="0" w:color="auto"/>
               <w:left w:val="single" w:sz="4" w:space="0" w:color="auto"/>
               <w:bottom w:val="single" w:sz="4" w:space="0" w:color="auto"/>
               <w:right w:val="single" w:sz="4" w:space="0" w:color="auto"/>
             </w:tcBorders>
+            <w:tcMar>
+              <w:top w:w="100" w:type="dxa"/>
+              <w:bottom w:w="100" w:type="dxa"/>
+              <w:left w:w="150" w:type="dxa"/>
+              <w:right w:w="150" w:type="dxa"/>
+            </w:tcMar>
           </w:tcPr>
           <w:p>
             <w:pPr>
               <w:tabs>
                 <w:tab w:val="left" w:pos="225"/>
               </w:tabs>
+              <w:spacing w:after="40" w:before="40" w:line="240" w:lineRule="auto"/>
               <w:jc w:val="center"/>
               <w:rPr>
                 <w:szCs w:val="28"/>
@@ -4840,16 +5621,23 @@
         </w:tc>
         <w:tc>
           <w:tcPr>
-            <w:tcW w:w="3112" w:type="dxa"/>
+            <w:tcW w:w="1701" w:type="dxa"/>
             <w:tcBorders>
               <w:top w:val="single" w:sz="4" w:space="0" w:color="auto"/>
               <w:left w:val="single" w:sz="4" w:space="0" w:color="auto"/>
               <w:bottom w:val="single" w:sz="4" w:space="0" w:color="auto"/>
               <w:right w:val="single" w:sz="4" w:space="0" w:color="auto"/>
             </w:tcBorders>
-          </w:tcPr>
-          <w:p>
-            <w:pPr>
+            <w:tcMar>
+              <w:top w:w="100" w:type="dxa"/>
+              <w:bottom w:w="100" w:type="dxa"/>
+              <w:left w:w="150" w:type="dxa"/>
+              <w:right w:w="150" w:type="dxa"/>
+            </w:tcMar>
+          </w:tcPr>
+          <w:p>
+            <w:pPr>
+              <w:spacing w:after="40" w:before="40" w:line="240" w:lineRule="auto"/>
               <w:jc w:val="center"/>
               <w:rPr>
                 <w:szCs w:val="28"/>
@@ -4865,16 +5653,23 @@
         </w:trPr>
         <w:tc>
           <w:tcPr>
-            <w:tcW w:w="1256" w:type="dxa"/>
+            <w:tcW w:w="1134" w:type="dxa"/>
             <w:tcBorders>
               <w:top w:val="single" w:sz="4" w:space="0" w:color="auto"/>
               <w:left w:val="single" w:sz="4" w:space="0" w:color="auto"/>
               <w:bottom w:val="single" w:sz="4" w:space="0" w:color="auto"/>
               <w:right w:val="single" w:sz="4" w:space="0" w:color="auto"/>
             </w:tcBorders>
-          </w:tcPr>
-          <w:p>
-            <w:pPr>
+            <w:tcMar>
+              <w:top w:w="100" w:type="dxa"/>
+              <w:bottom w:w="100" w:type="dxa"/>
+              <w:left w:w="150" w:type="dxa"/>
+              <w:right w:w="150" w:type="dxa"/>
+            </w:tcMar>
+          </w:tcPr>
+          <w:p>
+            <w:pPr>
+              <w:spacing w:after="40" w:before="40" w:line="240" w:lineRule="auto"/>
               <w:jc w:val="center"/>
               <w:rPr>
                 <w:szCs w:val="28"/>
@@ -4892,16 +5687,23 @@
         </w:tc>
         <w:tc>
           <w:tcPr>
-            <w:tcW w:w="5940" w:type="dxa"/>
+            <w:tcW w:w="5386" w:type="dxa"/>
             <w:tcBorders>
               <w:top w:val="single" w:sz="4" w:space="0" w:color="auto"/>
               <w:left w:val="single" w:sz="4" w:space="0" w:color="auto"/>
               <w:bottom w:val="single" w:sz="4" w:space="0" w:color="auto"/>
               <w:right w:val="single" w:sz="4" w:space="0" w:color="auto"/>
             </w:tcBorders>
-          </w:tcPr>
-          <w:p>
-            <w:pPr>
+            <w:tcMar>
+              <w:top w:w="100" w:type="dxa"/>
+              <w:bottom w:w="100" w:type="dxa"/>
+              <w:left w:w="150" w:type="dxa"/>
+              <w:right w:w="150" w:type="dxa"/>
+            </w:tcMar>
+          </w:tcPr>
+          <w:p>
+            <w:pPr>
+              <w:spacing w:after="40" w:before="40" w:line="240" w:lineRule="auto"/>
               <w:jc w:val="center"/>
               <w:rPr>
                 <w:szCs w:val="28"/>
@@ -4919,16 +5721,23 @@
         </w:tc>
         <w:tc>
           <w:tcPr>
-            <w:tcW w:w="3112" w:type="dxa"/>
+            <w:tcW w:w="1701" w:type="dxa"/>
             <w:tcBorders>
               <w:top w:val="single" w:sz="4" w:space="0" w:color="auto"/>
               <w:left w:val="single" w:sz="4" w:space="0" w:color="auto"/>
               <w:bottom w:val="single" w:sz="4" w:space="0" w:color="auto"/>
               <w:right w:val="single" w:sz="4" w:space="0" w:color="auto"/>
             </w:tcBorders>
-          </w:tcPr>
-          <w:p>
-            <w:pPr>
+            <w:tcMar>
+              <w:top w:w="100" w:type="dxa"/>
+              <w:bottom w:w="100" w:type="dxa"/>
+              <w:left w:w="150" w:type="dxa"/>
+              <w:right w:w="150" w:type="dxa"/>
+            </w:tcMar>
+          </w:tcPr>
+          <w:p>
+            <w:pPr>
+              <w:spacing w:after="40" w:before="40" w:line="240" w:lineRule="auto"/>
               <w:jc w:val="center"/>
               <w:rPr>
                 <w:szCs w:val="28"/>
@@ -4944,16 +5753,23 @@
         </w:trPr>
         <w:tc>
           <w:tcPr>
-            <w:tcW w:w="1256" w:type="dxa"/>
+            <w:tcW w:w="1134" w:type="dxa"/>
             <w:tcBorders>
               <w:top w:val="single" w:sz="4" w:space="0" w:color="auto"/>
               <w:left w:val="single" w:sz="4" w:space="0" w:color="auto"/>
               <w:bottom w:val="single" w:sz="4" w:space="0" w:color="auto"/>
               <w:right w:val="single" w:sz="4" w:space="0" w:color="auto"/>
             </w:tcBorders>
-          </w:tcPr>
-          <w:p>
-            <w:pPr>
+            <w:tcMar>
+              <w:top w:w="100" w:type="dxa"/>
+              <w:bottom w:w="100" w:type="dxa"/>
+              <w:left w:w="150" w:type="dxa"/>
+              <w:right w:w="150" w:type="dxa"/>
+            </w:tcMar>
+          </w:tcPr>
+          <w:p>
+            <w:pPr>
+              <w:spacing w:after="40" w:before="40" w:line="240" w:lineRule="auto"/>
               <w:jc w:val="center"/>
               <w:rPr>
                 <w:szCs w:val="28"/>
@@ -4971,16 +5787,23 @@
         </w:tc>
         <w:tc>
           <w:tcPr>
-            <w:tcW w:w="5940" w:type="dxa"/>
+            <w:tcW w:w="5386" w:type="dxa"/>
             <w:tcBorders>
               <w:top w:val="single" w:sz="4" w:space="0" w:color="auto"/>
               <w:left w:val="single" w:sz="4" w:space="0" w:color="auto"/>
               <w:bottom w:val="single" w:sz="4" w:space="0" w:color="auto"/>
               <w:right w:val="single" w:sz="4" w:space="0" w:color="auto"/>
             </w:tcBorders>
-          </w:tcPr>
-          <w:p>
-            <w:pPr>
+            <w:tcMar>
+              <w:top w:w="100" w:type="dxa"/>
+              <w:bottom w:w="100" w:type="dxa"/>
+              <w:left w:w="150" w:type="dxa"/>
+              <w:right w:w="150" w:type="dxa"/>
+            </w:tcMar>
+          </w:tcPr>
+          <w:p>
+            <w:pPr>
+              <w:spacing w:after="40" w:before="40" w:line="240" w:lineRule="auto"/>
               <w:jc w:val="center"/>
               <w:rPr>
                 <w:szCs w:val="28"/>
@@ -4998,16 +5821,23 @@
         </w:tc>
         <w:tc>
           <w:tcPr>
-            <w:tcW w:w="3112" w:type="dxa"/>
+            <w:tcW w:w="1701" w:type="dxa"/>
             <w:tcBorders>
               <w:top w:val="single" w:sz="4" w:space="0" w:color="auto"/>
               <w:left w:val="single" w:sz="4" w:space="0" w:color="auto"/>
               <w:bottom w:val="single" w:sz="4" w:space="0" w:color="auto"/>
               <w:right w:val="single" w:sz="4" w:space="0" w:color="auto"/>
             </w:tcBorders>
-          </w:tcPr>
-          <w:p>
-            <w:pPr>
+            <w:tcMar>
+              <w:top w:w="100" w:type="dxa"/>
+              <w:bottom w:w="100" w:type="dxa"/>
+              <w:left w:w="150" w:type="dxa"/>
+              <w:right w:w="150" w:type="dxa"/>
+            </w:tcMar>
+          </w:tcPr>
+          <w:p>
+            <w:pPr>
+              <w:spacing w:after="40" w:before="40" w:line="240" w:lineRule="auto"/>
               <w:jc w:val="center"/>
               <w:rPr>
                 <w:szCs w:val="28"/>
@@ -5023,16 +5853,23 @@
         </w:trPr>
         <w:tc>
           <w:tcPr>
-            <w:tcW w:w="1256" w:type="dxa"/>
+            <w:tcW w:w="1134" w:type="dxa"/>
             <w:tcBorders>
               <w:top w:val="single" w:sz="4" w:space="0" w:color="auto"/>
               <w:left w:val="single" w:sz="4" w:space="0" w:color="auto"/>
               <w:bottom w:val="single" w:sz="4" w:space="0" w:color="auto"/>
               <w:right w:val="single" w:sz="4" w:space="0" w:color="auto"/>
             </w:tcBorders>
-          </w:tcPr>
-          <w:p>
-            <w:pPr>
+            <w:tcMar>
+              <w:top w:w="100" w:type="dxa"/>
+              <w:bottom w:w="100" w:type="dxa"/>
+              <w:left w:w="150" w:type="dxa"/>
+              <w:right w:w="150" w:type="dxa"/>
+            </w:tcMar>
+          </w:tcPr>
+          <w:p>
+            <w:pPr>
+              <w:spacing w:after="40" w:before="40" w:line="240" w:lineRule="auto"/>
               <w:jc w:val="center"/>
               <w:rPr>
                 <w:szCs w:val="28"/>
@@ -5050,16 +5887,23 @@
         </w:tc>
         <w:tc>
           <w:tcPr>
-            <w:tcW w:w="5940" w:type="dxa"/>
+            <w:tcW w:w="5386" w:type="dxa"/>
             <w:tcBorders>
               <w:top w:val="single" w:sz="4" w:space="0" w:color="auto"/>
               <w:left w:val="single" w:sz="4" w:space="0" w:color="auto"/>
               <w:bottom w:val="single" w:sz="4" w:space="0" w:color="auto"/>
               <w:right w:val="single" w:sz="4" w:space="0" w:color="auto"/>
             </w:tcBorders>
-          </w:tcPr>
-          <w:p>
-            <w:pPr>
+            <w:tcMar>
+              <w:top w:w="100" w:type="dxa"/>
+              <w:bottom w:w="100" w:type="dxa"/>
+              <w:left w:w="150" w:type="dxa"/>
+              <w:right w:w="150" w:type="dxa"/>
+            </w:tcMar>
+          </w:tcPr>
+          <w:p>
+            <w:pPr>
+              <w:spacing w:after="40" w:before="40" w:line="240" w:lineRule="auto"/>
               <w:jc w:val="center"/>
               <w:rPr>
                 <w:szCs w:val="28"/>
@@ -5077,16 +5921,23 @@
         </w:tc>
         <w:tc>
           <w:tcPr>
-            <w:tcW w:w="3112" w:type="dxa"/>
+            <w:tcW w:w="1701" w:type="dxa"/>
             <w:tcBorders>
               <w:top w:val="single" w:sz="4" w:space="0" w:color="auto"/>
               <w:left w:val="single" w:sz="4" w:space="0" w:color="auto"/>
               <w:bottom w:val="single" w:sz="4" w:space="0" w:color="auto"/>
               <w:right w:val="single" w:sz="4" w:space="0" w:color="auto"/>
             </w:tcBorders>
-          </w:tcPr>
-          <w:p>
-            <w:pPr>
+            <w:tcMar>
+              <w:top w:w="100" w:type="dxa"/>
+              <w:bottom w:w="100" w:type="dxa"/>
+              <w:left w:w="150" w:type="dxa"/>
+              <w:right w:w="150" w:type="dxa"/>
+            </w:tcMar>
+          </w:tcPr>
+          <w:p>
+            <w:pPr>
+              <w:spacing w:after="40" w:before="40" w:line="240" w:lineRule="auto"/>
               <w:jc w:val="center"/>
               <w:rPr>
                 <w:szCs w:val="28"/>
@@ -5117,6 +5968,8 @@
     </w:p>
     <w:p>
       <w:pPr>
+        <w:spacing w:line="276" w:lineRule="auto" w:after="120"/>
+        <w:ind w:firstLine="709"/>
         <w:jc w:val="both"/>
         <w:rPr>
           <w:szCs w:val="28"/>
@@ -5133,6 +5986,8 @@
     </w:p>
     <w:p>
       <w:pPr>
+        <w:spacing w:line="276" w:lineRule="auto" w:after="120"/>
+        <w:ind w:firstLine="709"/>
         <w:jc w:val="both"/>
         <w:rPr>
           <w:szCs w:val="28"/>
@@ -5149,6 +6004,8 @@
     </w:p>
     <w:p>
       <w:pPr>
+        <w:spacing w:line="276" w:lineRule="auto" w:after="120"/>
+        <w:ind w:firstLine="709"/>
         <w:jc w:val="both"/>
         <w:rPr>
           <w:szCs w:val="28"/>
@@ -5165,6 +6022,8 @@
     </w:p>
     <w:p>
       <w:pPr>
+        <w:spacing w:line="276" w:lineRule="auto" w:after="120"/>
+        <w:ind w:firstLine="709"/>
         <w:jc w:val="both"/>
         <w:rPr>
           <w:szCs w:val="28"/>
@@ -5181,6 +6040,8 @@
     </w:p>
     <w:p>
       <w:pPr>
+        <w:spacing w:line="276" w:lineRule="auto" w:after="120"/>
+        <w:ind w:firstLine="709"/>
         <w:jc w:val="both"/>
         <w:rPr>
           <w:szCs w:val="28"/>
@@ -5204,6 +6065,8 @@
     </w:p>
     <w:p>
       <w:pPr>
+        <w:spacing w:line="276" w:lineRule="auto" w:after="120"/>
+        <w:ind w:firstLine="709"/>
         <w:jc w:val="both"/>
         <w:rPr>
           <w:szCs w:val="28"/>
@@ -5220,6 +6083,8 @@
     </w:p>
     <w:p>
       <w:pPr>
+        <w:spacing w:line="276" w:lineRule="auto" w:after="120"/>
+        <w:ind w:firstLine="709"/>
         <w:jc w:val="both"/>
         <w:rPr>
           <w:szCs w:val="28"/>
@@ -5236,6 +6101,8 @@
     </w:p>
     <w:p>
       <w:pPr>
+        <w:spacing w:line="276" w:lineRule="auto" w:after="120"/>
+        <w:ind w:firstLine="709"/>
         <w:jc w:val="both"/>
         <w:rPr>
           <w:szCs w:val="28"/>
@@ -5259,6 +6126,8 @@
     </w:p>
     <w:p>
       <w:pPr>
+        <w:spacing w:line="276" w:lineRule="auto" w:after="120"/>
+        <w:ind w:firstLine="709"/>
         <w:jc w:val="both"/>
         <w:rPr>
           <w:szCs w:val="28"/>
@@ -5368,6 +6237,8 @@
     </w:p>
     <w:p>
       <w:pPr>
+        <w:spacing w:line="276" w:lineRule="auto" w:after="120"/>
+        <w:ind w:firstLine="709"/>
         <w:jc w:val="both"/>
         <w:rPr>
           <w:szCs w:val="28"/>

</xml_diff>

<commit_message>
Remove first-line indent from all paragraphs in both diary and report documents as requested
</commit_message>
<xml_diff>
--- a/Дневник-111 (1)айбота (1)22355.docx
+++ b/Дневник-111 (1)айбота (1)22355.docx
@@ -4,7 +4,7 @@
   <w:body>
     <w:p>
       <w:pPr>
-        <w:ind w:firstLine="709"/>
+        <w:ind/>
         <w:jc w:val="center"/>
         <w:rPr>
           <w:szCs w:val="28"/>
@@ -115,7 +115,7 @@
     </w:p>
     <w:p>
       <w:pPr>
-        <w:ind w:firstLine="709"/>
+        <w:ind/>
         <w:jc w:val="center"/>
         <w:rPr>
           <w:b/>
@@ -150,7 +150,7 @@
     </w:p>
     <w:p>
       <w:pPr>
-        <w:ind w:firstLine="709"/>
+        <w:ind/>
         <w:jc w:val="center"/>
         <w:rPr>
           <w:b/>
@@ -169,7 +169,7 @@
     </w:p>
     <w:p>
       <w:pPr>
-        <w:ind w:firstLine="709"/>
+        <w:ind/>
         <w:jc w:val="center"/>
         <w:rPr>
           <w:b/>
@@ -181,7 +181,7 @@
     <w:p>
       <w:pPr>
         <w:spacing w:line="276" w:lineRule="auto" w:after="120"/>
-        <w:ind w:firstLine="709"/>
+        <w:ind/>
         <w:jc w:val="both"/>
         <w:rPr>
           <w:szCs w:val="28"/>
@@ -249,7 +249,7 @@
     </w:p>
     <w:p>
       <w:pPr>
-        <w:ind w:firstLine="709"/>
+        <w:ind/>
         <w:rPr>
           <w:szCs w:val="28"/>
           <w:lang w:val="kk-KZ"/>
@@ -259,7 +259,7 @@
     <w:p>
       <w:pPr>
         <w:spacing w:line="276" w:lineRule="auto" w:after="120"/>
-        <w:ind w:firstLine="709"/>
+        <w:ind/>
         <w:rPr>
           <w:szCs w:val="28"/>
           <w:lang w:val="kk-KZ"/>
@@ -350,7 +350,7 @@
     <w:p>
       <w:pPr>
         <w:spacing w:line="276" w:lineRule="auto" w:after="120"/>
-        <w:ind w:firstLine="709"/>
+        <w:ind/>
         <w:rPr>
           <w:szCs w:val="28"/>
           <w:lang w:val="kk-KZ"/>
@@ -403,7 +403,7 @@
     <w:p>
       <w:pPr>
         <w:spacing w:line="276" w:lineRule="auto" w:after="120"/>
-        <w:ind w:left="3540" w:firstLine="709"/>
+        <w:ind w:left="3540"/>
         <w:jc w:val="both"/>
         <w:rPr>
           <w:rFonts w:eastAsia="Arial Unicode MS"/>
@@ -450,7 +450,7 @@
     <w:p>
       <w:pPr>
         <w:spacing w:line="276" w:lineRule="auto" w:after="120"/>
-        <w:ind w:firstLine="709"/>
+        <w:ind/>
         <w:rPr>
           <w:szCs w:val="28"/>
           <w:lang w:val="kk-KZ"/>
@@ -524,7 +524,7 @@
     <w:p>
       <w:pPr>
         <w:spacing w:line="276" w:lineRule="auto" w:after="120"/>
-        <w:ind w:firstLine="709"/>
+        <w:ind/>
         <w:rPr>
           <w:szCs w:val="28"/>
         </w:rPr>
@@ -758,7 +758,7 @@
     <w:p>
       <w:pPr>
         <w:spacing w:line="276" w:lineRule="auto" w:after="120"/>
-        <w:ind w:right="-284" w:firstLine="709"/>
+        <w:ind w:right="-284"/>
         <w:rPr>
           <w:rFonts w:eastAsia="Arial Unicode MS"/>
           <w:szCs w:val="28"/>
@@ -842,7 +842,7 @@
     <w:p>
       <w:pPr>
         <w:spacing w:line="276" w:lineRule="auto" w:after="120"/>
-        <w:ind w:right="-284" w:firstLine="709"/>
+        <w:ind w:right="-284"/>
         <w:rPr>
           <w:sz w:val="27"/>
           <w:szCs w:val="27"/>
@@ -893,7 +893,7 @@
     </w:p>
     <w:p>
       <w:pPr>
-        <w:ind w:firstLine="709"/>
+        <w:ind/>
         <w:jc w:val="center"/>
         <w:rPr>
           <w:szCs w:val="28"/>
@@ -906,7 +906,7 @@
         <w:tabs>
           <w:tab w:val="left" w:pos="3340"/>
         </w:tabs>
-        <w:ind w:firstLine="709"/>
+        <w:ind/>
         <w:jc w:val="center"/>
         <w:rPr>
           <w:szCs w:val="28"/>
@@ -916,7 +916,7 @@
     </w:p>
     <w:p>
       <w:pPr>
-        <w:ind w:firstLine="709"/>
+        <w:ind/>
         <w:jc w:val="center"/>
         <w:rPr>
           <w:szCs w:val="28"/>
@@ -926,7 +926,7 @@
     </w:p>
     <w:p>
       <w:pPr>
-        <w:ind w:firstLine="709"/>
+        <w:ind/>
         <w:jc w:val="center"/>
         <w:rPr>
           <w:szCs w:val="28"/>
@@ -936,7 +936,7 @@
     </w:p>
     <w:p>
       <w:pPr>
-        <w:ind w:firstLine="709"/>
+        <w:ind/>
         <w:jc w:val="center"/>
         <w:rPr>
           <w:szCs w:val="28"/>
@@ -946,7 +946,7 @@
     </w:p>
     <w:p>
       <w:pPr>
-        <w:ind w:firstLine="709"/>
+        <w:ind/>
         <w:jc w:val="center"/>
         <w:rPr>
           <w:szCs w:val="28"/>
@@ -956,7 +956,7 @@
     </w:p>
     <w:p>
       <w:pPr>
-        <w:ind w:firstLine="709"/>
+        <w:ind/>
         <w:jc w:val="center"/>
         <w:rPr>
           <w:szCs w:val="28"/>
@@ -966,7 +966,7 @@
     </w:p>
     <w:p>
       <w:pPr>
-        <w:ind w:firstLine="709"/>
+        <w:ind/>
         <w:jc w:val="center"/>
         <w:rPr>
           <w:szCs w:val="28"/>
@@ -976,7 +976,7 @@
     </w:p>
     <w:p>
       <w:pPr>
-        <w:ind w:firstLine="709"/>
+        <w:ind/>
         <w:jc w:val="center"/>
         <w:rPr>
           <w:szCs w:val="28"/>
@@ -986,7 +986,7 @@
     </w:p>
     <w:p>
       <w:pPr>
-        <w:ind w:firstLine="709"/>
+        <w:ind/>
         <w:jc w:val="center"/>
         <w:rPr>
           <w:szCs w:val="28"/>
@@ -1004,7 +1004,7 @@
     </w:p>
     <w:p>
       <w:pPr>
-        <w:ind w:firstLine="709"/>
+        <w:ind/>
         <w:jc w:val="center"/>
         <w:rPr>
           <w:szCs w:val="28"/>
@@ -1014,7 +1014,7 @@
     </w:p>
     <w:p>
       <w:pPr>
-        <w:ind w:firstLine="709"/>
+        <w:ind/>
         <w:jc w:val="center"/>
         <w:rPr>
           <w:szCs w:val="28"/>
@@ -1024,7 +1024,7 @@
     </w:p>
     <w:p>
       <w:pPr>
-        <w:ind w:firstLine="709"/>
+        <w:ind/>
         <w:jc w:val="center"/>
         <w:rPr>
           <w:szCs w:val="28"/>
@@ -1034,7 +1034,7 @@
     </w:p>
     <w:p>
       <w:pPr>
-        <w:ind w:firstLine="709"/>
+        <w:ind/>
         <w:jc w:val="center"/>
         <w:rPr>
           <w:szCs w:val="28"/>
@@ -1044,7 +1044,7 @@
     </w:p>
     <w:p>
       <w:pPr>
-        <w:ind w:firstLine="709"/>
+        <w:ind/>
         <w:jc w:val="center"/>
         <w:rPr>
           <w:szCs w:val="28"/>
@@ -1054,7 +1054,7 @@
     </w:p>
     <w:p>
       <w:pPr>
-        <w:ind w:firstLine="709"/>
+        <w:ind/>
         <w:jc w:val="center"/>
         <w:rPr>
           <w:szCs w:val="28"/>
@@ -1064,7 +1064,7 @@
     </w:p>
     <w:p>
       <w:pPr>
-        <w:ind w:firstLine="709"/>
+        <w:ind/>
         <w:jc w:val="center"/>
         <w:rPr>
           <w:szCs w:val="28"/>
@@ -1074,7 +1074,7 @@
     </w:p>
     <w:p>
       <w:pPr>
-        <w:ind w:firstLine="709"/>
+        <w:ind/>
         <w:jc w:val="center"/>
         <w:rPr>
           <w:szCs w:val="28"/>
@@ -1084,7 +1084,7 @@
     </w:p>
     <w:p>
       <w:pPr>
-        <w:ind w:firstLine="709"/>
+        <w:ind/>
         <w:jc w:val="center"/>
         <w:rPr>
           <w:szCs w:val="28"/>
@@ -1094,7 +1094,7 @@
     </w:p>
     <w:p>
       <w:pPr>
-        <w:ind w:firstLine="709"/>
+        <w:ind/>
         <w:jc w:val="center"/>
         <w:rPr>
           <w:szCs w:val="28"/>
@@ -1104,7 +1104,7 @@
     </w:p>
     <w:p>
       <w:pPr>
-        <w:ind w:firstLine="709"/>
+        <w:ind/>
         <w:jc w:val="center"/>
         <w:rPr>
           <w:szCs w:val="28"/>
@@ -1114,7 +1114,7 @@
     </w:p>
     <w:p>
       <w:pPr>
-        <w:ind w:firstLine="709"/>
+        <w:ind/>
         <w:jc w:val="center"/>
         <w:rPr>
           <w:szCs w:val="28"/>
@@ -1229,7 +1229,7 @@
     <w:p>
       <w:pPr>
         <w:spacing w:line="276" w:lineRule="auto" w:after="120"/>
-        <w:ind w:firstLine="709"/>
+        <w:ind/>
         <w:jc w:val="both"/>
         <w:rPr>
           <w:lang w:val="kk-KZ"/>
@@ -1295,7 +1295,7 @@
     <w:p>
       <w:pPr>
         <w:spacing w:line="276" w:lineRule="auto" w:after="120"/>
-        <w:ind w:firstLine="709"/>
+        <w:ind/>
         <w:jc w:val="both"/>
         <w:rPr>
           <w:u w:val="single"/>
@@ -1349,7 +1349,7 @@
     <w:p>
       <w:pPr>
         <w:spacing w:line="276" w:lineRule="auto" w:after="120"/>
-        <w:ind w:firstLine="709"/>
+        <w:ind/>
         <w:jc w:val="both"/>
         <w:rPr>
           <w:szCs w:val="28"/>
@@ -1392,7 +1392,7 @@
     <w:p>
       <w:pPr>
         <w:spacing w:line="276" w:lineRule="auto" w:after="120"/>
-        <w:ind w:firstLine="709"/>
+        <w:ind/>
         <w:jc w:val="both"/>
         <w:rPr>
           <w:szCs w:val="28"/>
@@ -1559,7 +1559,7 @@
     <w:p>
       <w:pPr>
         <w:spacing w:line="276" w:lineRule="auto" w:after="120"/>
-        <w:ind w:firstLine="709"/>
+        <w:ind/>
         <w:rPr>
           <w:sz w:val="27"/>
           <w:szCs w:val="27"/>
@@ -1623,7 +1623,7 @@
     <w:p>
       <w:pPr>
         <w:spacing w:line="276" w:lineRule="auto" w:after="120"/>
-        <w:ind w:firstLine="709"/>
+        <w:ind/>
         <w:jc w:val="both"/>
         <w:rPr>
           <w:szCs w:val="28"/>
@@ -1670,7 +1670,7 @@
     <w:p>
       <w:pPr>
         <w:spacing w:line="276" w:lineRule="auto" w:after="120"/>
-        <w:ind w:firstLine="709"/>
+        <w:ind/>
         <w:jc w:val="both"/>
         <w:rPr>
           <w:rFonts w:eastAsia="Arial Unicode MS"/>
@@ -1719,7 +1719,7 @@
     <w:p>
       <w:pPr>
         <w:spacing w:line="276" w:lineRule="auto" w:after="120"/>
-        <w:ind w:firstLine="709"/>
+        <w:ind/>
         <w:jc w:val="both"/>
         <w:rPr>
           <w:sz w:val="27"/>
@@ -1928,12 +1928,12 @@
       <w:tblPr>
         <w:tblStyle w:val="a3"/>
         <w:tblW w:w="10198" w:type="dxa"/>
-        <w:jc w:val="center"/>
         <w:tblCellMar>
           <w:left w:w="0" w:type="dxa"/>
           <w:right w:w="0" w:type="dxa"/>
         </w:tblCellMar>
         <w:tblLook w:val="04A0" w:firstRow="1" w:lastRow="0" w:firstColumn="1" w:lastColumn="0" w:noHBand="0" w:noVBand="1"/>
+        <w:jc w:val="center"/>
         <w:tblBorders>
           <w:top w:val="single" w:sz="4" w:space="0" w:color="000000"/>
           <w:left w:val="single" w:sz="4" w:space="0" w:color="000000"/>
@@ -1978,6 +1978,12 @@
               <w:left w:w="150" w:type="dxa"/>
               <w:right w:w="150" w:type="dxa"/>
             </w:tcMar>
+            <w:tcMar>
+              <w:top w:w="100" w:type="dxa"/>
+              <w:bottom w:w="100" w:type="dxa"/>
+              <w:left w:w="150" w:type="dxa"/>
+              <w:right w:w="150" w:type="dxa"/>
+            </w:tcMar>
           </w:tcPr>
           <w:p>
             <w:pPr>
@@ -2029,6 +2035,18 @@
               <w:left w:w="150" w:type="dxa"/>
               <w:right w:w="150" w:type="dxa"/>
             </w:tcMar>
+            <w:tcMar>
+              <w:top w:w="100" w:type="dxa"/>
+              <w:bottom w:w="100" w:type="dxa"/>
+              <w:left w:w="150" w:type="dxa"/>
+              <w:right w:w="150" w:type="dxa"/>
+            </w:tcMar>
+            <w:tcMar>
+              <w:top w:w="100" w:type="dxa"/>
+              <w:bottom w:w="100" w:type="dxa"/>
+              <w:left w:w="150" w:type="dxa"/>
+              <w:right w:w="150" w:type="dxa"/>
+            </w:tcMar>
           </w:tcPr>
           <w:p>
             <w:pPr>
@@ -2080,6 +2098,18 @@
               <w:left w:w="150" w:type="dxa"/>
               <w:right w:w="150" w:type="dxa"/>
             </w:tcMar>
+            <w:tcMar>
+              <w:top w:w="100" w:type="dxa"/>
+              <w:bottom w:w="100" w:type="dxa"/>
+              <w:left w:w="150" w:type="dxa"/>
+              <w:right w:w="150" w:type="dxa"/>
+            </w:tcMar>
+            <w:tcMar>
+              <w:top w:w="100" w:type="dxa"/>
+              <w:bottom w:w="100" w:type="dxa"/>
+              <w:left w:w="150" w:type="dxa"/>
+              <w:right w:w="150" w:type="dxa"/>
+            </w:tcMar>
           </w:tcPr>
           <w:p>
             <w:pPr>
@@ -2124,6 +2154,12 @@
               <w:left w:w="150" w:type="dxa"/>
               <w:right w:w="150" w:type="dxa"/>
             </w:tcMar>
+            <w:tcMar>
+              <w:top w:w="100" w:type="dxa"/>
+              <w:bottom w:w="100" w:type="dxa"/>
+              <w:left w:w="150" w:type="dxa"/>
+              <w:right w:w="150" w:type="dxa"/>
+            </w:tcMar>
           </w:tcPr>
           <w:p>
             <w:pPr>
@@ -2166,6 +2202,12 @@
               <w:right w:w="108" w:type="dxa"/>
             </w:tcMar>
             <w:hideMark/>
+            <w:tcMar>
+              <w:top w:w="100" w:type="dxa"/>
+              <w:bottom w:w="100" w:type="dxa"/>
+              <w:left w:w="150" w:type="dxa"/>
+              <w:right w:w="150" w:type="dxa"/>
+            </w:tcMar>
             <w:tcMar>
               <w:top w:w="100" w:type="dxa"/>
               <w:bottom w:w="100" w:type="dxa"/>
@@ -2220,6 +2262,18 @@
               <w:left w:w="150" w:type="dxa"/>
               <w:right w:w="150" w:type="dxa"/>
             </w:tcMar>
+            <w:tcMar>
+              <w:top w:w="100" w:type="dxa"/>
+              <w:bottom w:w="100" w:type="dxa"/>
+              <w:left w:w="150" w:type="dxa"/>
+              <w:right w:w="150" w:type="dxa"/>
+            </w:tcMar>
+            <w:tcMar>
+              <w:top w:w="100" w:type="dxa"/>
+              <w:bottom w:w="100" w:type="dxa"/>
+              <w:left w:w="150" w:type="dxa"/>
+              <w:right w:w="150" w:type="dxa"/>
+            </w:tcMar>
           </w:tcPr>
           <w:p>
             <w:pPr>
@@ -2268,6 +2322,18 @@
               <w:left w:w="150" w:type="dxa"/>
               <w:right w:w="150" w:type="dxa"/>
             </w:tcMar>
+            <w:tcMar>
+              <w:top w:w="100" w:type="dxa"/>
+              <w:bottom w:w="100" w:type="dxa"/>
+              <w:left w:w="150" w:type="dxa"/>
+              <w:right w:w="150" w:type="dxa"/>
+            </w:tcMar>
+            <w:tcMar>
+              <w:top w:w="100" w:type="dxa"/>
+              <w:bottom w:w="100" w:type="dxa"/>
+              <w:left w:w="150" w:type="dxa"/>
+              <w:right w:w="150" w:type="dxa"/>
+            </w:tcMar>
           </w:tcPr>
           <w:p>
             <w:pPr>
@@ -2309,6 +2375,12 @@
               <w:left w:w="150" w:type="dxa"/>
               <w:right w:w="150" w:type="dxa"/>
             </w:tcMar>
+            <w:tcMar>
+              <w:top w:w="100" w:type="dxa"/>
+              <w:bottom w:w="100" w:type="dxa"/>
+              <w:left w:w="150" w:type="dxa"/>
+              <w:right w:w="150" w:type="dxa"/>
+            </w:tcMar>
           </w:tcPr>
           <w:p>
             <w:pPr>
@@ -2349,6 +2421,12 @@
               <w:left w:w="108" w:type="dxa"/>
               <w:bottom w:w="0" w:type="dxa"/>
               <w:right w:w="108" w:type="dxa"/>
+            </w:tcMar>
+            <w:tcMar>
+              <w:top w:w="100" w:type="dxa"/>
+              <w:bottom w:w="100" w:type="dxa"/>
+              <w:left w:w="150" w:type="dxa"/>
+              <w:right w:w="150" w:type="dxa"/>
             </w:tcMar>
             <w:tcMar>
               <w:top w:w="100" w:type="dxa"/>
@@ -2397,6 +2475,18 @@
               <w:left w:w="150" w:type="dxa"/>
               <w:right w:w="150" w:type="dxa"/>
             </w:tcMar>
+            <w:tcMar>
+              <w:top w:w="100" w:type="dxa"/>
+              <w:bottom w:w="100" w:type="dxa"/>
+              <w:left w:w="150" w:type="dxa"/>
+              <w:right w:w="150" w:type="dxa"/>
+            </w:tcMar>
+            <w:tcMar>
+              <w:top w:w="100" w:type="dxa"/>
+              <w:bottom w:w="100" w:type="dxa"/>
+              <w:left w:w="150" w:type="dxa"/>
+              <w:right w:w="150" w:type="dxa"/>
+            </w:tcMar>
           </w:tcPr>
           <w:p>
             <w:pPr>
@@ -2445,6 +2535,18 @@
               <w:left w:w="150" w:type="dxa"/>
               <w:right w:w="150" w:type="dxa"/>
             </w:tcMar>
+            <w:tcMar>
+              <w:top w:w="100" w:type="dxa"/>
+              <w:bottom w:w="100" w:type="dxa"/>
+              <w:left w:w="150" w:type="dxa"/>
+              <w:right w:w="150" w:type="dxa"/>
+            </w:tcMar>
+            <w:tcMar>
+              <w:top w:w="100" w:type="dxa"/>
+              <w:bottom w:w="100" w:type="dxa"/>
+              <w:left w:w="150" w:type="dxa"/>
+              <w:right w:w="150" w:type="dxa"/>
+            </w:tcMar>
           </w:tcPr>
           <w:p>
             <w:pPr>
@@ -2492,6 +2594,18 @@
               <w:left w:w="150" w:type="dxa"/>
               <w:right w:w="150" w:type="dxa"/>
             </w:tcMar>
+            <w:tcMar>
+              <w:top w:w="100" w:type="dxa"/>
+              <w:bottom w:w="100" w:type="dxa"/>
+              <w:left w:w="150" w:type="dxa"/>
+              <w:right w:w="150" w:type="dxa"/>
+            </w:tcMar>
+            <w:tcMar>
+              <w:top w:w="100" w:type="dxa"/>
+              <w:bottom w:w="100" w:type="dxa"/>
+              <w:left w:w="150" w:type="dxa"/>
+              <w:right w:w="150" w:type="dxa"/>
+            </w:tcMar>
           </w:tcPr>
           <w:p>
             <w:pPr>
@@ -2543,6 +2657,12 @@
               <w:left w:w="108" w:type="dxa"/>
               <w:bottom w:w="0" w:type="dxa"/>
               <w:right w:w="108" w:type="dxa"/>
+            </w:tcMar>
+            <w:tcMar>
+              <w:top w:w="100" w:type="dxa"/>
+              <w:bottom w:w="100" w:type="dxa"/>
+              <w:left w:w="150" w:type="dxa"/>
+              <w:right w:w="150" w:type="dxa"/>
             </w:tcMar>
             <w:tcMar>
               <w:top w:w="100" w:type="dxa"/>
@@ -2591,6 +2711,18 @@
               <w:left w:w="150" w:type="dxa"/>
               <w:right w:w="150" w:type="dxa"/>
             </w:tcMar>
+            <w:tcMar>
+              <w:top w:w="100" w:type="dxa"/>
+              <w:bottom w:w="100" w:type="dxa"/>
+              <w:left w:w="150" w:type="dxa"/>
+              <w:right w:w="150" w:type="dxa"/>
+            </w:tcMar>
+            <w:tcMar>
+              <w:top w:w="100" w:type="dxa"/>
+              <w:bottom w:w="100" w:type="dxa"/>
+              <w:left w:w="150" w:type="dxa"/>
+              <w:right w:w="150" w:type="dxa"/>
+            </w:tcMar>
           </w:tcPr>
           <w:p>
             <w:pPr>
@@ -2639,6 +2771,18 @@
               <w:left w:w="150" w:type="dxa"/>
               <w:right w:w="150" w:type="dxa"/>
             </w:tcMar>
+            <w:tcMar>
+              <w:top w:w="100" w:type="dxa"/>
+              <w:bottom w:w="100" w:type="dxa"/>
+              <w:left w:w="150" w:type="dxa"/>
+              <w:right w:w="150" w:type="dxa"/>
+            </w:tcMar>
+            <w:tcMar>
+              <w:top w:w="100" w:type="dxa"/>
+              <w:bottom w:w="100" w:type="dxa"/>
+              <w:left w:w="150" w:type="dxa"/>
+              <w:right w:w="150" w:type="dxa"/>
+            </w:tcMar>
           </w:tcPr>
           <w:p>
             <w:pPr>
@@ -2705,6 +2849,12 @@
               <w:left w:w="108" w:type="dxa"/>
               <w:bottom w:w="0" w:type="dxa"/>
               <w:right w:w="108" w:type="dxa"/>
+            </w:tcMar>
+            <w:tcMar>
+              <w:top w:w="100" w:type="dxa"/>
+              <w:bottom w:w="100" w:type="dxa"/>
+              <w:left w:w="150" w:type="dxa"/>
+              <w:right w:w="150" w:type="dxa"/>
             </w:tcMar>
             <w:tcMar>
               <w:top w:w="100" w:type="dxa"/>
@@ -2753,6 +2903,18 @@
               <w:left w:w="150" w:type="dxa"/>
               <w:right w:w="150" w:type="dxa"/>
             </w:tcMar>
+            <w:tcMar>
+              <w:top w:w="100" w:type="dxa"/>
+              <w:bottom w:w="100" w:type="dxa"/>
+              <w:left w:w="150" w:type="dxa"/>
+              <w:right w:w="150" w:type="dxa"/>
+            </w:tcMar>
+            <w:tcMar>
+              <w:top w:w="100" w:type="dxa"/>
+              <w:bottom w:w="100" w:type="dxa"/>
+              <w:left w:w="150" w:type="dxa"/>
+              <w:right w:w="150" w:type="dxa"/>
+            </w:tcMar>
           </w:tcPr>
           <w:p>
             <w:pPr>
@@ -2801,6 +2963,18 @@
               <w:left w:w="150" w:type="dxa"/>
               <w:right w:w="150" w:type="dxa"/>
             </w:tcMar>
+            <w:tcMar>
+              <w:top w:w="100" w:type="dxa"/>
+              <w:bottom w:w="100" w:type="dxa"/>
+              <w:left w:w="150" w:type="dxa"/>
+              <w:right w:w="150" w:type="dxa"/>
+            </w:tcMar>
+            <w:tcMar>
+              <w:top w:w="100" w:type="dxa"/>
+              <w:bottom w:w="100" w:type="dxa"/>
+              <w:left w:w="150" w:type="dxa"/>
+              <w:right w:w="150" w:type="dxa"/>
+            </w:tcMar>
           </w:tcPr>
           <w:p>
             <w:pPr>
@@ -2842,6 +3016,12 @@
               <w:left w:w="150" w:type="dxa"/>
               <w:right w:w="150" w:type="dxa"/>
             </w:tcMar>
+            <w:tcMar>
+              <w:top w:w="100" w:type="dxa"/>
+              <w:bottom w:w="100" w:type="dxa"/>
+              <w:left w:w="150" w:type="dxa"/>
+              <w:right w:w="150" w:type="dxa"/>
+            </w:tcMar>
           </w:tcPr>
           <w:p>
             <w:pPr>
@@ -2893,6 +3073,12 @@
               <w:left w:w="108" w:type="dxa"/>
               <w:bottom w:w="0" w:type="dxa"/>
               <w:right w:w="108" w:type="dxa"/>
+            </w:tcMar>
+            <w:tcMar>
+              <w:top w:w="100" w:type="dxa"/>
+              <w:bottom w:w="100" w:type="dxa"/>
+              <w:left w:w="150" w:type="dxa"/>
+              <w:right w:w="150" w:type="dxa"/>
             </w:tcMar>
             <w:tcMar>
               <w:top w:w="100" w:type="dxa"/>
@@ -2941,6 +3127,18 @@
               <w:left w:w="150" w:type="dxa"/>
               <w:right w:w="150" w:type="dxa"/>
             </w:tcMar>
+            <w:tcMar>
+              <w:top w:w="100" w:type="dxa"/>
+              <w:bottom w:w="100" w:type="dxa"/>
+              <w:left w:w="150" w:type="dxa"/>
+              <w:right w:w="150" w:type="dxa"/>
+            </w:tcMar>
+            <w:tcMar>
+              <w:top w:w="100" w:type="dxa"/>
+              <w:bottom w:w="100" w:type="dxa"/>
+              <w:left w:w="150" w:type="dxa"/>
+              <w:right w:w="150" w:type="dxa"/>
+            </w:tcMar>
           </w:tcPr>
           <w:p>
             <w:pPr>
@@ -2989,6 +3187,18 @@
               <w:left w:w="150" w:type="dxa"/>
               <w:right w:w="150" w:type="dxa"/>
             </w:tcMar>
+            <w:tcMar>
+              <w:top w:w="100" w:type="dxa"/>
+              <w:bottom w:w="100" w:type="dxa"/>
+              <w:left w:w="150" w:type="dxa"/>
+              <w:right w:w="150" w:type="dxa"/>
+            </w:tcMar>
+            <w:tcMar>
+              <w:top w:w="100" w:type="dxa"/>
+              <w:bottom w:w="100" w:type="dxa"/>
+              <w:left w:w="150" w:type="dxa"/>
+              <w:right w:w="150" w:type="dxa"/>
+            </w:tcMar>
           </w:tcPr>
           <w:p>
             <w:pPr>
@@ -3030,6 +3240,12 @@
               <w:left w:w="150" w:type="dxa"/>
               <w:right w:w="150" w:type="dxa"/>
             </w:tcMar>
+            <w:tcMar>
+              <w:top w:w="100" w:type="dxa"/>
+              <w:bottom w:w="100" w:type="dxa"/>
+              <w:left w:w="150" w:type="dxa"/>
+              <w:right w:w="150" w:type="dxa"/>
+            </w:tcMar>
           </w:tcPr>
           <w:p>
             <w:pPr>
@@ -3071,6 +3287,12 @@
               <w:right w:w="108" w:type="dxa"/>
             </w:tcMar>
             <w:hideMark/>
+            <w:tcMar>
+              <w:top w:w="100" w:type="dxa"/>
+              <w:bottom w:w="100" w:type="dxa"/>
+              <w:left w:w="150" w:type="dxa"/>
+              <w:right w:w="150" w:type="dxa"/>
+            </w:tcMar>
             <w:tcMar>
               <w:top w:w="100" w:type="dxa"/>
               <w:bottom w:w="100" w:type="dxa"/>
@@ -3125,6 +3347,18 @@
               <w:left w:w="150" w:type="dxa"/>
               <w:right w:w="150" w:type="dxa"/>
             </w:tcMar>
+            <w:tcMar>
+              <w:top w:w="100" w:type="dxa"/>
+              <w:bottom w:w="100" w:type="dxa"/>
+              <w:left w:w="150" w:type="dxa"/>
+              <w:right w:w="150" w:type="dxa"/>
+            </w:tcMar>
+            <w:tcMar>
+              <w:top w:w="100" w:type="dxa"/>
+              <w:bottom w:w="100" w:type="dxa"/>
+              <w:left w:w="150" w:type="dxa"/>
+              <w:right w:w="150" w:type="dxa"/>
+            </w:tcMar>
           </w:tcPr>
           <w:p>
             <w:pPr>
@@ -3173,6 +3407,18 @@
               <w:left w:w="150" w:type="dxa"/>
               <w:right w:w="150" w:type="dxa"/>
             </w:tcMar>
+            <w:tcMar>
+              <w:top w:w="100" w:type="dxa"/>
+              <w:bottom w:w="100" w:type="dxa"/>
+              <w:left w:w="150" w:type="dxa"/>
+              <w:right w:w="150" w:type="dxa"/>
+            </w:tcMar>
+            <w:tcMar>
+              <w:top w:w="100" w:type="dxa"/>
+              <w:bottom w:w="100" w:type="dxa"/>
+              <w:left w:w="150" w:type="dxa"/>
+              <w:right w:w="150" w:type="dxa"/>
+            </w:tcMar>
           </w:tcPr>
           <w:p>
             <w:pPr>
@@ -3214,6 +3460,12 @@
               <w:left w:w="150" w:type="dxa"/>
               <w:right w:w="150" w:type="dxa"/>
             </w:tcMar>
+            <w:tcMar>
+              <w:top w:w="100" w:type="dxa"/>
+              <w:bottom w:w="100" w:type="dxa"/>
+              <w:left w:w="150" w:type="dxa"/>
+              <w:right w:w="150" w:type="dxa"/>
+            </w:tcMar>
           </w:tcPr>
           <w:p>
             <w:pPr>
@@ -3254,6 +3506,12 @@
               <w:left w:w="108" w:type="dxa"/>
               <w:bottom w:w="0" w:type="dxa"/>
               <w:right w:w="108" w:type="dxa"/>
+            </w:tcMar>
+            <w:tcMar>
+              <w:top w:w="100" w:type="dxa"/>
+              <w:bottom w:w="100" w:type="dxa"/>
+              <w:left w:w="150" w:type="dxa"/>
+              <w:right w:w="150" w:type="dxa"/>
             </w:tcMar>
             <w:tcMar>
               <w:top w:w="100" w:type="dxa"/>
@@ -3302,6 +3560,18 @@
               <w:left w:w="150" w:type="dxa"/>
               <w:right w:w="150" w:type="dxa"/>
             </w:tcMar>
+            <w:tcMar>
+              <w:top w:w="100" w:type="dxa"/>
+              <w:bottom w:w="100" w:type="dxa"/>
+              <w:left w:w="150" w:type="dxa"/>
+              <w:right w:w="150" w:type="dxa"/>
+            </w:tcMar>
+            <w:tcMar>
+              <w:top w:w="100" w:type="dxa"/>
+              <w:bottom w:w="100" w:type="dxa"/>
+              <w:left w:w="150" w:type="dxa"/>
+              <w:right w:w="150" w:type="dxa"/>
+            </w:tcMar>
           </w:tcPr>
           <w:p>
             <w:pPr>
@@ -3350,6 +3620,18 @@
               <w:left w:w="150" w:type="dxa"/>
               <w:right w:w="150" w:type="dxa"/>
             </w:tcMar>
+            <w:tcMar>
+              <w:top w:w="100" w:type="dxa"/>
+              <w:bottom w:w="100" w:type="dxa"/>
+              <w:left w:w="150" w:type="dxa"/>
+              <w:right w:w="150" w:type="dxa"/>
+            </w:tcMar>
+            <w:tcMar>
+              <w:top w:w="100" w:type="dxa"/>
+              <w:bottom w:w="100" w:type="dxa"/>
+              <w:left w:w="150" w:type="dxa"/>
+              <w:right w:w="150" w:type="dxa"/>
+            </w:tcMar>
           </w:tcPr>
           <w:p>
             <w:pPr>
@@ -3391,6 +3673,12 @@
               <w:left w:w="150" w:type="dxa"/>
               <w:right w:w="150" w:type="dxa"/>
             </w:tcMar>
+            <w:tcMar>
+              <w:top w:w="100" w:type="dxa"/>
+              <w:bottom w:w="100" w:type="dxa"/>
+              <w:left w:w="150" w:type="dxa"/>
+              <w:right w:w="150" w:type="dxa"/>
+            </w:tcMar>
           </w:tcPr>
           <w:p>
             <w:pPr>
@@ -3431,6 +3719,12 @@
               <w:left w:w="108" w:type="dxa"/>
               <w:bottom w:w="0" w:type="dxa"/>
               <w:right w:w="108" w:type="dxa"/>
+            </w:tcMar>
+            <w:tcMar>
+              <w:top w:w="100" w:type="dxa"/>
+              <w:bottom w:w="100" w:type="dxa"/>
+              <w:left w:w="150" w:type="dxa"/>
+              <w:right w:w="150" w:type="dxa"/>
             </w:tcMar>
             <w:tcMar>
               <w:top w:w="100" w:type="dxa"/>
@@ -3479,6 +3773,18 @@
               <w:left w:w="150" w:type="dxa"/>
               <w:right w:w="150" w:type="dxa"/>
             </w:tcMar>
+            <w:tcMar>
+              <w:top w:w="100" w:type="dxa"/>
+              <w:bottom w:w="100" w:type="dxa"/>
+              <w:left w:w="150" w:type="dxa"/>
+              <w:right w:w="150" w:type="dxa"/>
+            </w:tcMar>
+            <w:tcMar>
+              <w:top w:w="100" w:type="dxa"/>
+              <w:bottom w:w="100" w:type="dxa"/>
+              <w:left w:w="150" w:type="dxa"/>
+              <w:right w:w="150" w:type="dxa"/>
+            </w:tcMar>
           </w:tcPr>
           <w:p>
             <w:pPr>
@@ -3527,6 +3833,18 @@
               <w:left w:w="150" w:type="dxa"/>
               <w:right w:w="150" w:type="dxa"/>
             </w:tcMar>
+            <w:tcMar>
+              <w:top w:w="100" w:type="dxa"/>
+              <w:bottom w:w="100" w:type="dxa"/>
+              <w:left w:w="150" w:type="dxa"/>
+              <w:right w:w="150" w:type="dxa"/>
+            </w:tcMar>
+            <w:tcMar>
+              <w:top w:w="100" w:type="dxa"/>
+              <w:bottom w:w="100" w:type="dxa"/>
+              <w:left w:w="150" w:type="dxa"/>
+              <w:right w:w="150" w:type="dxa"/>
+            </w:tcMar>
           </w:tcPr>
           <w:p>
             <w:pPr>
@@ -3568,6 +3886,12 @@
               <w:left w:w="150" w:type="dxa"/>
               <w:right w:w="150" w:type="dxa"/>
             </w:tcMar>
+            <w:tcMar>
+              <w:top w:w="100" w:type="dxa"/>
+              <w:bottom w:w="100" w:type="dxa"/>
+              <w:left w:w="150" w:type="dxa"/>
+              <w:right w:w="150" w:type="dxa"/>
+            </w:tcMar>
           </w:tcPr>
           <w:p>
             <w:pPr>
@@ -3607,6 +3931,12 @@
               <w:left w:w="108" w:type="dxa"/>
               <w:bottom w:w="0" w:type="dxa"/>
               <w:right w:w="108" w:type="dxa"/>
+            </w:tcMar>
+            <w:tcMar>
+              <w:top w:w="100" w:type="dxa"/>
+              <w:bottom w:w="100" w:type="dxa"/>
+              <w:left w:w="150" w:type="dxa"/>
+              <w:right w:w="150" w:type="dxa"/>
             </w:tcMar>
             <w:tcMar>
               <w:top w:w="100" w:type="dxa"/>
@@ -3654,6 +3984,18 @@
               <w:left w:w="150" w:type="dxa"/>
               <w:right w:w="150" w:type="dxa"/>
             </w:tcMar>
+            <w:tcMar>
+              <w:top w:w="100" w:type="dxa"/>
+              <w:bottom w:w="100" w:type="dxa"/>
+              <w:left w:w="150" w:type="dxa"/>
+              <w:right w:w="150" w:type="dxa"/>
+            </w:tcMar>
+            <w:tcMar>
+              <w:top w:w="100" w:type="dxa"/>
+              <w:bottom w:w="100" w:type="dxa"/>
+              <w:left w:w="150" w:type="dxa"/>
+              <w:right w:w="150" w:type="dxa"/>
+            </w:tcMar>
           </w:tcPr>
           <w:p>
             <w:pPr>
@@ -3701,6 +4043,18 @@
               <w:left w:w="150" w:type="dxa"/>
               <w:right w:w="150" w:type="dxa"/>
             </w:tcMar>
+            <w:tcMar>
+              <w:top w:w="100" w:type="dxa"/>
+              <w:bottom w:w="100" w:type="dxa"/>
+              <w:left w:w="150" w:type="dxa"/>
+              <w:right w:w="150" w:type="dxa"/>
+            </w:tcMar>
+            <w:tcMar>
+              <w:top w:w="100" w:type="dxa"/>
+              <w:bottom w:w="100" w:type="dxa"/>
+              <w:left w:w="150" w:type="dxa"/>
+              <w:right w:w="150" w:type="dxa"/>
+            </w:tcMar>
           </w:tcPr>
           <w:p>
             <w:pPr>
@@ -3740,6 +4094,12 @@
               <w:left w:w="150" w:type="dxa"/>
               <w:right w:w="150" w:type="dxa"/>
             </w:tcMar>
+            <w:tcMar>
+              <w:top w:w="100" w:type="dxa"/>
+              <w:bottom w:w="100" w:type="dxa"/>
+              <w:left w:w="150" w:type="dxa"/>
+              <w:right w:w="150" w:type="dxa"/>
+            </w:tcMar>
           </w:tcPr>
           <w:p>
             <w:pPr>
@@ -3780,6 +4140,12 @@
               <w:left w:w="108" w:type="dxa"/>
               <w:bottom w:w="0" w:type="dxa"/>
               <w:right w:w="108" w:type="dxa"/>
+            </w:tcMar>
+            <w:tcMar>
+              <w:top w:w="100" w:type="dxa"/>
+              <w:bottom w:w="100" w:type="dxa"/>
+              <w:left w:w="150" w:type="dxa"/>
+              <w:right w:w="150" w:type="dxa"/>
             </w:tcMar>
             <w:tcMar>
               <w:top w:w="100" w:type="dxa"/>
@@ -3827,6 +4193,18 @@
               <w:left w:w="150" w:type="dxa"/>
               <w:right w:w="150" w:type="dxa"/>
             </w:tcMar>
+            <w:tcMar>
+              <w:top w:w="100" w:type="dxa"/>
+              <w:bottom w:w="100" w:type="dxa"/>
+              <w:left w:w="150" w:type="dxa"/>
+              <w:right w:w="150" w:type="dxa"/>
+            </w:tcMar>
+            <w:tcMar>
+              <w:top w:w="100" w:type="dxa"/>
+              <w:bottom w:w="100" w:type="dxa"/>
+              <w:left w:w="150" w:type="dxa"/>
+              <w:right w:w="150" w:type="dxa"/>
+            </w:tcMar>
           </w:tcPr>
           <w:p>
             <w:pPr>
@@ -3874,6 +4252,18 @@
               <w:left w:w="150" w:type="dxa"/>
               <w:right w:w="150" w:type="dxa"/>
             </w:tcMar>
+            <w:tcMar>
+              <w:top w:w="100" w:type="dxa"/>
+              <w:bottom w:w="100" w:type="dxa"/>
+              <w:left w:w="150" w:type="dxa"/>
+              <w:right w:w="150" w:type="dxa"/>
+            </w:tcMar>
+            <w:tcMar>
+              <w:top w:w="100" w:type="dxa"/>
+              <w:bottom w:w="100" w:type="dxa"/>
+              <w:left w:w="150" w:type="dxa"/>
+              <w:right w:w="150" w:type="dxa"/>
+            </w:tcMar>
           </w:tcPr>
           <w:p>
             <w:pPr>
@@ -3914,6 +4304,12 @@
               <w:left w:w="150" w:type="dxa"/>
               <w:right w:w="150" w:type="dxa"/>
             </w:tcMar>
+            <w:tcMar>
+              <w:top w:w="100" w:type="dxa"/>
+              <w:bottom w:w="100" w:type="dxa"/>
+              <w:left w:w="150" w:type="dxa"/>
+              <w:right w:w="150" w:type="dxa"/>
+            </w:tcMar>
           </w:tcPr>
           <w:p>
             <w:pPr>
@@ -3958,6 +4354,18 @@
               <w:left w:w="150" w:type="dxa"/>
               <w:right w:w="150" w:type="dxa"/>
             </w:tcMar>
+            <w:tcMar>
+              <w:top w:w="100" w:type="dxa"/>
+              <w:bottom w:w="100" w:type="dxa"/>
+              <w:left w:w="150" w:type="dxa"/>
+              <w:right w:w="150" w:type="dxa"/>
+            </w:tcMar>
+            <w:tcMar>
+              <w:top w:w="100" w:type="dxa"/>
+              <w:bottom w:w="100" w:type="dxa"/>
+              <w:left w:w="150" w:type="dxa"/>
+              <w:right w:w="150" w:type="dxa"/>
+            </w:tcMar>
           </w:tcPr>
           <w:p>
             <w:pPr>
@@ -3974,6 +4382,18 @@
           <w:tcPr>
             <w:tcW w:w="5102" w:type="dxa"/>
             <w:gridSpan w:val="2"/>
+            <w:tcMar>
+              <w:top w:w="100" w:type="dxa"/>
+              <w:bottom w:w="100" w:type="dxa"/>
+              <w:left w:w="150" w:type="dxa"/>
+              <w:right w:w="150" w:type="dxa"/>
+            </w:tcMar>
+            <w:tcMar>
+              <w:top w:w="100" w:type="dxa"/>
+              <w:bottom w:w="100" w:type="dxa"/>
+              <w:left w:w="150" w:type="dxa"/>
+              <w:right w:w="150" w:type="dxa"/>
+            </w:tcMar>
             <w:tcMar>
               <w:top w:w="100" w:type="dxa"/>
               <w:bottom w:w="100" w:type="dxa"/>
@@ -4022,6 +4442,18 @@
               <w:left w:w="150" w:type="dxa"/>
               <w:right w:w="150" w:type="dxa"/>
             </w:tcMar>
+            <w:tcMar>
+              <w:top w:w="100" w:type="dxa"/>
+              <w:bottom w:w="100" w:type="dxa"/>
+              <w:left w:w="150" w:type="dxa"/>
+              <w:right w:w="150" w:type="dxa"/>
+            </w:tcMar>
+            <w:tcMar>
+              <w:top w:w="100" w:type="dxa"/>
+              <w:bottom w:w="100" w:type="dxa"/>
+              <w:left w:w="150" w:type="dxa"/>
+              <w:right w:w="150" w:type="dxa"/>
+            </w:tcMar>
           </w:tcPr>
           <w:p>
             <w:pPr>
@@ -4038,6 +4470,18 @@
           <w:tcPr>
             <w:tcW w:w="5102" w:type="dxa"/>
             <w:gridSpan w:val="2"/>
+            <w:tcMar>
+              <w:top w:w="100" w:type="dxa"/>
+              <w:bottom w:w="100" w:type="dxa"/>
+              <w:left w:w="150" w:type="dxa"/>
+              <w:right w:w="150" w:type="dxa"/>
+            </w:tcMar>
+            <w:tcMar>
+              <w:top w:w="100" w:type="dxa"/>
+              <w:bottom w:w="100" w:type="dxa"/>
+              <w:left w:w="150" w:type="dxa"/>
+              <w:right w:w="150" w:type="dxa"/>
+            </w:tcMar>
             <w:tcMar>
               <w:top w:w="100" w:type="dxa"/>
               <w:bottom w:w="100" w:type="dxa"/>
@@ -4095,6 +4539,12 @@
               <w:left w:w="150" w:type="dxa"/>
               <w:right w:w="150" w:type="dxa"/>
             </w:tcMar>
+            <w:tcMar>
+              <w:top w:w="100" w:type="dxa"/>
+              <w:bottom w:w="100" w:type="dxa"/>
+              <w:left w:w="150" w:type="dxa"/>
+              <w:right w:w="150" w:type="dxa"/>
+            </w:tcMar>
           </w:tcPr>
           <w:p>
             <w:pPr>
@@ -4135,6 +4585,12 @@
           <w:tcPr>
             <w:tcW w:w="3096" w:type="dxa"/>
             <w:vAlign w:val="center"/>
+            <w:tcMar>
+              <w:top w:w="100" w:type="dxa"/>
+              <w:bottom w:w="100" w:type="dxa"/>
+              <w:left w:w="150" w:type="dxa"/>
+              <w:right w:w="150" w:type="dxa"/>
+            </w:tcMar>
             <w:tcMar>
               <w:top w:w="100" w:type="dxa"/>
               <w:bottom w:w="100" w:type="dxa"/>
@@ -4230,6 +4686,12 @@
               <w:left w:w="150" w:type="dxa"/>
               <w:right w:w="150" w:type="dxa"/>
             </w:tcMar>
+            <w:tcMar>
+              <w:top w:w="100" w:type="dxa"/>
+              <w:bottom w:w="100" w:type="dxa"/>
+              <w:left w:w="150" w:type="dxa"/>
+              <w:right w:w="150" w:type="dxa"/>
+            </w:tcMar>
           </w:tcPr>
           <w:p>
             <w:pPr>
@@ -4381,6 +4843,12 @@
               <w:left w:w="150" w:type="dxa"/>
               <w:right w:w="150" w:type="dxa"/>
             </w:tcMar>
+            <w:tcMar>
+              <w:top w:w="100" w:type="dxa"/>
+              <w:bottom w:w="100" w:type="dxa"/>
+              <w:left w:w="150" w:type="dxa"/>
+              <w:right w:w="150" w:type="dxa"/>
+            </w:tcMar>
           </w:tcPr>
           <w:p>
             <w:pPr>
@@ -4403,6 +4871,12 @@
           <w:tcPr>
             <w:tcW w:w="3096" w:type="dxa"/>
             <w:vAlign w:val="center"/>
+            <w:tcMar>
+              <w:top w:w="100" w:type="dxa"/>
+              <w:bottom w:w="100" w:type="dxa"/>
+              <w:left w:w="150" w:type="dxa"/>
+              <w:right w:w="150" w:type="dxa"/>
+            </w:tcMar>
             <w:tcMar>
               <w:top w:w="100" w:type="dxa"/>
               <w:bottom w:w="100" w:type="dxa"/>
@@ -4477,6 +4951,12 @@
               <w:left w:w="150" w:type="dxa"/>
               <w:right w:w="150" w:type="dxa"/>
             </w:tcMar>
+            <w:tcMar>
+              <w:top w:w="100" w:type="dxa"/>
+              <w:bottom w:w="100" w:type="dxa"/>
+              <w:left w:w="150" w:type="dxa"/>
+              <w:right w:w="150" w:type="dxa"/>
+            </w:tcMar>
           </w:tcPr>
           <w:p>
             <w:pPr>
@@ -4599,6 +5079,12 @@
               <w:left w:w="150" w:type="dxa"/>
               <w:right w:w="150" w:type="dxa"/>
             </w:tcMar>
+            <w:tcMar>
+              <w:top w:w="100" w:type="dxa"/>
+              <w:bottom w:w="100" w:type="dxa"/>
+              <w:left w:w="150" w:type="dxa"/>
+              <w:right w:w="150" w:type="dxa"/>
+            </w:tcMar>
           </w:tcPr>
           <w:p>
             <w:pPr>
@@ -4755,6 +5241,12 @@
               <w:left w:w="150" w:type="dxa"/>
               <w:right w:w="150" w:type="dxa"/>
             </w:tcMar>
+            <w:tcMar>
+              <w:top w:w="100" w:type="dxa"/>
+              <w:bottom w:w="100" w:type="dxa"/>
+              <w:left w:w="150" w:type="dxa"/>
+              <w:right w:w="150" w:type="dxa"/>
+            </w:tcMar>
           </w:tcPr>
           <w:p>
             <w:pPr>
@@ -4771,6 +5263,12 @@
           <w:tcPr>
             <w:tcW w:w="3531" w:type="dxa"/>
             <w:vAlign w:val="center"/>
+            <w:tcMar>
+              <w:top w:w="100" w:type="dxa"/>
+              <w:bottom w:w="100" w:type="dxa"/>
+              <w:left w:w="150" w:type="dxa"/>
+              <w:right w:w="150" w:type="dxa"/>
+            </w:tcMar>
             <w:tcMar>
               <w:top w:w="100" w:type="dxa"/>
               <w:bottom w:w="100" w:type="dxa"/>
@@ -4832,6 +5330,12 @@
               <w:left w:w="150" w:type="dxa"/>
               <w:right w:w="150" w:type="dxa"/>
             </w:tcMar>
+            <w:tcMar>
+              <w:top w:w="100" w:type="dxa"/>
+              <w:bottom w:w="100" w:type="dxa"/>
+              <w:left w:w="150" w:type="dxa"/>
+              <w:right w:w="150" w:type="dxa"/>
+            </w:tcMar>
           </w:tcPr>
           <w:p>
             <w:pPr>
@@ -4875,6 +5379,12 @@
               <w:left w:w="150" w:type="dxa"/>
               <w:right w:w="150" w:type="dxa"/>
             </w:tcMar>
+            <w:tcMar>
+              <w:top w:w="100" w:type="dxa"/>
+              <w:bottom w:w="100" w:type="dxa"/>
+              <w:left w:w="150" w:type="dxa"/>
+              <w:right w:w="150" w:type="dxa"/>
+            </w:tcMar>
           </w:tcPr>
           <w:p>
             <w:pPr>
@@ -4911,6 +5421,12 @@
               <w:left w:w="150" w:type="dxa"/>
               <w:right w:w="150" w:type="dxa"/>
             </w:tcMar>
+            <w:tcMar>
+              <w:top w:w="100" w:type="dxa"/>
+              <w:bottom w:w="100" w:type="dxa"/>
+              <w:left w:w="150" w:type="dxa"/>
+              <w:right w:w="150" w:type="dxa"/>
+            </w:tcMar>
           </w:tcPr>
           <w:p>
             <w:pPr>
@@ -4950,6 +5466,12 @@
               <w:left w:w="150" w:type="dxa"/>
               <w:right w:w="150" w:type="dxa"/>
             </w:tcMar>
+            <w:tcMar>
+              <w:top w:w="100" w:type="dxa"/>
+              <w:bottom w:w="100" w:type="dxa"/>
+              <w:left w:w="150" w:type="dxa"/>
+              <w:right w:w="150" w:type="dxa"/>
+            </w:tcMar>
           </w:tcPr>
           <w:p>
             <w:pPr>
@@ -4984,6 +5506,12 @@
               <w:left w:w="150" w:type="dxa"/>
               <w:right w:w="150" w:type="dxa"/>
             </w:tcMar>
+            <w:tcMar>
+              <w:top w:w="100" w:type="dxa"/>
+              <w:bottom w:w="100" w:type="dxa"/>
+              <w:left w:w="150" w:type="dxa"/>
+              <w:right w:w="150" w:type="dxa"/>
+            </w:tcMar>
           </w:tcPr>
           <w:p>
             <w:pPr>
@@ -5018,6 +5546,12 @@
               <w:left w:w="150" w:type="dxa"/>
               <w:right w:w="150" w:type="dxa"/>
             </w:tcMar>
+            <w:tcMar>
+              <w:top w:w="100" w:type="dxa"/>
+              <w:bottom w:w="100" w:type="dxa"/>
+              <w:left w:w="150" w:type="dxa"/>
+              <w:right w:w="150" w:type="dxa"/>
+            </w:tcMar>
           </w:tcPr>
           <w:p>
             <w:pPr>
@@ -5050,6 +5584,12 @@
               <w:left w:w="150" w:type="dxa"/>
               <w:right w:w="150" w:type="dxa"/>
             </w:tcMar>
+            <w:tcMar>
+              <w:top w:w="100" w:type="dxa"/>
+              <w:bottom w:w="100" w:type="dxa"/>
+              <w:left w:w="150" w:type="dxa"/>
+              <w:right w:w="150" w:type="dxa"/>
+            </w:tcMar>
           </w:tcPr>
           <w:p>
             <w:pPr>
@@ -5084,6 +5624,12 @@
               <w:left w:w="150" w:type="dxa"/>
               <w:right w:w="150" w:type="dxa"/>
             </w:tcMar>
+            <w:tcMar>
+              <w:top w:w="100" w:type="dxa"/>
+              <w:bottom w:w="100" w:type="dxa"/>
+              <w:left w:w="150" w:type="dxa"/>
+              <w:right w:w="150" w:type="dxa"/>
+            </w:tcMar>
           </w:tcPr>
           <w:p>
             <w:pPr>
@@ -5118,6 +5664,12 @@
               <w:left w:w="150" w:type="dxa"/>
               <w:right w:w="150" w:type="dxa"/>
             </w:tcMar>
+            <w:tcMar>
+              <w:top w:w="100" w:type="dxa"/>
+              <w:bottom w:w="100" w:type="dxa"/>
+              <w:left w:w="150" w:type="dxa"/>
+              <w:right w:w="150" w:type="dxa"/>
+            </w:tcMar>
           </w:tcPr>
           <w:p>
             <w:pPr>
@@ -5150,6 +5702,12 @@
               <w:left w:w="150" w:type="dxa"/>
               <w:right w:w="150" w:type="dxa"/>
             </w:tcMar>
+            <w:tcMar>
+              <w:top w:w="100" w:type="dxa"/>
+              <w:bottom w:w="100" w:type="dxa"/>
+              <w:left w:w="150" w:type="dxa"/>
+              <w:right w:w="150" w:type="dxa"/>
+            </w:tcMar>
           </w:tcPr>
           <w:p>
             <w:pPr>
@@ -5184,6 +5742,12 @@
               <w:left w:w="150" w:type="dxa"/>
               <w:right w:w="150" w:type="dxa"/>
             </w:tcMar>
+            <w:tcMar>
+              <w:top w:w="100" w:type="dxa"/>
+              <w:bottom w:w="100" w:type="dxa"/>
+              <w:left w:w="150" w:type="dxa"/>
+              <w:right w:w="150" w:type="dxa"/>
+            </w:tcMar>
           </w:tcPr>
           <w:p>
             <w:pPr>
@@ -5218,6 +5782,12 @@
               <w:left w:w="150" w:type="dxa"/>
               <w:right w:w="150" w:type="dxa"/>
             </w:tcMar>
+            <w:tcMar>
+              <w:top w:w="100" w:type="dxa"/>
+              <w:bottom w:w="100" w:type="dxa"/>
+              <w:left w:w="150" w:type="dxa"/>
+              <w:right w:w="150" w:type="dxa"/>
+            </w:tcMar>
           </w:tcPr>
           <w:p>
             <w:pPr>
@@ -5250,6 +5820,12 @@
               <w:left w:w="150" w:type="dxa"/>
               <w:right w:w="150" w:type="dxa"/>
             </w:tcMar>
+            <w:tcMar>
+              <w:top w:w="100" w:type="dxa"/>
+              <w:bottom w:w="100" w:type="dxa"/>
+              <w:left w:w="150" w:type="dxa"/>
+              <w:right w:w="150" w:type="dxa"/>
+            </w:tcMar>
           </w:tcPr>
           <w:p>
             <w:pPr>
@@ -5284,6 +5860,12 @@
               <w:left w:w="150" w:type="dxa"/>
               <w:right w:w="150" w:type="dxa"/>
             </w:tcMar>
+            <w:tcMar>
+              <w:top w:w="100" w:type="dxa"/>
+              <w:bottom w:w="100" w:type="dxa"/>
+              <w:left w:w="150" w:type="dxa"/>
+              <w:right w:w="150" w:type="dxa"/>
+            </w:tcMar>
           </w:tcPr>
           <w:p>
             <w:pPr>
@@ -5321,6 +5903,12 @@
               <w:left w:w="150" w:type="dxa"/>
               <w:right w:w="150" w:type="dxa"/>
             </w:tcMar>
+            <w:tcMar>
+              <w:top w:w="100" w:type="dxa"/>
+              <w:bottom w:w="100" w:type="dxa"/>
+              <w:left w:w="150" w:type="dxa"/>
+              <w:right w:w="150" w:type="dxa"/>
+            </w:tcMar>
           </w:tcPr>
           <w:p>
             <w:pPr>
@@ -5353,6 +5941,12 @@
               <w:left w:w="150" w:type="dxa"/>
               <w:right w:w="150" w:type="dxa"/>
             </w:tcMar>
+            <w:tcMar>
+              <w:top w:w="100" w:type="dxa"/>
+              <w:bottom w:w="100" w:type="dxa"/>
+              <w:left w:w="150" w:type="dxa"/>
+              <w:right w:w="150" w:type="dxa"/>
+            </w:tcMar>
           </w:tcPr>
           <w:p>
             <w:pPr>
@@ -5387,6 +5981,12 @@
               <w:left w:w="150" w:type="dxa"/>
               <w:right w:w="150" w:type="dxa"/>
             </w:tcMar>
+            <w:tcMar>
+              <w:top w:w="100" w:type="dxa"/>
+              <w:bottom w:w="100" w:type="dxa"/>
+              <w:left w:w="150" w:type="dxa"/>
+              <w:right w:w="150" w:type="dxa"/>
+            </w:tcMar>
           </w:tcPr>
           <w:p>
             <w:pPr>
@@ -5431,6 +6031,12 @@
               <w:left w:w="150" w:type="dxa"/>
               <w:right w:w="150" w:type="dxa"/>
             </w:tcMar>
+            <w:tcMar>
+              <w:top w:w="100" w:type="dxa"/>
+              <w:bottom w:w="100" w:type="dxa"/>
+              <w:left w:w="150" w:type="dxa"/>
+              <w:right w:w="150" w:type="dxa"/>
+            </w:tcMar>
           </w:tcPr>
           <w:p>
             <w:pPr>
@@ -5463,6 +6069,12 @@
               <w:left w:w="150" w:type="dxa"/>
               <w:right w:w="150" w:type="dxa"/>
             </w:tcMar>
+            <w:tcMar>
+              <w:top w:w="100" w:type="dxa"/>
+              <w:bottom w:w="100" w:type="dxa"/>
+              <w:left w:w="150" w:type="dxa"/>
+              <w:right w:w="150" w:type="dxa"/>
+            </w:tcMar>
           </w:tcPr>
           <w:p>
             <w:pPr>
@@ -5497,6 +6109,12 @@
               <w:left w:w="150" w:type="dxa"/>
               <w:right w:w="150" w:type="dxa"/>
             </w:tcMar>
+            <w:tcMar>
+              <w:top w:w="100" w:type="dxa"/>
+              <w:bottom w:w="100" w:type="dxa"/>
+              <w:left w:w="150" w:type="dxa"/>
+              <w:right w:w="150" w:type="dxa"/>
+            </w:tcMar>
           </w:tcPr>
           <w:p>
             <w:pPr>
@@ -5531,6 +6149,12 @@
               <w:left w:w="150" w:type="dxa"/>
               <w:right w:w="150" w:type="dxa"/>
             </w:tcMar>
+            <w:tcMar>
+              <w:top w:w="100" w:type="dxa"/>
+              <w:bottom w:w="100" w:type="dxa"/>
+              <w:left w:w="150" w:type="dxa"/>
+              <w:right w:w="150" w:type="dxa"/>
+            </w:tcMar>
           </w:tcPr>
           <w:p>
             <w:pPr>
@@ -5563,6 +6187,12 @@
               <w:left w:w="150" w:type="dxa"/>
               <w:right w:w="150" w:type="dxa"/>
             </w:tcMar>
+            <w:tcMar>
+              <w:top w:w="100" w:type="dxa"/>
+              <w:bottom w:w="100" w:type="dxa"/>
+              <w:left w:w="150" w:type="dxa"/>
+              <w:right w:w="150" w:type="dxa"/>
+            </w:tcMar>
           </w:tcPr>
           <w:p>
             <w:pPr>
@@ -5597,6 +6227,12 @@
               <w:left w:w="150" w:type="dxa"/>
               <w:right w:w="150" w:type="dxa"/>
             </w:tcMar>
+            <w:tcMar>
+              <w:top w:w="100" w:type="dxa"/>
+              <w:bottom w:w="100" w:type="dxa"/>
+              <w:left w:w="150" w:type="dxa"/>
+              <w:right w:w="150" w:type="dxa"/>
+            </w:tcMar>
           </w:tcPr>
           <w:p>
             <w:pPr>
@@ -5634,6 +6270,12 @@
               <w:left w:w="150" w:type="dxa"/>
               <w:right w:w="150" w:type="dxa"/>
             </w:tcMar>
+            <w:tcMar>
+              <w:top w:w="100" w:type="dxa"/>
+              <w:bottom w:w="100" w:type="dxa"/>
+              <w:left w:w="150" w:type="dxa"/>
+              <w:right w:w="150" w:type="dxa"/>
+            </w:tcMar>
           </w:tcPr>
           <w:p>
             <w:pPr>
@@ -5666,6 +6308,12 @@
               <w:left w:w="150" w:type="dxa"/>
               <w:right w:w="150" w:type="dxa"/>
             </w:tcMar>
+            <w:tcMar>
+              <w:top w:w="100" w:type="dxa"/>
+              <w:bottom w:w="100" w:type="dxa"/>
+              <w:left w:w="150" w:type="dxa"/>
+              <w:right w:w="150" w:type="dxa"/>
+            </w:tcMar>
           </w:tcPr>
           <w:p>
             <w:pPr>
@@ -5700,6 +6348,12 @@
               <w:left w:w="150" w:type="dxa"/>
               <w:right w:w="150" w:type="dxa"/>
             </w:tcMar>
+            <w:tcMar>
+              <w:top w:w="100" w:type="dxa"/>
+              <w:bottom w:w="100" w:type="dxa"/>
+              <w:left w:w="150" w:type="dxa"/>
+              <w:right w:w="150" w:type="dxa"/>
+            </w:tcMar>
           </w:tcPr>
           <w:p>
             <w:pPr>
@@ -5734,6 +6388,12 @@
               <w:left w:w="150" w:type="dxa"/>
               <w:right w:w="150" w:type="dxa"/>
             </w:tcMar>
+            <w:tcMar>
+              <w:top w:w="100" w:type="dxa"/>
+              <w:bottom w:w="100" w:type="dxa"/>
+              <w:left w:w="150" w:type="dxa"/>
+              <w:right w:w="150" w:type="dxa"/>
+            </w:tcMar>
           </w:tcPr>
           <w:p>
             <w:pPr>
@@ -5766,6 +6426,12 @@
               <w:left w:w="150" w:type="dxa"/>
               <w:right w:w="150" w:type="dxa"/>
             </w:tcMar>
+            <w:tcMar>
+              <w:top w:w="100" w:type="dxa"/>
+              <w:bottom w:w="100" w:type="dxa"/>
+              <w:left w:w="150" w:type="dxa"/>
+              <w:right w:w="150" w:type="dxa"/>
+            </w:tcMar>
           </w:tcPr>
           <w:p>
             <w:pPr>
@@ -5800,6 +6466,12 @@
               <w:left w:w="150" w:type="dxa"/>
               <w:right w:w="150" w:type="dxa"/>
             </w:tcMar>
+            <w:tcMar>
+              <w:top w:w="100" w:type="dxa"/>
+              <w:bottom w:w="100" w:type="dxa"/>
+              <w:left w:w="150" w:type="dxa"/>
+              <w:right w:w="150" w:type="dxa"/>
+            </w:tcMar>
           </w:tcPr>
           <w:p>
             <w:pPr>
@@ -5834,6 +6506,12 @@
               <w:left w:w="150" w:type="dxa"/>
               <w:right w:w="150" w:type="dxa"/>
             </w:tcMar>
+            <w:tcMar>
+              <w:top w:w="100" w:type="dxa"/>
+              <w:bottom w:w="100" w:type="dxa"/>
+              <w:left w:w="150" w:type="dxa"/>
+              <w:right w:w="150" w:type="dxa"/>
+            </w:tcMar>
           </w:tcPr>
           <w:p>
             <w:pPr>
@@ -5866,6 +6544,12 @@
               <w:left w:w="150" w:type="dxa"/>
               <w:right w:w="150" w:type="dxa"/>
             </w:tcMar>
+            <w:tcMar>
+              <w:top w:w="100" w:type="dxa"/>
+              <w:bottom w:w="100" w:type="dxa"/>
+              <w:left w:w="150" w:type="dxa"/>
+              <w:right w:w="150" w:type="dxa"/>
+            </w:tcMar>
           </w:tcPr>
           <w:p>
             <w:pPr>
@@ -5900,6 +6584,12 @@
               <w:left w:w="150" w:type="dxa"/>
               <w:right w:w="150" w:type="dxa"/>
             </w:tcMar>
+            <w:tcMar>
+              <w:top w:w="100" w:type="dxa"/>
+              <w:bottom w:w="100" w:type="dxa"/>
+              <w:left w:w="150" w:type="dxa"/>
+              <w:right w:w="150" w:type="dxa"/>
+            </w:tcMar>
           </w:tcPr>
           <w:p>
             <w:pPr>
@@ -5934,6 +6624,12 @@
               <w:left w:w="150" w:type="dxa"/>
               <w:right w:w="150" w:type="dxa"/>
             </w:tcMar>
+            <w:tcMar>
+              <w:top w:w="100" w:type="dxa"/>
+              <w:bottom w:w="100" w:type="dxa"/>
+              <w:left w:w="150" w:type="dxa"/>
+              <w:right w:w="150" w:type="dxa"/>
+            </w:tcMar>
           </w:tcPr>
           <w:p>
             <w:pPr>
@@ -5969,7 +6665,7 @@
     <w:p>
       <w:pPr>
         <w:spacing w:line="276" w:lineRule="auto" w:after="120"/>
-        <w:ind w:firstLine="709"/>
+        <w:ind/>
         <w:jc w:val="both"/>
         <w:rPr>
           <w:szCs w:val="28"/>
@@ -5987,7 +6683,7 @@
     <w:p>
       <w:pPr>
         <w:spacing w:line="276" w:lineRule="auto" w:after="120"/>
-        <w:ind w:firstLine="709"/>
+        <w:ind/>
         <w:jc w:val="both"/>
         <w:rPr>
           <w:szCs w:val="28"/>
@@ -6005,7 +6701,7 @@
     <w:p>
       <w:pPr>
         <w:spacing w:line="276" w:lineRule="auto" w:after="120"/>
-        <w:ind w:firstLine="709"/>
+        <w:ind/>
         <w:jc w:val="both"/>
         <w:rPr>
           <w:szCs w:val="28"/>
@@ -6023,7 +6719,7 @@
     <w:p>
       <w:pPr>
         <w:spacing w:line="276" w:lineRule="auto" w:after="120"/>
-        <w:ind w:firstLine="709"/>
+        <w:ind/>
         <w:jc w:val="both"/>
         <w:rPr>
           <w:szCs w:val="28"/>
@@ -6041,7 +6737,7 @@
     <w:p>
       <w:pPr>
         <w:spacing w:line="276" w:lineRule="auto" w:after="120"/>
-        <w:ind w:firstLine="709"/>
+        <w:ind/>
         <w:jc w:val="both"/>
         <w:rPr>
           <w:szCs w:val="28"/>
@@ -6066,7 +6762,7 @@
     <w:p>
       <w:pPr>
         <w:spacing w:line="276" w:lineRule="auto" w:after="120"/>
-        <w:ind w:firstLine="709"/>
+        <w:ind/>
         <w:jc w:val="both"/>
         <w:rPr>
           <w:szCs w:val="28"/>
@@ -6084,7 +6780,7 @@
     <w:p>
       <w:pPr>
         <w:spacing w:line="276" w:lineRule="auto" w:after="120"/>
-        <w:ind w:firstLine="709"/>
+        <w:ind/>
         <w:jc w:val="both"/>
         <w:rPr>
           <w:szCs w:val="28"/>
@@ -6102,7 +6798,7 @@
     <w:p>
       <w:pPr>
         <w:spacing w:line="276" w:lineRule="auto" w:after="120"/>
-        <w:ind w:firstLine="709"/>
+        <w:ind/>
         <w:jc w:val="both"/>
         <w:rPr>
           <w:szCs w:val="28"/>
@@ -6127,7 +6823,7 @@
     <w:p>
       <w:pPr>
         <w:spacing w:line="276" w:lineRule="auto" w:after="120"/>
-        <w:ind w:firstLine="709"/>
+        <w:ind/>
         <w:jc w:val="both"/>
         <w:rPr>
           <w:szCs w:val="28"/>
@@ -6238,7 +6934,7 @@
     <w:p>
       <w:pPr>
         <w:spacing w:line="276" w:lineRule="auto" w:after="120"/>
-        <w:ind w:firstLine="709"/>
+        <w:ind/>
         <w:jc w:val="both"/>
         <w:rPr>
           <w:szCs w:val="28"/>

</xml_diff>